<commit_message>
Update final feedback doc: professional visual design
Full redesign with color-coded banners, CV evidence blocks,
action boxes with n8n/Supabase commands, follow-up policy table.
Added 'paciente agendou' row with clinic follow-up rule.

https://claude.ai/code/session_01QV8d4yT7wUXju8L84Xs7y2
</commit_message>
<xml_diff>
--- a/Feedback_Triagem_Nicolas_FINAL.docx
+++ b/Feedback_Triagem_Nicolas_FINAL.docx
@@ -2,88 +2,447 @@
 <file path=word/document.xml><?xml version="1.0" encoding="utf-8"?>
 <w:document xmlns:wpc="http://schemas.microsoft.com/office/word/2010/wordprocessingCanvas" xmlns:mo="http://schemas.microsoft.com/office/mac/office/2008/main" xmlns:mc="http://schemas.openxmlformats.org/markup-compatibility/2006" xmlns:mv="urn:schemas-microsoft-com:mac:vml" xmlns:o="urn:schemas-microsoft-com:office:office" xmlns:r="http://schemas.openxmlformats.org/officeDocument/2006/relationships" xmlns:m="http://schemas.openxmlformats.org/officeDocument/2006/math" xmlns:v="urn:schemas-microsoft-com:vml" xmlns:wp14="http://schemas.microsoft.com/office/word/2010/wordprocessingDrawing" xmlns:wp="http://schemas.openxmlformats.org/drawingml/2006/wordprocessingDrawing" xmlns:w10="urn:schemas-microsoft-com:office:word" xmlns:w="http://schemas.openxmlformats.org/wordprocessingml/2006/main" xmlns:w14="http://schemas.microsoft.com/office/word/2010/wordml" xmlns:wpg="http://schemas.microsoft.com/office/word/2010/wordprocessingGroup" xmlns:wpi="http://schemas.microsoft.com/office/word/2010/wordprocessingInk" xmlns:wne="http://schemas.microsoft.com/office/word/2006/wordml" xmlns:wps="http://schemas.microsoft.com/office/word/2010/wordprocessingShape" mc:Ignorable="w14 wp14">
   <w:body>
+    <w:tbl>
+      <w:tblPr>
+        <w:tblW w:type="auto" w:w="0"/>
+        <w:tblLook w:firstColumn="1" w:firstRow="1" w:lastColumn="0" w:lastRow="0" w:noHBand="0" w:noVBand="1" w:val="04A0"/>
+      </w:tblPr>
+      <w:tblGrid>
+        <w:gridCol w:w="9746"/>
+      </w:tblGrid>
+      <w:tr>
+        <w:tc>
+          <w:tcPr>
+            <w:tcW w:type="dxa" w:w="9746"/>
+            <w:shd w:val="clear" w:color="auto" w:fill="1B3A6B"/>
+          </w:tcPr>
+          <w:p>
+            <w:pPr>
+              <w:spacing w:before="440" w:after="120"/>
+              <w:jc w:val="center"/>
+            </w:pPr>
+            <w:r>
+              <w:rPr>
+                <w:b/>
+                <w:color w:val="FFFFFF"/>
+                <w:sz w:val="44"/>
+              </w:rPr>
+              <w:t>FEEDBACK DE QUALIDADE</w:t>
+            </w:r>
+          </w:p>
+          <w:p>
+            <w:pPr>
+              <w:spacing w:after="160"/>
+              <w:jc w:val="center"/>
+            </w:pPr>
+            <w:r>
+              <w:rPr>
+                <w:b/>
+                <w:color w:val="A8D0FF"/>
+                <w:sz w:val="28"/>
+              </w:rPr>
+              <w:t>TRIAGEM CLARA — CORREÇÕES NECESSÁRIAS</w:t>
+            </w:r>
+          </w:p>
+          <w:p>
+            <w:pPr>
+              <w:spacing w:after="360"/>
+              <w:jc w:val="center"/>
+            </w:pPr>
+            <w:r>
+              <w:rPr>
+                <w:i/>
+                <w:color w:val="CCDDFF"/>
+                <w:sz w:val="21"/>
+              </w:rPr>
+              <w:t>Última análise — Testes realizados em 09–11/06/2026</w:t>
+            </w:r>
+          </w:p>
+        </w:tc>
+      </w:tr>
+    </w:tbl>
     <w:p/>
-    <w:p>
-      <w:pPr>
+    <w:tbl>
+      <w:tblPr>
+        <w:tblW w:type="auto" w:w="0"/>
+        <w:tblLook w:firstColumn="1" w:firstRow="1" w:lastColumn="0" w:lastRow="0" w:noHBand="0" w:noVBand="1" w:val="04A0"/>
+      </w:tblPr>
+      <w:tblGrid>
+        <w:gridCol w:w="3249"/>
+        <w:gridCol w:w="3249"/>
+        <w:gridCol w:w="3249"/>
+      </w:tblGrid>
+      <w:tr>
+        <w:tc>
+          <w:tcPr>
+            <w:tcW w:type="dxa" w:w="3249"/>
+            <w:shd w:val="clear" w:color="auto" w:fill="E8EEF7"/>
+            <w:tcBorders>
+              <w:top w:val="single" w:sz="6" w:space="0" w:color="1B3A6B"/>
+              <w:bottom w:val="single" w:sz="6" w:space="0" w:color="1B3A6B"/>
+              <w:left w:val="single" w:sz="6" w:space="0" w:color="1B3A6B"/>
+              <w:right w:val="single" w:sz="6" w:space="0" w:color="1B3A6B"/>
+            </w:tcBorders>
+          </w:tcPr>
+          <w:p>
+            <w:pPr>
+              <w:spacing w:before="120" w:after="120"/>
+              <w:jc w:val="center"/>
+            </w:pPr>
+            <w:r>
+              <w:rPr>
+                <w:color w:val="666688"/>
+                <w:sz w:val="16"/>
+              </w:rPr>
+              <w:t>Data dos testes</w:t>
+              <w:br/>
+            </w:r>
+            <w:r>
+              <w:rPr>
+                <w:b/>
+                <w:color w:val="1B3A6B"/>
+                <w:sz w:val="21"/>
+              </w:rPr>
+              <w:t>09–11/06/2026</w:t>
+            </w:r>
+          </w:p>
+        </w:tc>
+        <w:tc>
+          <w:tcPr>
+            <w:tcW w:type="dxa" w:w="3249"/>
+            <w:shd w:val="clear" w:color="auto" w:fill="E8EEF7"/>
+            <w:tcBorders>
+              <w:top w:val="single" w:sz="6" w:space="0" w:color="1B3A6B"/>
+              <w:bottom w:val="single" w:sz="6" w:space="0" w:color="1B3A6B"/>
+              <w:left w:val="single" w:sz="6" w:space="0" w:color="1B3A6B"/>
+              <w:right w:val="single" w:sz="6" w:space="0" w:color="1B3A6B"/>
+            </w:tcBorders>
+          </w:tcPr>
+          <w:p>
+            <w:pPr>
+              <w:spacing w:before="120" w:after="120"/>
+              <w:jc w:val="center"/>
+            </w:pPr>
+            <w:r>
+              <w:rPr>
+                <w:color w:val="666688"/>
+                <w:sz w:val="16"/>
+              </w:rPr>
+              <w:t>Elaborado em</w:t>
+              <w:br/>
+            </w:r>
+            <w:r>
+              <w:rPr>
+                <w:b/>
+                <w:color w:val="1B3A6B"/>
+                <w:sz w:val="21"/>
+              </w:rPr>
+              <w:t>12/06/2026</w:t>
+            </w:r>
+          </w:p>
+        </w:tc>
+        <w:tc>
+          <w:tcPr>
+            <w:tcW w:type="dxa" w:w="3249"/>
+            <w:shd w:val="clear" w:color="auto" w:fill="E8EEF7"/>
+            <w:tcBorders>
+              <w:top w:val="single" w:sz="6" w:space="0" w:color="1B3A6B"/>
+              <w:bottom w:val="single" w:sz="6" w:space="0" w:color="1B3A6B"/>
+              <w:left w:val="single" w:sz="6" w:space="0" w:color="1B3A6B"/>
+              <w:right w:val="single" w:sz="6" w:space="0" w:color="1B3A6B"/>
+            </w:tcBorders>
+          </w:tcPr>
+          <w:p>
+            <w:pPr>
+              <w:spacing w:before="120" w:after="120"/>
+              <w:jc w:val="center"/>
+            </w:pPr>
+            <w:r>
+              <w:rPr>
+                <w:color w:val="666688"/>
+                <w:sz w:val="16"/>
+              </w:rPr>
+              <w:t>Destinatário</w:t>
+              <w:br/>
+            </w:r>
+            <w:r>
+              <w:rPr>
+                <w:b/>
+                <w:color w:val="1B3A6B"/>
+                <w:sz w:val="21"/>
+              </w:rPr>
+              <w:t>Nicolas (dev)</w:t>
+            </w:r>
+          </w:p>
+        </w:tc>
+      </w:tr>
+    </w:tbl>
+    <w:p/>
+    <w:tbl>
+      <w:tblPr>
+        <w:tblW w:type="auto" w:w="0"/>
         <w:jc w:val="center"/>
-      </w:pPr>
-      <w:r>
-        <w:rPr>
-          <w:b/>
-          <w:color w:val="C00000"/>
-          <w:sz w:val="36"/>
-        </w:rPr>
-        <w:t>FEEDBACK DE QUALIDADE — TRIAGEM CLARA</w:t>
-      </w:r>
-    </w:p>
-    <w:p>
-      <w:pPr>
-        <w:jc w:val="center"/>
-      </w:pPr>
-      <w:r>
-        <w:rPr>
-          <w:i/>
-          <w:sz w:val="24"/>
-        </w:rPr>
-        <w:t>Última análise — identificadas em testes 09–11/06/2026</w:t>
-      </w:r>
-    </w:p>
-    <w:p/>
-    <w:p>
-      <w:pPr>
-        <w:jc w:val="center"/>
-      </w:pPr>
-      <w:r>
-        <w:rPr>
-          <w:color w:val="606060"/>
-          <w:sz w:val="20"/>
-        </w:rPr>
-        <w:t>Data dos testes: 09–11/06/2026   |   Elaborado em: 12/06/2026   |   Destinatário: Nicolas (dev)</w:t>
-      </w:r>
-    </w:p>
+        <w:tblLook w:firstColumn="1" w:firstRow="1" w:lastColumn="0" w:lastRow="0" w:noHBand="0" w:noVBand="1" w:val="04A0"/>
+      </w:tblPr>
+      <w:tblGrid>
+        <w:gridCol w:w="4873"/>
+        <w:gridCol w:w="4873"/>
+      </w:tblGrid>
+      <w:tr>
+        <w:tc>
+          <w:tcPr>
+            <w:tcW w:type="dxa" w:w="4873"/>
+            <w:shd w:val="clear" w:color="auto" w:fill="FFF8F0"/>
+            <w:tcBorders>
+              <w:top w:val="single" w:sz="6" w:space="0" w:color="E08000"/>
+              <w:bottom w:val="single" w:sz="6" w:space="0" w:color="E08000"/>
+              <w:left w:val="single" w:sz="6" w:space="0" w:color="E08000"/>
+              <w:right w:val="single" w:sz="6" w:space="0" w:color="E08000"/>
+            </w:tcBorders>
+          </w:tcPr>
+          <w:p>
+            <w:pPr>
+              <w:spacing w:before="120"/>
+              <w:ind w:left="144"/>
+            </w:pPr>
+            <w:r>
+              <w:rPr>
+                <w:b/>
+                <w:color w:val="B85C00"/>
+                <w:sz w:val="20"/>
+              </w:rPr>
+              <w:t>PARTE 1 — PROMPT DE TRIAGEM</w:t>
+              <w:br/>
+            </w:r>
+          </w:p>
+          <w:p>
+            <w:pPr>
+              <w:ind w:left="144"/>
+            </w:pPr>
+            <w:r>
+              <w:rPr>
+                <w:color w:val="444444"/>
+                <w:sz w:val="19"/>
+              </w:rPr>
+              <w:t xml:space="preserve">   1. Linguagem proibida — atestado retroativo</w:t>
+            </w:r>
+          </w:p>
+          <w:p>
+            <w:pPr>
+              <w:ind w:left="144"/>
+            </w:pPr>
+            <w:r>
+              <w:rPr>
+                <w:color w:val="444444"/>
+                <w:sz w:val="19"/>
+              </w:rPr>
+              <w:t xml:space="preserve">   2. V7 — Múltiplas queixas</w:t>
+            </w:r>
+          </w:p>
+          <w:p>
+            <w:pPr>
+              <w:ind w:left="144"/>
+            </w:pPr>
+            <w:r>
+              <w:rPr>
+                <w:color w:val="444444"/>
+                <w:sz w:val="19"/>
+              </w:rPr>
+              <w:t xml:space="preserve">   3. V9 — Atestado de acompanhante</w:t>
+            </w:r>
+          </w:p>
+          <w:p>
+            <w:pPr>
+              <w:ind w:left="144"/>
+            </w:pPr>
+            <w:r>
+              <w:rPr>
+                <w:color w:val="444444"/>
+                <w:sz w:val="19"/>
+              </w:rPr>
+              <w:t xml:space="preserve">   4. V6 — Emagrecimento</w:t>
+            </w:r>
+          </w:p>
+          <w:p>
+            <w:pPr>
+              <w:spacing w:after="120"/>
+            </w:pPr>
+          </w:p>
+        </w:tc>
+        <w:tc>
+          <w:tcPr>
+            <w:tcW w:type="dxa" w:w="4873"/>
+            <w:shd w:val="clear" w:color="auto" w:fill="F0F8FF"/>
+            <w:tcBorders>
+              <w:top w:val="single" w:sz="6" w:space="0" w:color="1B3A6B"/>
+              <w:bottom w:val="single" w:sz="6" w:space="0" w:color="1B3A6B"/>
+              <w:left w:val="single" w:sz="6" w:space="0" w:color="1B3A6B"/>
+              <w:right w:val="single" w:sz="6" w:space="0" w:color="1B3A6B"/>
+            </w:tcBorders>
+          </w:tcPr>
+          <w:p>
+            <w:pPr>
+              <w:spacing w:before="120"/>
+              <w:ind w:left="144"/>
+            </w:pPr>
+            <w:r>
+              <w:rPr>
+                <w:b/>
+                <w:color w:val="1B3A6B"/>
+                <w:sz w:val="20"/>
+              </w:rPr>
+              <w:t>PARTE 2 — WORKFLOW DE FOLLOW-UP (n8n)</w:t>
+              <w:br/>
+            </w:r>
+          </w:p>
+          <w:p>
+            <w:pPr>
+              <w:ind w:left="144"/>
+            </w:pPr>
+            <w:r>
+              <w:rPr>
+                <w:color w:val="444444"/>
+                <w:sz w:val="19"/>
+              </w:rPr>
+              <w:t xml:space="preserve">   5. [NOME DO CLIENTE] — variável não substituída</w:t>
+            </w:r>
+          </w:p>
+          <w:p>
+            <w:pPr>
+              <w:ind w:left="144"/>
+            </w:pPr>
+            <w:r>
+              <w:rPr>
+                <w:color w:val="444444"/>
+                <w:sz w:val="19"/>
+              </w:rPr>
+              <w:t xml:space="preserve">   6. Follow-up após NÃO explícito</w:t>
+            </w:r>
+          </w:p>
+          <w:p>
+            <w:pPr>
+              <w:ind w:left="144"/>
+            </w:pPr>
+            <w:r>
+              <w:rPr>
+                <w:color w:val="444444"/>
+                <w:sz w:val="19"/>
+              </w:rPr>
+              <w:t xml:space="preserve">   7. Follow-up após serviço negado (ASO)</w:t>
+            </w:r>
+          </w:p>
+          <w:p>
+            <w:pPr>
+              <w:ind w:left="144"/>
+            </w:pPr>
+            <w:r>
+              <w:rPr>
+                <w:color w:val="444444"/>
+                <w:sz w:val="19"/>
+              </w:rPr>
+              <w:t xml:space="preserve">   8. Regra geral de follow-up</w:t>
+            </w:r>
+          </w:p>
+          <w:p>
+            <w:pPr>
+              <w:spacing w:after="120"/>
+            </w:pPr>
+          </w:p>
+        </w:tc>
+      </w:tr>
+    </w:tbl>
     <w:p>
       <w:r>
         <w:br w:type="page"/>
       </w:r>
     </w:p>
-    <w:p>
-      <w:pPr>
-        <w:pStyle w:val="Heading1"/>
-      </w:pPr>
-      <w:r>
-        <w:rPr>
-          <w:color w:val="C00000"/>
-        </w:rPr>
-        <w:t>PARTE 1 — PROBLEMAS DE TRIAGEM (PROMPT)</w:t>
-      </w:r>
-    </w:p>
-    <w:p>
-      <w:r>
-        <w:t>Os itens abaixo são correções a serem feitas no prompt de triagem da Clara.</w:t>
-      </w:r>
-    </w:p>
+    <w:tbl>
+      <w:tblPr>
+        <w:tblW w:type="auto" w:w="0"/>
+        <w:jc w:val="center"/>
+        <w:tblLook w:firstColumn="1" w:firstRow="1" w:lastColumn="0" w:lastRow="0" w:noHBand="0" w:noVBand="1" w:val="04A0"/>
+      </w:tblPr>
+      <w:tblGrid>
+        <w:gridCol w:w="9746"/>
+      </w:tblGrid>
+      <w:tr>
+        <w:tc>
+          <w:tcPr>
+            <w:tcW w:type="dxa" w:w="9360"/>
+            <w:shd w:val="clear" w:color="auto" w:fill="B8460A"/>
+          </w:tcPr>
+          <w:p>
+            <w:pPr>
+              <w:spacing w:before="140" w:after="140"/>
+              <w:ind w:left="216"/>
+              <w:jc w:val="left"/>
+            </w:pPr>
+            <w:r>
+              <w:rPr>
+                <w:b/>
+                <w:color w:val="FFFFFF"/>
+                <w:sz w:val="24"/>
+              </w:rPr>
+              <w:t xml:space="preserve">  PARTE 1   PROMPT DE TRIAGEM</w:t>
+            </w:r>
+          </w:p>
+        </w:tc>
+      </w:tr>
+    </w:tbl>
     <w:p/>
-    <w:p>
-      <w:pPr>
-        <w:pStyle w:val="Heading2"/>
-      </w:pPr>
-      <w:r>
-        <w:rPr>
-          <w:color w:val="C00000"/>
-        </w:rPr>
-        <w:t>1. Linguagem proibida: atestado retroativo</w:t>
-      </w:r>
-    </w:p>
+    <w:tbl>
+      <w:tblPr>
+        <w:tblW w:type="auto" w:w="0"/>
+        <w:tblLook w:firstColumn="1" w:firstRow="1" w:lastColumn="0" w:lastRow="0" w:noHBand="0" w:noVBand="1" w:val="04A0"/>
+      </w:tblPr>
+      <w:tblGrid>
+        <w:gridCol w:w="9746"/>
+      </w:tblGrid>
+      <w:tr>
+        <w:tc>
+          <w:tcPr>
+            <w:tcW w:type="dxa" w:w="9746"/>
+            <w:shd w:val="clear" w:color="auto" w:fill="FDEBD0"/>
+          </w:tcPr>
+          <w:p>
+            <w:pPr>
+              <w:spacing w:before="100" w:after="100"/>
+              <w:ind w:left="173"/>
+            </w:pPr>
+            <w:r>
+              <w:rPr>
+                <w:b/>
+                <w:color w:val="1B3A6B"/>
+                <w:sz w:val="22"/>
+              </w:rPr>
+              <w:t xml:space="preserve">1.  </w:t>
+            </w:r>
+            <w:r>
+              <w:rPr>
+                <w:b/>
+                <w:color w:val="1B3A6B"/>
+                <w:sz w:val="22"/>
+              </w:rPr>
+              <w:t>Linguagem proibida — Atestado retroativo</w:t>
+            </w:r>
+          </w:p>
+        </w:tc>
+      </w:tr>
+    </w:tbl>
+    <w:p/>
     <w:p>
       <w:r>
         <w:rPr>
           <w:b/>
+          <w:color w:val="B8460A"/>
+          <w:sz w:val="20"/>
         </w:rPr>
-        <w:t>REGRA DA CLÍNICA:</w:t>
+        <w:t xml:space="preserve">REGRA DA CLÍNICA:  </w:t>
       </w:r>
-    </w:p>
-    <w:p>
       <w:r>
+        <w:rPr>
+          <w:sz w:val="20"/>
+        </w:rPr>
         <w:t>Não realizamos atestado retroativo. Ponto final.</w:t>
       </w:r>
     </w:p>
@@ -92,12 +451,22 @@
       <w:r>
         <w:rPr>
           <w:b/>
+          <w:color w:val="555555"/>
+          <w:sz w:val="20"/>
         </w:rPr>
-        <w:t>O QUE ACONTECEU:</w:t>
+        <w:t xml:space="preserve">O QUE ACONTECEU:  </w:t>
+      </w:r>
+      <w:r>
+        <w:rPr>
+          <w:sz w:val="20"/>
+        </w:rPr>
       </w:r>
     </w:p>
     <w:p>
       <w:r>
+        <w:rPr>
+          <w:sz w:val="20"/>
+        </w:rPr>
         <w:t>Ao ser questionada sobre "atestado de ontem até amanhã", Clara respondeu:</w:t>
         <w:br/>
         <w:t>"não conseguimos garantir atestado retroativo" e "o médico pode avaliar seu caso e, se considerar adequado, emitir um atestado a partir da data de hoje."</w:t>
@@ -106,50 +475,1774 @@
         <w:t>PROBLEMA: "não conseguimos garantir" sugere que talvez seja possível. Gerou expectativa falsa — intervenção manual necessária.</w:t>
       </w:r>
     </w:p>
+    <w:p>
+      <w:r>
+        <w:rPr>
+          <w:b/>
+          <w:color w:val="770000"/>
+          <w:sz w:val="20"/>
+        </w:rPr>
+        <w:t xml:space="preserve">EVIDÊNCIA  </w:t>
+      </w:r>
+      <w:r>
+        <w:rPr>
+          <w:sz w:val="20"/>
+        </w:rPr>
+        <w:t>Conversa Gi — 11/06/2026 às 19:56</w:t>
+      </w:r>
+    </w:p>
+    <w:tbl>
+      <w:tblPr>
+        <w:tblW w:type="auto" w:w="0"/>
+        <w:tblLook w:firstColumn="1" w:firstRow="1" w:lastColumn="0" w:lastRow="0" w:noHBand="0" w:noVBand="1" w:val="04A0"/>
+      </w:tblPr>
+      <w:tblGrid>
+        <w:gridCol w:w="9746"/>
+      </w:tblGrid>
+      <w:tr>
+        <w:tc>
+          <w:tcPr>
+            <w:tcW w:type="dxa" w:w="9746"/>
+            <w:shd w:val="clear" w:color="auto" w:fill="F0F0F0"/>
+            <w:tcBorders>
+              <w:top w:val="single" w:sz="6" w:space="0" w:color="BBBBBB"/>
+              <w:bottom w:val="single" w:sz="6" w:space="0" w:color="BBBBBB"/>
+              <w:left w:val="single" w:sz="6" w:space="0" w:color="BBBBBB"/>
+              <w:right w:val="single" w:sz="6" w:space="0" w:color="BBBBBB"/>
+            </w:tcBorders>
+          </w:tcPr>
+          <w:p>
+            <w:pPr>
+              <w:spacing w:before="20" w:after="20"/>
+              <w:ind w:left="144"/>
+            </w:pPr>
+            <w:r>
+              <w:rPr>
+                <w:rFonts w:ascii="Consolas" w:hAnsi="Consolas"/>
+                <w:color w:val="333333"/>
+                <w:sz w:val="19"/>
+              </w:rPr>
+              <w:t>Paciente:  "Precisava de atestado de ontem até amanhã"</w:t>
+            </w:r>
+          </w:p>
+          <w:p>
+            <w:pPr>
+              <w:spacing w:before="20" w:after="20"/>
+              <w:ind w:left="144"/>
+            </w:pPr>
+            <w:r>
+              <w:rPr>
+                <w:rFonts w:ascii="Consolas" w:hAnsi="Consolas"/>
+                <w:color w:val="005AA0"/>
+                <w:sz w:val="19"/>
+              </w:rPr>
+              <w:t>Clara:     "não conseguimos garantir atestado retroativo. O médico pode avaliar..."  ❌</w:t>
+            </w:r>
+          </w:p>
+          <w:p>
+            <w:pPr>
+              <w:spacing w:before="20" w:after="20"/>
+              <w:ind w:left="144"/>
+            </w:pPr>
+            <w:r>
+              <w:rPr>
+                <w:rFonts w:ascii="Consolas" w:hAnsi="Consolas"/>
+                <w:color w:val="333333"/>
+                <w:sz w:val="19"/>
+              </w:rPr>
+              <w:t>→ Intervenção manual necessária.</w:t>
+            </w:r>
+          </w:p>
+        </w:tc>
+      </w:tr>
+    </w:tbl>
     <w:p/>
     <w:p>
       <w:r>
         <w:rPr>
           <w:b/>
+          <w:color w:val="1A6B1A"/>
+          <w:sz w:val="20"/>
         </w:rPr>
-        <w:t>EVIDÊNCIA — Conversa Gi (11/06/2026 19:56):</w:t>
+        <w:t xml:space="preserve">COMPORTAMENTO CORRETO:  </w:t>
+      </w:r>
+      <w:r>
+        <w:rPr>
+          <w:sz w:val="20"/>
+        </w:rPr>
+      </w:r>
+    </w:p>
+    <w:p>
+      <w:r>
+        <w:rPr>
+          <w:sz w:val="20"/>
+        </w:rPr>
+        <w:t>"Não realizamos atestado retroativo. O atestado é emitido apenas a partir da data da consulta."</w:t>
+        <w:br/>
+        <w:t>→ Perguntar se deseja consulta para hoje ou encerrar.</w:t>
       </w:r>
     </w:p>
     <w:p/>
+    <w:tbl>
+      <w:tblPr>
+        <w:tblW w:type="auto" w:w="0"/>
+        <w:tblLook w:firstColumn="1" w:firstRow="1" w:lastColumn="0" w:lastRow="0" w:noHBand="0" w:noVBand="1" w:val="04A0"/>
+      </w:tblPr>
+      <w:tblGrid>
+        <w:gridCol w:w="9746"/>
+      </w:tblGrid>
+      <w:tr>
+        <w:tc>
+          <w:tcPr>
+            <w:tcW w:type="dxa" w:w="9746"/>
+            <w:shd w:val="clear" w:color="auto" w:fill="FFF3F3"/>
+            <w:tcBorders>
+              <w:top w:val="single" w:sz="8" w:space="0" w:color="C00000"/>
+              <w:bottom w:val="single" w:sz="8" w:space="0" w:color="C00000"/>
+              <w:left w:val="single" w:sz="8" w:space="0" w:color="C00000"/>
+              <w:right w:val="single" w:sz="8" w:space="0" w:color="C00000"/>
+            </w:tcBorders>
+          </w:tcPr>
+          <w:p>
+            <w:pPr>
+              <w:spacing w:before="80"/>
+              <w:ind w:left="173"/>
+            </w:pPr>
+            <w:r>
+              <w:rPr>
+                <w:b/>
+                <w:color w:val="C00000"/>
+                <w:sz w:val="20"/>
+              </w:rPr>
+              <w:t>🚫  PROIBIDO — nunca usar estas frases:</w:t>
+            </w:r>
+          </w:p>
+          <w:p>
+            <w:pPr>
+              <w:spacing w:before="20"/>
+              <w:ind w:left="216"/>
+            </w:pPr>
+            <w:r>
+              <w:rPr>
+                <w:i/>
+                <w:color w:val="C00000"/>
+                <w:sz w:val="20"/>
+              </w:rPr>
+              <w:t xml:space="preserve">   "não conseguimos garantir atestado retroativo"</w:t>
+            </w:r>
+          </w:p>
+          <w:p>
+            <w:pPr>
+              <w:spacing w:before="20"/>
+              <w:ind w:left="216"/>
+            </w:pPr>
+            <w:r>
+              <w:rPr>
+                <w:i/>
+                <w:color w:val="C00000"/>
+                <w:sz w:val="20"/>
+              </w:rPr>
+              <w:t xml:space="preserve">   "se o médico considerar adequado"</w:t>
+            </w:r>
+          </w:p>
+          <w:p>
+            <w:pPr>
+              <w:spacing w:before="20"/>
+              <w:ind w:left="216"/>
+            </w:pPr>
+            <w:r>
+              <w:rPr>
+                <w:i/>
+                <w:color w:val="C00000"/>
+                <w:sz w:val="20"/>
+              </w:rPr>
+              <w:t xml:space="preserve">   "talvez o médico possa"</w:t>
+            </w:r>
+          </w:p>
+          <w:p>
+            <w:pPr>
+              <w:spacing w:after="80"/>
+            </w:pPr>
+          </w:p>
+        </w:tc>
+      </w:tr>
+    </w:tbl>
+    <w:p/>
+    <w:tbl>
+      <w:tblPr>
+        <w:tblW w:type="auto" w:w="0"/>
+        <w:tblLook w:firstColumn="1" w:firstRow="1" w:lastColumn="0" w:lastRow="0" w:noHBand="0" w:noVBand="1" w:val="04A0"/>
+      </w:tblPr>
+      <w:tblGrid>
+        <w:gridCol w:w="9746"/>
+      </w:tblGrid>
+      <w:tr>
+        <w:tc>
+          <w:tcPr>
+            <w:tcW w:type="dxa" w:w="9746"/>
+            <w:shd w:val="clear" w:color="auto" w:fill="EAF4EA"/>
+            <w:tcBorders>
+              <w:top w:val="single" w:sz="8" w:space="0" w:color="2E7D32"/>
+              <w:bottom w:val="single" w:sz="8" w:space="0" w:color="2E7D32"/>
+              <w:left w:val="single" w:sz="8" w:space="0" w:color="2E7D32"/>
+              <w:right w:val="single" w:sz="8" w:space="0" w:color="2E7D32"/>
+            </w:tcBorders>
+          </w:tcPr>
+          <w:p>
+            <w:pPr>
+              <w:spacing w:before="100"/>
+              <w:ind w:left="173"/>
+            </w:pPr>
+            <w:r>
+              <w:rPr>
+                <w:b/>
+                <w:color w:val="1B5E20"/>
+                <w:sz w:val="20"/>
+              </w:rPr>
+              <w:t>⚙  AÇÃO TÉCNICA — PROMPT — Seção V4/V5 (Atestado)</w:t>
+            </w:r>
+          </w:p>
+          <w:p>
+            <w:pPr>
+              <w:spacing w:before="20" w:after="20"/>
+              <w:ind w:left="216"/>
+            </w:pPr>
+            <w:r>
+              <w:rPr>
+                <w:color w:val="1B3A20"/>
+                <w:sz w:val="20"/>
+              </w:rPr>
+              <w:t>Adicionar ANTES das respostas sobre atestado a seguinte regra inviolável:</w:t>
+            </w:r>
+          </w:p>
+          <w:p>
+            <w:pPr>
+              <w:spacing w:before="20" w:after="20"/>
+              <w:ind w:left="216"/>
+            </w:pPr>
+            <w:r>
+              <w:rPr>
+                <w:color w:val="1B3A20"/>
+                <w:sz w:val="20"/>
+              </w:rPr>
+            </w:r>
+          </w:p>
+          <w:p>
+            <w:pPr>
+              <w:spacing w:before="20" w:after="20"/>
+              <w:ind w:left="216"/>
+            </w:pPr>
+            <w:r>
+              <w:rPr>
+                <w:color w:val="1B3A20"/>
+                <w:sz w:val="20"/>
+              </w:rPr>
+              <w:t>⚠ REGRA — ATESTADO RETROATIVO:</w:t>
+            </w:r>
+          </w:p>
+          <w:p>
+            <w:pPr>
+              <w:spacing w:before="20" w:after="20"/>
+              <w:ind w:left="216"/>
+            </w:pPr>
+            <w:r>
+              <w:rPr>
+                <w:color w:val="1B3A20"/>
+                <w:sz w:val="20"/>
+              </w:rPr>
+              <w:t>Se o paciente pedir atestado de dias anteriores ("de ontem", "da semana</w:t>
+            </w:r>
+          </w:p>
+          <w:p>
+            <w:pPr>
+              <w:spacing w:before="20" w:after="20"/>
+              <w:ind w:left="216"/>
+            </w:pPr>
+            <w:r>
+              <w:rPr>
+                <w:color w:val="1B3A20"/>
+                <w:sz w:val="20"/>
+              </w:rPr>
+              <w:t>passada", "retroativo"), responda EXATAMENTE:</w:t>
+            </w:r>
+          </w:p>
+          <w:p>
+            <w:pPr>
+              <w:spacing w:before="20" w:after="20"/>
+              <w:ind w:left="216"/>
+            </w:pPr>
+            <w:r>
+              <w:rPr>
+                <w:color w:val="1B3A20"/>
+                <w:sz w:val="20"/>
+              </w:rPr>
+              <w:t xml:space="preserve">  "Não realizamos atestado retroativo. O atestado é emitido apenas</w:t>
+            </w:r>
+          </w:p>
+          <w:p>
+            <w:pPr>
+              <w:spacing w:before="20" w:after="20"/>
+              <w:ind w:left="216"/>
+            </w:pPr>
+            <w:r>
+              <w:rPr>
+                <w:color w:val="1B3A20"/>
+                <w:sz w:val="20"/>
+              </w:rPr>
+              <w:t xml:space="preserve">   a partir da data da consulta. Posso te ajudar a marcar para hoje?"</w:t>
+            </w:r>
+          </w:p>
+          <w:p>
+            <w:pPr>
+              <w:spacing w:before="20" w:after="20"/>
+              <w:ind w:left="216"/>
+            </w:pPr>
+            <w:r>
+              <w:rPr>
+                <w:color w:val="1B3A20"/>
+                <w:sz w:val="20"/>
+              </w:rPr>
+            </w:r>
+          </w:p>
+          <w:p>
+            <w:pPr>
+              <w:spacing w:before="20" w:after="20"/>
+              <w:ind w:left="216"/>
+            </w:pPr>
+            <w:r>
+              <w:rPr>
+                <w:color w:val="1B3A20"/>
+                <w:sz w:val="20"/>
+              </w:rPr>
+              <w:t>NUNCA use: "não conseguimos garantir" / "o médico pode avaliar se é possível".</w:t>
+            </w:r>
+          </w:p>
+          <w:p>
+            <w:pPr>
+              <w:spacing w:before="20" w:after="20"/>
+              <w:ind w:left="216"/>
+            </w:pPr>
+            <w:r>
+              <w:rPr>
+                <w:color w:val="1B3A20"/>
+                <w:sz w:val="20"/>
+              </w:rPr>
+              <w:t>Não existe exceção a esta regra.</w:t>
+            </w:r>
+          </w:p>
+          <w:p>
+            <w:pPr>
+              <w:spacing w:after="80"/>
+            </w:pPr>
+          </w:p>
+        </w:tc>
+      </w:tr>
+    </w:tbl>
+    <w:p/>
     <w:p>
       <w:pPr>
-        <w:ind w:left="432"/>
+        <w:spacing w:before="40" w:after="40"/>
+        <w:pBdr>
+          <w:bottom w:val="single" w:sz="4" w:space="1" w:color="CCCCCC"/>
+        </w:pBdr>
       </w:pPr>
+    </w:p>
+    <w:tbl>
+      <w:tblPr>
+        <w:tblW w:type="auto" w:w="0"/>
+        <w:tblLook w:firstColumn="1" w:firstRow="1" w:lastColumn="0" w:lastRow="0" w:noHBand="0" w:noVBand="1" w:val="04A0"/>
+      </w:tblPr>
+      <w:tblGrid>
+        <w:gridCol w:w="9746"/>
+      </w:tblGrid>
+      <w:tr>
+        <w:tc>
+          <w:tcPr>
+            <w:tcW w:type="dxa" w:w="9746"/>
+            <w:shd w:val="clear" w:color="auto" w:fill="FDEBD0"/>
+          </w:tcPr>
+          <w:p>
+            <w:pPr>
+              <w:spacing w:before="100" w:after="100"/>
+              <w:ind w:left="173"/>
+            </w:pPr>
+            <w:r>
+              <w:rPr>
+                <w:b/>
+                <w:color w:val="1B3A6B"/>
+                <w:sz w:val="22"/>
+              </w:rPr>
+              <w:t xml:space="preserve">2.  </w:t>
+            </w:r>
+            <w:r>
+              <w:rPr>
+                <w:b/>
+                <w:color w:val="1B3A6B"/>
+                <w:sz w:val="22"/>
+              </w:rPr>
+              <w:t>V7 — Múltiplas queixas: Clara escolheu grupo sem perguntar</w:t>
+            </w:r>
+          </w:p>
+        </w:tc>
+      </w:tr>
+    </w:tbl>
+    <w:p/>
+    <w:p>
       <w:r>
         <w:rPr>
-          <w:color w:val="404040"/>
+          <w:b/>
+          <w:color w:val="770000"/>
           <w:sz w:val="20"/>
         </w:rPr>
-        <w:t>Paciente: "Precisava de atestado de ontem até amanhã"</w:t>
+        <w:t xml:space="preserve">EVIDÊNCIA  </w:t>
+      </w:r>
+      <w:r>
+        <w:rPr>
+          <w:sz w:val="20"/>
+        </w:rPr>
+        <w:t>Conversa teste — 11/06/2026 ~12:23</w:t>
+      </w:r>
+    </w:p>
+    <w:tbl>
+      <w:tblPr>
+        <w:tblW w:type="auto" w:w="0"/>
+        <w:tblLook w:firstColumn="1" w:firstRow="1" w:lastColumn="0" w:lastRow="0" w:noHBand="0" w:noVBand="1" w:val="04A0"/>
+      </w:tblPr>
+      <w:tblGrid>
+        <w:gridCol w:w="9746"/>
+      </w:tblGrid>
+      <w:tr>
+        <w:tc>
+          <w:tcPr>
+            <w:tcW w:type="dxa" w:w="9746"/>
+            <w:shd w:val="clear" w:color="auto" w:fill="F0F0F0"/>
+            <w:tcBorders>
+              <w:top w:val="single" w:sz="6" w:space="0" w:color="BBBBBB"/>
+              <w:bottom w:val="single" w:sz="6" w:space="0" w:color="BBBBBB"/>
+              <w:left w:val="single" w:sz="6" w:space="0" w:color="BBBBBB"/>
+              <w:right w:val="single" w:sz="6" w:space="0" w:color="BBBBBB"/>
+            </w:tcBorders>
+          </w:tcPr>
+          <w:p>
+            <w:pPr>
+              <w:spacing w:before="20" w:after="20"/>
+              <w:ind w:left="144"/>
+            </w:pPr>
+            <w:r>
+              <w:rPr>
+                <w:rFonts w:ascii="Consolas" w:hAnsi="Consolas"/>
+                <w:color w:val="333333"/>
+                <w:sz w:val="19"/>
+              </w:rPr>
+              <w:t>Paciente:  "Tenho tosse, febre, dor de cabeça, dor no joelho, gripe e cansaço"</w:t>
+            </w:r>
+          </w:p>
+          <w:p>
+            <w:pPr>
+              <w:spacing w:before="20" w:after="20"/>
+              <w:ind w:left="144"/>
+            </w:pPr>
+            <w:r>
+              <w:rPr>
+                <w:rFonts w:ascii="Consolas" w:hAnsi="Consolas"/>
+                <w:color w:val="005AA0"/>
+                <w:sz w:val="19"/>
+              </w:rPr>
+              <w:t>Clara:     Foi direto para checklist RESPIRATÓRIO — ignorou joelho e cansaço  ❌</w:t>
+            </w:r>
+          </w:p>
+        </w:tc>
+      </w:tr>
+    </w:tbl>
+    <w:p/>
+    <w:p>
+      <w:r>
+        <w:rPr>
+          <w:b/>
+          <w:color w:val="1A6B1A"/>
+          <w:sz w:val="20"/>
+        </w:rPr>
+        <w:t xml:space="preserve">COMPORTAMENTO CORRETO:  </w:t>
+      </w:r>
+      <w:r>
+        <w:rPr>
+          <w:sz w:val="20"/>
+        </w:rPr>
+      </w:r>
+    </w:p>
+    <w:p>
+      <w:r>
+        <w:rPr>
+          <w:sz w:val="20"/>
+        </w:rPr>
+        <w:t>Quando 3 ou mais queixas não relacionadas são listadas, perguntar PRIMEIRO:</w:t>
+        <w:br/>
+        <w:t>"Qual é o seu principal sintoma agora para eu verificar se consigo te atender por aqui?"</w:t>
+        <w:br/>
+        <w:t>Só após receber a resposta, escolher o grupo de triagem.</w:t>
+      </w:r>
+    </w:p>
+    <w:p/>
+    <w:tbl>
+      <w:tblPr>
+        <w:tblW w:type="auto" w:w="0"/>
+        <w:tblLook w:firstColumn="1" w:firstRow="1" w:lastColumn="0" w:lastRow="0" w:noHBand="0" w:noVBand="1" w:val="04A0"/>
+      </w:tblPr>
+      <w:tblGrid>
+        <w:gridCol w:w="9746"/>
+      </w:tblGrid>
+      <w:tr>
+        <w:tc>
+          <w:tcPr>
+            <w:tcW w:type="dxa" w:w="9746"/>
+            <w:shd w:val="clear" w:color="auto" w:fill="EAF4EA"/>
+            <w:tcBorders>
+              <w:top w:val="single" w:sz="8" w:space="0" w:color="2E7D32"/>
+              <w:bottom w:val="single" w:sz="8" w:space="0" w:color="2E7D32"/>
+              <w:left w:val="single" w:sz="8" w:space="0" w:color="2E7D32"/>
+              <w:right w:val="single" w:sz="8" w:space="0" w:color="2E7D32"/>
+            </w:tcBorders>
+          </w:tcPr>
+          <w:p>
+            <w:pPr>
+              <w:spacing w:before="100"/>
+              <w:ind w:left="173"/>
+            </w:pPr>
+            <w:r>
+              <w:rPr>
+                <w:b/>
+                <w:color w:val="1B5E20"/>
+                <w:sz w:val="20"/>
+              </w:rPr>
+              <w:t>⚙  AÇÃO TÉCNICA — PROMPT — Início da seção de identificação de sintomas</w:t>
+            </w:r>
+          </w:p>
+          <w:p>
+            <w:pPr>
+              <w:spacing w:before="20" w:after="20"/>
+              <w:ind w:left="216"/>
+            </w:pPr>
+            <w:r>
+              <w:rPr>
+                <w:color w:val="1B3A20"/>
+                <w:sz w:val="20"/>
+              </w:rPr>
+              <w:t>Adicionar ANTES do mapeamento de grupos de sintomas:</w:t>
+            </w:r>
+          </w:p>
+          <w:p>
+            <w:pPr>
+              <w:spacing w:before="20" w:after="20"/>
+              <w:ind w:left="216"/>
+            </w:pPr>
+            <w:r>
+              <w:rPr>
+                <w:color w:val="1B3A20"/>
+                <w:sz w:val="20"/>
+              </w:rPr>
+            </w:r>
+          </w:p>
+          <w:p>
+            <w:pPr>
+              <w:spacing w:before="20" w:after="20"/>
+              <w:ind w:left="216"/>
+            </w:pPr>
+            <w:r>
+              <w:rPr>
+                <w:color w:val="1B3A20"/>
+                <w:sz w:val="20"/>
+              </w:rPr>
+              <w:t>✅ V7 — MÚLTIPLAS QUEIXAS:</w:t>
+            </w:r>
+          </w:p>
+          <w:p>
+            <w:pPr>
+              <w:spacing w:before="20" w:after="20"/>
+              <w:ind w:left="216"/>
+            </w:pPr>
+            <w:r>
+              <w:rPr>
+                <w:color w:val="1B3A20"/>
+                <w:sz w:val="20"/>
+              </w:rPr>
+              <w:t>Se o paciente listar 3 ou mais sintomas/queixas diferentes e não relacionados,</w:t>
+            </w:r>
+          </w:p>
+          <w:p>
+            <w:pPr>
+              <w:spacing w:before="20" w:after="20"/>
+              <w:ind w:left="216"/>
+            </w:pPr>
+            <w:r>
+              <w:rPr>
+                <w:color w:val="1B3A20"/>
+                <w:sz w:val="20"/>
+              </w:rPr>
+              <w:t>NÃO escolha o grupo ainda. Pergunte:</w:t>
+            </w:r>
+          </w:p>
+          <w:p>
+            <w:pPr>
+              <w:spacing w:before="20" w:after="20"/>
+              <w:ind w:left="216"/>
+            </w:pPr>
+            <w:r>
+              <w:rPr>
+                <w:color w:val="1B3A20"/>
+                <w:sz w:val="20"/>
+              </w:rPr>
+              <w:t xml:space="preserve">  "Qual é o seu principal sintoma agora para eu verificar se consigo</w:t>
+            </w:r>
+          </w:p>
+          <w:p>
+            <w:pPr>
+              <w:spacing w:before="20" w:after="20"/>
+              <w:ind w:left="216"/>
+            </w:pPr>
+            <w:r>
+              <w:rPr>
+                <w:color w:val="1B3A20"/>
+                <w:sz w:val="20"/>
+              </w:rPr>
+              <w:t xml:space="preserve">   te atender por aqui?"</w:t>
+            </w:r>
+          </w:p>
+          <w:p>
+            <w:pPr>
+              <w:spacing w:before="20" w:after="20"/>
+              <w:ind w:left="216"/>
+            </w:pPr>
+            <w:r>
+              <w:rPr>
+                <w:color w:val="1B3A20"/>
+                <w:sz w:val="20"/>
+              </w:rPr>
+              <w:t>Aguarde a resposta e só então siga para o grupo correto.</w:t>
+            </w:r>
+          </w:p>
+          <w:p>
+            <w:pPr>
+              <w:spacing w:before="20" w:after="20"/>
+              <w:ind w:left="216"/>
+            </w:pPr>
+            <w:r>
+              <w:rPr>
+                <w:color w:val="1B3A20"/>
+                <w:sz w:val="20"/>
+              </w:rPr>
+            </w:r>
+          </w:p>
+          <w:p>
+            <w:pPr>
+              <w:spacing w:before="20" w:after="20"/>
+              <w:ind w:left="216"/>
+            </w:pPr>
+            <w:r>
+              <w:rPr>
+                <w:color w:val="1B3A20"/>
+                <w:sz w:val="20"/>
+              </w:rPr>
+              <w:t>Exemplos que ativam V7:</w:t>
+            </w:r>
+          </w:p>
+          <w:p>
+            <w:pPr>
+              <w:spacing w:before="20" w:after="20"/>
+              <w:ind w:left="216"/>
+            </w:pPr>
+            <w:r>
+              <w:rPr>
+                <w:color w:val="1B3A20"/>
+                <w:sz w:val="20"/>
+              </w:rPr>
+              <w:t xml:space="preserve">  • "tosse, febre, dor no joelho, cansaço, dor de cabeça"</w:t>
+            </w:r>
+          </w:p>
+          <w:p>
+            <w:pPr>
+              <w:spacing w:before="20" w:after="20"/>
+              <w:ind w:left="216"/>
+            </w:pPr>
+            <w:r>
+              <w:rPr>
+                <w:color w:val="1B3A20"/>
+                <w:sz w:val="20"/>
+              </w:rPr>
+              <w:t xml:space="preserve">  • "dor de barriga, ansiedade e manchas na pele"</w:t>
+            </w:r>
+          </w:p>
+          <w:p>
+            <w:pPr>
+              <w:spacing w:after="80"/>
+            </w:pPr>
+          </w:p>
+        </w:tc>
+      </w:tr>
+    </w:tbl>
+    <w:p/>
+    <w:p>
+      <w:pPr>
+        <w:spacing w:before="40" w:after="40"/>
+        <w:pBdr>
+          <w:bottom w:val="single" w:sz="4" w:space="1" w:color="CCCCCC"/>
+        </w:pBdr>
+      </w:pPr>
+    </w:p>
+    <w:tbl>
+      <w:tblPr>
+        <w:tblW w:type="auto" w:w="0"/>
+        <w:tblLook w:firstColumn="1" w:firstRow="1" w:lastColumn="0" w:lastRow="0" w:noHBand="0" w:noVBand="1" w:val="04A0"/>
+      </w:tblPr>
+      <w:tblGrid>
+        <w:gridCol w:w="9746"/>
+      </w:tblGrid>
+      <w:tr>
+        <w:tc>
+          <w:tcPr>
+            <w:tcW w:type="dxa" w:w="9746"/>
+            <w:shd w:val="clear" w:color="auto" w:fill="FDEBD0"/>
+          </w:tcPr>
+          <w:p>
+            <w:pPr>
+              <w:spacing w:before="100" w:after="100"/>
+              <w:ind w:left="173"/>
+            </w:pPr>
+            <w:r>
+              <w:rPr>
+                <w:b/>
+                <w:color w:val="1B3A6B"/>
+                <w:sz w:val="22"/>
+              </w:rPr>
+              <w:t xml:space="preserve">3.  </w:t>
+            </w:r>
+            <w:r>
+              <w:rPr>
+                <w:b/>
+                <w:color w:val="1B3A6B"/>
+                <w:sz w:val="22"/>
+              </w:rPr>
+              <w:t>V9 — Atestado de acompanhante: comportamento inconsistente</w:t>
+            </w:r>
+          </w:p>
+        </w:tc>
+      </w:tr>
+    </w:tbl>
+    <w:p/>
+    <w:p>
+      <w:r>
+        <w:rPr>
+          <w:sz w:val="20"/>
+        </w:rPr>
+        <w:t>Nos testes de 11/06 o comportamento foi INTERMITENTE: às vezes recusou corretamente, às vezes tratou como consulta normal.</w:t>
+      </w:r>
+    </w:p>
+    <w:p>
+      <w:r>
+        <w:rPr>
+          <w:b/>
+          <w:color w:val="770000"/>
+          <w:sz w:val="20"/>
+        </w:rPr>
+        <w:t xml:space="preserve">CASO REAL DOCUMENTADO  </w:t>
+      </w:r>
+      <w:r>
+        <w:rPr>
+          <w:sz w:val="20"/>
+        </w:rPr>
+        <w:t>Raissa — 11/06/2026</w:t>
+      </w:r>
+    </w:p>
+    <w:tbl>
+      <w:tblPr>
+        <w:tblW w:type="auto" w:w="0"/>
+        <w:tblLook w:firstColumn="1" w:firstRow="1" w:lastColumn="0" w:lastRow="0" w:noHBand="0" w:noVBand="1" w:val="04A0"/>
+      </w:tblPr>
+      <w:tblGrid>
+        <w:gridCol w:w="9746"/>
+      </w:tblGrid>
+      <w:tr>
+        <w:tc>
+          <w:tcPr>
+            <w:tcW w:type="dxa" w:w="9746"/>
+            <w:shd w:val="clear" w:color="auto" w:fill="F0F0F0"/>
+            <w:tcBorders>
+              <w:top w:val="single" w:sz="6" w:space="0" w:color="BBBBBB"/>
+              <w:bottom w:val="single" w:sz="6" w:space="0" w:color="BBBBBB"/>
+              <w:left w:val="single" w:sz="6" w:space="0" w:color="BBBBBB"/>
+              <w:right w:val="single" w:sz="6" w:space="0" w:color="BBBBBB"/>
+            </w:tcBorders>
+          </w:tcPr>
+          <w:p>
+            <w:pPr>
+              <w:spacing w:before="20" w:after="20"/>
+              <w:ind w:left="144"/>
+            </w:pPr>
+            <w:r>
+              <w:rPr>
+                <w:rFonts w:ascii="Consolas" w:hAnsi="Consolas"/>
+                <w:color w:val="333333"/>
+                <w:sz w:val="19"/>
+              </w:rPr>
+              <w:t>Paciente solicitou atestado de acompanhante.</w:t>
+            </w:r>
+          </w:p>
+          <w:p>
+            <w:pPr>
+              <w:spacing w:before="20" w:after="20"/>
+              <w:ind w:left="144"/>
+            </w:pPr>
+            <w:r>
+              <w:rPr>
+                <w:rFonts w:ascii="Consolas" w:hAnsi="Consolas"/>
+                <w:color w:val="005AA0"/>
+                <w:sz w:val="19"/>
+              </w:rPr>
+              <w:t>Clara:  encaminhou para consulta em vez de recusar  ❌</w:t>
+            </w:r>
+          </w:p>
+        </w:tc>
+      </w:tr>
+    </w:tbl>
+    <w:p/>
+    <w:p>
+      <w:r>
+        <w:rPr>
+          <w:b/>
+          <w:color w:val="1A6B1A"/>
+          <w:sz w:val="20"/>
+        </w:rPr>
+        <w:t xml:space="preserve">COMPORTAMENTO ESPERADO:  </w:t>
+      </w:r>
+      <w:r>
+        <w:rPr>
+          <w:sz w:val="20"/>
+        </w:rPr>
+      </w:r>
+    </w:p>
+    <w:p>
+      <w:r>
+        <w:rPr>
+          <w:sz w:val="20"/>
+        </w:rPr>
+        <w:t>Qualquer menção a "atestado de acompanhante", "fui acompanhar familiar", "precisei ficar com filho/mãe no hospital" → recusa imediata + encerramento.</w:t>
+        <w:br/>
+        <w:br/>
+        <w:t>TEXTO EXATO A USAR:</w:t>
+        <w:br/>
+        <w:t>"Infelizmente não emitimos atestado de acompanhante. Esse documento deve ser solicitado diretamente na unidade onde o familiar foi atendido."</w:t>
+      </w:r>
+    </w:p>
+    <w:p/>
+    <w:tbl>
+      <w:tblPr>
+        <w:tblW w:type="auto" w:w="0"/>
+        <w:tblLook w:firstColumn="1" w:firstRow="1" w:lastColumn="0" w:lastRow="0" w:noHBand="0" w:noVBand="1" w:val="04A0"/>
+      </w:tblPr>
+      <w:tblGrid>
+        <w:gridCol w:w="9746"/>
+      </w:tblGrid>
+      <w:tr>
+        <w:tc>
+          <w:tcPr>
+            <w:tcW w:type="dxa" w:w="9746"/>
+            <w:shd w:val="clear" w:color="auto" w:fill="EAF4EA"/>
+            <w:tcBorders>
+              <w:top w:val="single" w:sz="8" w:space="0" w:color="2E7D32"/>
+              <w:bottom w:val="single" w:sz="8" w:space="0" w:color="2E7D32"/>
+              <w:left w:val="single" w:sz="8" w:space="0" w:color="2E7D32"/>
+              <w:right w:val="single" w:sz="8" w:space="0" w:color="2E7D32"/>
+            </w:tcBorders>
+          </w:tcPr>
+          <w:p>
+            <w:pPr>
+              <w:spacing w:before="100"/>
+              <w:ind w:left="173"/>
+            </w:pPr>
+            <w:r>
+              <w:rPr>
+                <w:b/>
+                <w:color w:val="1B5E20"/>
+                <w:sz w:val="20"/>
+              </w:rPr>
+              <w:t>⚙  AÇÃO TÉCNICA — PROMPT — Verificações iniciais (antes da triagem)</w:t>
+            </w:r>
+          </w:p>
+          <w:p>
+            <w:pPr>
+              <w:spacing w:before="20" w:after="20"/>
+              <w:ind w:left="216"/>
+            </w:pPr>
+            <w:r>
+              <w:rPr>
+                <w:color w:val="1B3A20"/>
+                <w:sz w:val="20"/>
+              </w:rPr>
+              <w:t>Adicionar como uma das primeiras verificações (V9):</w:t>
+            </w:r>
+          </w:p>
+          <w:p>
+            <w:pPr>
+              <w:spacing w:before="20" w:after="20"/>
+              <w:ind w:left="216"/>
+            </w:pPr>
+            <w:r>
+              <w:rPr>
+                <w:color w:val="1B3A20"/>
+                <w:sz w:val="20"/>
+              </w:rPr>
+            </w:r>
+          </w:p>
+          <w:p>
+            <w:pPr>
+              <w:spacing w:before="20" w:after="20"/>
+              <w:ind w:left="216"/>
+            </w:pPr>
+            <w:r>
+              <w:rPr>
+                <w:color w:val="1B3A20"/>
+                <w:sz w:val="20"/>
+              </w:rPr>
+              <w:t>✅ V9 — ATESTADO DE ACOMPANHANTE:</w:t>
+            </w:r>
+          </w:p>
+          <w:p>
+            <w:pPr>
+              <w:spacing w:before="20" w:after="20"/>
+              <w:ind w:left="216"/>
+            </w:pPr>
+            <w:r>
+              <w:rPr>
+                <w:color w:val="1B3A20"/>
+                <w:sz w:val="20"/>
+              </w:rPr>
+              <w:t>Gatilhos: "atestado de acompanhante" / "fui acompanhar [familiar]" /</w:t>
+            </w:r>
+          </w:p>
+          <w:p>
+            <w:pPr>
+              <w:spacing w:before="20" w:after="20"/>
+              <w:ind w:left="216"/>
+            </w:pPr>
+            <w:r>
+              <w:rPr>
+                <w:color w:val="1B3A20"/>
+                <w:sz w:val="20"/>
+              </w:rPr>
+              <w:t>"precisei ficar com meu [filho/mãe/pai]" / "acompanhei alguém no hospital"</w:t>
+            </w:r>
+          </w:p>
+          <w:p>
+            <w:pPr>
+              <w:spacing w:before="20" w:after="20"/>
+              <w:ind w:left="216"/>
+            </w:pPr>
+            <w:r>
+              <w:rPr>
+                <w:color w:val="1B3A20"/>
+                <w:sz w:val="20"/>
+              </w:rPr>
+            </w:r>
+          </w:p>
+          <w:p>
+            <w:pPr>
+              <w:spacing w:before="20" w:after="20"/>
+              <w:ind w:left="216"/>
+            </w:pPr>
+            <w:r>
+              <w:rPr>
+                <w:color w:val="1B3A20"/>
+                <w:sz w:val="20"/>
+              </w:rPr>
+              <w:t>Ação:</w:t>
+            </w:r>
+          </w:p>
+          <w:p>
+            <w:pPr>
+              <w:spacing w:before="20" w:after="20"/>
+              <w:ind w:left="216"/>
+            </w:pPr>
+            <w:r>
+              <w:rPr>
+                <w:rFonts w:ascii="Consolas" w:hAnsi="Consolas"/>
+                <w:color w:val="1B5E20"/>
+                <w:sz w:val="18"/>
+              </w:rPr>
+              <w:t xml:space="preserve">  → Responder: "Infelizmente não emitimos atestado de acompanhante.</w:t>
+            </w:r>
+          </w:p>
+          <w:p>
+            <w:pPr>
+              <w:spacing w:before="20" w:after="20"/>
+              <w:ind w:left="216"/>
+            </w:pPr>
+            <w:r>
+              <w:rPr>
+                <w:color w:val="1B3A20"/>
+                <w:sz w:val="20"/>
+              </w:rPr>
+              <w:t xml:space="preserve">     Esse documento deve ser solicitado diretamente na unidade onde</w:t>
+            </w:r>
+          </w:p>
+          <w:p>
+            <w:pPr>
+              <w:spacing w:before="20" w:after="20"/>
+              <w:ind w:left="216"/>
+            </w:pPr>
+            <w:r>
+              <w:rPr>
+                <w:color w:val="1B3A20"/>
+                <w:sz w:val="20"/>
+              </w:rPr>
+              <w:t xml:space="preserve">     o familiar foi atendido."</w:t>
+            </w:r>
+          </w:p>
+          <w:p>
+            <w:pPr>
+              <w:spacing w:before="20" w:after="20"/>
+              <w:ind w:left="216"/>
+            </w:pPr>
+            <w:r>
+              <w:rPr>
+                <w:rFonts w:ascii="Consolas" w:hAnsi="Consolas"/>
+                <w:color w:val="1B5E20"/>
+                <w:sz w:val="18"/>
+              </w:rPr>
+              <w:t xml:space="preserve">  → ENCERRAR o atendimento. Não continuar a triagem.</w:t>
+            </w:r>
+          </w:p>
+          <w:p>
+            <w:pPr>
+              <w:spacing w:before="20" w:after="20"/>
+              <w:ind w:left="216"/>
+            </w:pPr>
+            <w:r>
+              <w:rPr>
+                <w:color w:val="1B3A20"/>
+                <w:sz w:val="20"/>
+              </w:rPr>
+            </w:r>
+          </w:p>
+          <w:p>
+            <w:pPr>
+              <w:spacing w:before="20" w:after="20"/>
+              <w:ind w:left="216"/>
+            </w:pPr>
+            <w:r>
+              <w:rPr>
+                <w:color w:val="1B3A20"/>
+                <w:sz w:val="20"/>
+              </w:rPr>
+              <w:t>⚠ Revisar similaridade semântica — comportamento não pode ser intermitente.</w:t>
+            </w:r>
+          </w:p>
+          <w:p>
+            <w:pPr>
+              <w:spacing w:after="80"/>
+            </w:pPr>
+          </w:p>
+        </w:tc>
+      </w:tr>
+    </w:tbl>
+    <w:p/>
+    <w:p>
+      <w:pPr>
+        <w:spacing w:before="40" w:after="40"/>
+        <w:pBdr>
+          <w:bottom w:val="single" w:sz="4" w:space="1" w:color="CCCCCC"/>
+        </w:pBdr>
+      </w:pPr>
+    </w:p>
+    <w:tbl>
+      <w:tblPr>
+        <w:tblW w:type="auto" w:w="0"/>
+        <w:tblLook w:firstColumn="1" w:firstRow="1" w:lastColumn="0" w:lastRow="0" w:noHBand="0" w:noVBand="1" w:val="04A0"/>
+      </w:tblPr>
+      <w:tblGrid>
+        <w:gridCol w:w="9746"/>
+      </w:tblGrid>
+      <w:tr>
+        <w:tc>
+          <w:tcPr>
+            <w:tcW w:type="dxa" w:w="9746"/>
+            <w:shd w:val="clear" w:color="auto" w:fill="FDEBD0"/>
+          </w:tcPr>
+          <w:p>
+            <w:pPr>
+              <w:spacing w:before="100" w:after="100"/>
+              <w:ind w:left="173"/>
+            </w:pPr>
+            <w:r>
+              <w:rPr>
+                <w:b/>
+                <w:color w:val="1B3A6B"/>
+                <w:sz w:val="22"/>
+              </w:rPr>
+              <w:t xml:space="preserve">4.  </w:t>
+            </w:r>
+            <w:r>
+              <w:rPr>
+                <w:b/>
+                <w:color w:val="1B3A6B"/>
+                <w:sz w:val="22"/>
+              </w:rPr>
+              <w:t>V6 — Emagrecimento: passo extra desnecessário</w:t>
+            </w:r>
+          </w:p>
+        </w:tc>
+      </w:tr>
+    </w:tbl>
+    <w:p/>
+    <w:p>
+      <w:r>
+        <w:rPr>
+          <w:b/>
+          <w:color w:val="555555"/>
+          <w:sz w:val="20"/>
+        </w:rPr>
+        <w:t xml:space="preserve">O QUE ACONTECEU:  </w:t>
+      </w:r>
+      <w:r>
+        <w:rPr>
+          <w:sz w:val="20"/>
+        </w:rPr>
+      </w:r>
+    </w:p>
+    <w:p>
+      <w:r>
+        <w:rPr>
+          <w:sz w:val="20"/>
+        </w:rPr>
+        <w:t>Clara redirecionou corretamente para Consulta de Controle de Peso R$249 ✅, mas inseriu pergunta extra desnecessária:</w:t>
+        <w:br/>
+        <w:t>"além do peso, você está com algum sintoma físico agora?"</w:t>
+      </w:r>
+    </w:p>
+    <w:p>
+      <w:r>
+        <w:rPr>
+          <w:b/>
+          <w:color w:val="1A6B1A"/>
+          <w:sz w:val="20"/>
+        </w:rPr>
+        <w:t xml:space="preserve">COMPORTAMENTO ESPERADO:  </w:t>
+      </w:r>
+      <w:r>
+        <w:rPr>
+          <w:sz w:val="20"/>
+        </w:rPr>
+      </w:r>
+    </w:p>
+    <w:p>
+      <w:r>
+        <w:rPr>
+          <w:sz w:val="20"/>
+        </w:rPr>
+        <w:t>Ao identificar emagrecimento/obesidade/peso como queixa → ir direto para:</w:t>
+        <w:br/>
+        <w:t>"Temos a Consulta de Controle de Peso com médica especializada. Valor: R$249. Posso te ajudar a agendar?"</w:t>
+      </w:r>
+    </w:p>
+    <w:p/>
+    <w:tbl>
+      <w:tblPr>
+        <w:tblW w:type="auto" w:w="0"/>
+        <w:tblLook w:firstColumn="1" w:firstRow="1" w:lastColumn="0" w:lastRow="0" w:noHBand="0" w:noVBand="1" w:val="04A0"/>
+      </w:tblPr>
+      <w:tblGrid>
+        <w:gridCol w:w="9746"/>
+      </w:tblGrid>
+      <w:tr>
+        <w:tc>
+          <w:tcPr>
+            <w:tcW w:type="dxa" w:w="9746"/>
+            <w:shd w:val="clear" w:color="auto" w:fill="EAF4EA"/>
+            <w:tcBorders>
+              <w:top w:val="single" w:sz="8" w:space="0" w:color="2E7D32"/>
+              <w:bottom w:val="single" w:sz="8" w:space="0" w:color="2E7D32"/>
+              <w:left w:val="single" w:sz="8" w:space="0" w:color="2E7D32"/>
+              <w:right w:val="single" w:sz="8" w:space="0" w:color="2E7D32"/>
+            </w:tcBorders>
+          </w:tcPr>
+          <w:p>
+            <w:pPr>
+              <w:spacing w:before="100"/>
+              <w:ind w:left="173"/>
+            </w:pPr>
+            <w:r>
+              <w:rPr>
+                <w:b/>
+                <w:color w:val="1B5E20"/>
+                <w:sz w:val="20"/>
+              </w:rPr>
+              <w:t>⚙  AÇÃO TÉCNICA — PROMPT — Seção de queixas nas opções 1 ou 2</w:t>
+            </w:r>
+          </w:p>
+          <w:p>
+            <w:pPr>
+              <w:spacing w:before="20" w:after="20"/>
+              <w:ind w:left="216"/>
+            </w:pPr>
+            <w:r>
+              <w:rPr>
+                <w:color w:val="1B3A20"/>
+                <w:sz w:val="20"/>
+              </w:rPr>
+              <w:t>Adicionar ANTES dos grupos de sintomas:</w:t>
+            </w:r>
+          </w:p>
+          <w:p>
+            <w:pPr>
+              <w:spacing w:before="20" w:after="20"/>
+              <w:ind w:left="216"/>
+            </w:pPr>
+            <w:r>
+              <w:rPr>
+                <w:color w:val="1B3A20"/>
+                <w:sz w:val="20"/>
+              </w:rPr>
+            </w:r>
+          </w:p>
+          <w:p>
+            <w:pPr>
+              <w:spacing w:before="20" w:after="20"/>
+              <w:ind w:left="216"/>
+            </w:pPr>
+            <w:r>
+              <w:rPr>
+                <w:color w:val="1B3A20"/>
+                <w:sz w:val="20"/>
+              </w:rPr>
+              <w:t>✅ V6 — EMAGRECIMENTO / PESO:</w:t>
+            </w:r>
+          </w:p>
+          <w:p>
+            <w:pPr>
+              <w:spacing w:before="20" w:after="20"/>
+              <w:ind w:left="216"/>
+            </w:pPr>
+            <w:r>
+              <w:rPr>
+                <w:color w:val="1B3A20"/>
+                <w:sz w:val="20"/>
+              </w:rPr>
+              <w:t>Gatilhos: "emagrecer" / "perder peso" / "obesidade" / "sobrepeso" /</w:t>
+            </w:r>
+          </w:p>
+          <w:p>
+            <w:pPr>
+              <w:spacing w:before="20" w:after="20"/>
+              <w:ind w:left="216"/>
+            </w:pPr>
+            <w:r>
+              <w:rPr>
+                <w:color w:val="1B3A20"/>
+                <w:sz w:val="20"/>
+              </w:rPr>
+              <w:t>"controle de peso" / "tratamento para peso" / "quero emagrecer"</w:t>
+            </w:r>
+          </w:p>
+          <w:p>
+            <w:pPr>
+              <w:spacing w:before="20" w:after="20"/>
+              <w:ind w:left="216"/>
+            </w:pPr>
+            <w:r>
+              <w:rPr>
+                <w:color w:val="1B3A20"/>
+                <w:sz w:val="20"/>
+              </w:rPr>
+            </w:r>
+          </w:p>
+          <w:p>
+            <w:pPr>
+              <w:spacing w:before="20" w:after="20"/>
+              <w:ind w:left="216"/>
+            </w:pPr>
+            <w:r>
+              <w:rPr>
+                <w:color w:val="1B3A20"/>
+                <w:sz w:val="20"/>
+              </w:rPr>
+              <w:t>Ação:</w:t>
+            </w:r>
+          </w:p>
+          <w:p>
+            <w:pPr>
+              <w:spacing w:before="20" w:after="20"/>
+              <w:ind w:left="216"/>
+            </w:pPr>
+            <w:r>
+              <w:rPr>
+                <w:rFonts w:ascii="Consolas" w:hAnsi="Consolas"/>
+                <w:color w:val="1B5E20"/>
+                <w:sz w:val="18"/>
+              </w:rPr>
+              <w:t xml:space="preserve">  → NÃO perguntar sobre outros sintomas físicos.</w:t>
+            </w:r>
+          </w:p>
+          <w:p>
+            <w:pPr>
+              <w:spacing w:before="20" w:after="20"/>
+              <w:ind w:left="216"/>
+            </w:pPr>
+            <w:r>
+              <w:rPr>
+                <w:rFonts w:ascii="Consolas" w:hAnsi="Consolas"/>
+                <w:color w:val="1B5E20"/>
+                <w:sz w:val="18"/>
+              </w:rPr>
+              <w:t xml:space="preserve">  → NÃO encaminhar para clínico geral (R$79).</w:t>
+            </w:r>
+          </w:p>
+          <w:p>
+            <w:pPr>
+              <w:spacing w:before="20" w:after="20"/>
+              <w:ind w:left="216"/>
+            </w:pPr>
+            <w:r>
+              <w:rPr>
+                <w:rFonts w:ascii="Consolas" w:hAnsi="Consolas"/>
+                <w:color w:val="1B5E20"/>
+                <w:sz w:val="18"/>
+              </w:rPr>
+              <w:t xml:space="preserve">  → Responder diretamente:</w:t>
+            </w:r>
+          </w:p>
+          <w:p>
+            <w:pPr>
+              <w:spacing w:before="20" w:after="20"/>
+              <w:ind w:left="216"/>
+            </w:pPr>
+            <w:r>
+              <w:rPr>
+                <w:color w:val="1B3A20"/>
+                <w:sz w:val="20"/>
+              </w:rPr>
+              <w:t xml:space="preserve">     "Temos a Consulta de Controle de Peso com médica especializada.</w:t>
+            </w:r>
+          </w:p>
+          <w:p>
+            <w:pPr>
+              <w:spacing w:before="20" w:after="20"/>
+              <w:ind w:left="216"/>
+            </w:pPr>
+            <w:r>
+              <w:rPr>
+                <w:color w:val="1B3A20"/>
+                <w:sz w:val="20"/>
+              </w:rPr>
+              <w:t xml:space="preserve">      Valor: R$249. Posso te ajudar a agendar?"</w:t>
+            </w:r>
+          </w:p>
+          <w:p>
+            <w:pPr>
+              <w:spacing w:before="20" w:after="20"/>
+              <w:ind w:left="216"/>
+            </w:pPr>
+            <w:r>
+              <w:rPr>
+                <w:color w:val="1B3A20"/>
+                <w:sz w:val="20"/>
+              </w:rPr>
+            </w:r>
+          </w:p>
+          <w:p>
+            <w:pPr>
+              <w:spacing w:before="20" w:after="20"/>
+              <w:ind w:left="216"/>
+            </w:pPr>
+            <w:r>
+              <w:rPr>
+                <w:color w:val="1B3A20"/>
+                <w:sz w:val="20"/>
+              </w:rPr>
+              <w:t>⚠ Atenção financeira: cada paciente encaminhado errado = perda de R$170/consulta.</w:t>
+            </w:r>
+          </w:p>
+          <w:p>
+            <w:pPr>
+              <w:spacing w:after="80"/>
+            </w:pPr>
+          </w:p>
+        </w:tc>
+      </w:tr>
+    </w:tbl>
+    <w:p/>
+    <w:p>
+      <w:r>
+        <w:br w:type="page"/>
+      </w:r>
+    </w:p>
+    <w:tbl>
+      <w:tblPr>
+        <w:tblW w:type="auto" w:w="0"/>
+        <w:jc w:val="center"/>
+        <w:tblLook w:firstColumn="1" w:firstRow="1" w:lastColumn="0" w:lastRow="0" w:noHBand="0" w:noVBand="1" w:val="04A0"/>
+      </w:tblPr>
+      <w:tblGrid>
+        <w:gridCol w:w="9746"/>
+      </w:tblGrid>
+      <w:tr>
+        <w:tc>
+          <w:tcPr>
+            <w:tcW w:type="dxa" w:w="9360"/>
+            <w:shd w:val="clear" w:color="auto" w:fill="1B3A6B"/>
+          </w:tcPr>
+          <w:p>
+            <w:pPr>
+              <w:spacing w:before="140" w:after="140"/>
+              <w:ind w:left="216"/>
+              <w:jc w:val="left"/>
+            </w:pPr>
+            <w:r>
+              <w:rPr>
+                <w:b/>
+                <w:color w:val="FFFFFF"/>
+                <w:sz w:val="24"/>
+              </w:rPr>
+              <w:t xml:space="preserve">  PARTE 2   WORKFLOW DE FOLLOW-UP  (n8n)</w:t>
+            </w:r>
+          </w:p>
+        </w:tc>
+      </w:tr>
+    </w:tbl>
+    <w:p/>
+    <w:tbl>
+      <w:tblPr>
+        <w:tblW w:type="auto" w:w="0"/>
+        <w:tblLook w:firstColumn="1" w:firstRow="1" w:lastColumn="0" w:lastRow="0" w:noHBand="0" w:noVBand="1" w:val="04A0"/>
+      </w:tblPr>
+      <w:tblGrid>
+        <w:gridCol w:w="9746"/>
+      </w:tblGrid>
+      <w:tr>
+        <w:tc>
+          <w:tcPr>
+            <w:tcW w:type="dxa" w:w="9746"/>
+            <w:shd w:val="clear" w:color="auto" w:fill="D6E4F7"/>
+          </w:tcPr>
+          <w:p>
+            <w:pPr>
+              <w:spacing w:before="100" w:after="100"/>
+              <w:ind w:left="173"/>
+            </w:pPr>
+            <w:r>
+              <w:rPr>
+                <w:b/>
+                <w:color w:val="1B3A6B"/>
+                <w:sz w:val="22"/>
+              </w:rPr>
+              <w:t xml:space="preserve">5.  </w:t>
+            </w:r>
+            <w:r>
+              <w:rPr>
+                <w:b/>
+                <w:color w:val="1B3A6B"/>
+                <w:sz w:val="22"/>
+              </w:rPr>
+              <w:t>[NOME DO CLIENTE] aparece como texto literal</w:t>
+            </w:r>
+          </w:p>
+        </w:tc>
+      </w:tr>
+    </w:tbl>
+    <w:p/>
+    <w:p>
+      <w:r>
+        <w:rPr>
+          <w:b/>
+          <w:color w:val="C00000"/>
+          <w:sz w:val="20"/>
+        </w:rPr>
+        <w:t xml:space="preserve">MENSAGEM ENVIADA:  </w:t>
+      </w:r>
+      <w:r>
+        <w:rPr>
+          <w:sz w:val="20"/>
+        </w:rPr>
+      </w:r>
+    </w:p>
+    <w:tbl>
+      <w:tblPr>
+        <w:tblW w:type="auto" w:w="0"/>
+        <w:tblLook w:firstColumn="1" w:firstRow="1" w:lastColumn="0" w:lastRow="0" w:noHBand="0" w:noVBand="1" w:val="04A0"/>
+      </w:tblPr>
+      <w:tblGrid>
+        <w:gridCol w:w="9746"/>
+      </w:tblGrid>
+      <w:tr>
+        <w:tc>
+          <w:tcPr>
+            <w:tcW w:type="dxa" w:w="9746"/>
+            <w:shd w:val="clear" w:color="auto" w:fill="F0F0F0"/>
+            <w:tcBorders>
+              <w:top w:val="single" w:sz="6" w:space="0" w:color="BBBBBB"/>
+              <w:bottom w:val="single" w:sz="6" w:space="0" w:color="BBBBBB"/>
+              <w:left w:val="single" w:sz="6" w:space="0" w:color="BBBBBB"/>
+              <w:right w:val="single" w:sz="6" w:space="0" w:color="BBBBBB"/>
+            </w:tcBorders>
+          </w:tcPr>
+          <w:p>
+            <w:pPr>
+              <w:spacing w:before="20" w:after="20"/>
+              <w:ind w:left="144"/>
+            </w:pPr>
+            <w:r>
+              <w:rPr>
+                <w:rFonts w:ascii="Consolas" w:hAnsi="Consolas"/>
+                <w:color w:val="B00000"/>
+                <w:sz w:val="19"/>
+              </w:rPr>
+              <w:t>"Olá, [NOME DO CLIENTE]. Eu entendo que estar acima do peso pode ser frustrante..."  ❌</w:t>
+            </w:r>
+          </w:p>
+        </w:tc>
+      </w:tr>
+    </w:tbl>
+    <w:p/>
+    <w:p>
+      <w:r>
+        <w:rPr>
+          <w:sz w:val="20"/>
+        </w:rPr>
+        <w:t>A variável de nome não foi substituída. O paciente recebeu o placeholder literal — extremamente prejudicial à imagem da clínica.</w:t>
+      </w:r>
+    </w:p>
+    <w:tbl>
+      <w:tblPr>
+        <w:tblW w:type="auto" w:w="0"/>
+        <w:tblLook w:firstColumn="1" w:firstRow="1" w:lastColumn="0" w:lastRow="0" w:noHBand="0" w:noVBand="1" w:val="04A0"/>
+      </w:tblPr>
+      <w:tblGrid>
+        <w:gridCol w:w="9746"/>
+      </w:tblGrid>
+      <w:tr>
+        <w:tc>
+          <w:tcPr>
+            <w:tcW w:type="dxa" w:w="9746"/>
+            <w:shd w:val="clear" w:color="auto" w:fill="EAF4EA"/>
+            <w:tcBorders>
+              <w:top w:val="single" w:sz="8" w:space="0" w:color="2E7D32"/>
+              <w:bottom w:val="single" w:sz="8" w:space="0" w:color="2E7D32"/>
+              <w:left w:val="single" w:sz="8" w:space="0" w:color="2E7D32"/>
+              <w:right w:val="single" w:sz="8" w:space="0" w:color="2E7D32"/>
+            </w:tcBorders>
+          </w:tcPr>
+          <w:p>
+            <w:pPr>
+              <w:spacing w:before="100"/>
+              <w:ind w:left="173"/>
+            </w:pPr>
+            <w:r>
+              <w:rPr>
+                <w:b/>
+                <w:color w:val="1B5E20"/>
+                <w:sz w:val="20"/>
+              </w:rPr>
+              <w:t>⚙  AÇÃO TÉCNICA — n8n — Nó de template do follow-up</w:t>
+            </w:r>
+          </w:p>
+          <w:p>
+            <w:pPr>
+              <w:spacing w:before="20" w:after="20"/>
+              <w:ind w:left="216"/>
+            </w:pPr>
+            <w:r>
+              <w:rPr>
+                <w:color w:val="1B3A20"/>
+                <w:sz w:val="20"/>
+              </w:rPr>
+              <w:t>No nó que monta o texto do follow-up, adicionar verificação:</w:t>
+            </w:r>
+          </w:p>
+          <w:p>
+            <w:pPr>
+              <w:spacing w:before="20" w:after="20"/>
+              <w:ind w:left="216"/>
+            </w:pPr>
+            <w:r>
+              <w:rPr>
+                <w:color w:val="1B3A20"/>
+                <w:sz w:val="20"/>
+              </w:rPr>
+            </w:r>
+          </w:p>
+          <w:p>
+            <w:pPr>
+              <w:spacing w:before="20" w:after="20"/>
+              <w:ind w:left="216"/>
+            </w:pPr>
+            <w:r>
+              <w:rPr>
+                <w:rFonts w:ascii="Consolas" w:hAnsi="Consolas"/>
+                <w:color w:val="1B5E20"/>
+                <w:sz w:val="18"/>
+              </w:rPr>
+              <w:t>const nome = $json.nome || '';</w:t>
+            </w:r>
+          </w:p>
+          <w:p>
+            <w:pPr>
+              <w:spacing w:before="20" w:after="20"/>
+              <w:ind w:left="216"/>
+            </w:pPr>
+            <w:r>
+              <w:rPr>
+                <w:rFonts w:ascii="Consolas" w:hAnsi="Consolas"/>
+                <w:color w:val="1B5E20"/>
+                <w:sz w:val="18"/>
+              </w:rPr>
+              <w:t>const saudacao = nome ? `Olá, ${nome}!` : 'Olá!';</w:t>
+            </w:r>
+          </w:p>
+          <w:p>
+            <w:pPr>
+              <w:spacing w:before="20" w:after="20"/>
+              <w:ind w:left="216"/>
+            </w:pPr>
+            <w:r>
+              <w:rPr>
+                <w:color w:val="1B3A20"/>
+                <w:sz w:val="20"/>
+              </w:rPr>
+            </w:r>
+          </w:p>
+          <w:p>
+            <w:pPr>
+              <w:spacing w:before="20" w:after="20"/>
+              <w:ind w:left="216"/>
+            </w:pPr>
+            <w:r>
+              <w:rPr>
+                <w:rFonts w:ascii="Consolas" w:hAnsi="Consolas"/>
+                <w:color w:val="1B5E20"/>
+                <w:sz w:val="18"/>
+              </w:rPr>
+              <w:t>// Usar "saudacao" no início de todas as mensagens de follow-up.</w:t>
+            </w:r>
+          </w:p>
+          <w:p>
+            <w:pPr>
+              <w:spacing w:before="20" w:after="20"/>
+              <w:ind w:left="216"/>
+            </w:pPr>
+            <w:r>
+              <w:rPr>
+                <w:rFonts w:ascii="Consolas" w:hAnsi="Consolas"/>
+                <w:color w:val="1B5E20"/>
+                <w:sz w:val="18"/>
+              </w:rPr>
+              <w:t>// NUNCA interpoler {{nome}} diretamente sem checar se existe.</w:t>
+            </w:r>
+          </w:p>
+          <w:p>
+            <w:pPr>
+              <w:spacing w:after="80"/>
+            </w:pPr>
+          </w:p>
+        </w:tc>
+      </w:tr>
+    </w:tbl>
+    <w:p/>
+    <w:p>
+      <w:pPr>
+        <w:spacing w:before="40" w:after="40"/>
+        <w:pBdr>
+          <w:bottom w:val="single" w:sz="4" w:space="1" w:color="CCCCCC"/>
+        </w:pBdr>
+      </w:pPr>
+    </w:p>
+    <w:tbl>
+      <w:tblPr>
+        <w:tblW w:type="auto" w:w="0"/>
+        <w:tblLook w:firstColumn="1" w:firstRow="1" w:lastColumn="0" w:lastRow="0" w:noHBand="0" w:noVBand="1" w:val="04A0"/>
+      </w:tblPr>
+      <w:tblGrid>
+        <w:gridCol w:w="9746"/>
+      </w:tblGrid>
+      <w:tr>
+        <w:tc>
+          <w:tcPr>
+            <w:tcW w:type="dxa" w:w="9746"/>
+            <w:shd w:val="clear" w:color="auto" w:fill="D6E4F7"/>
+          </w:tcPr>
+          <w:p>
+            <w:pPr>
+              <w:spacing w:before="100" w:after="100"/>
+              <w:ind w:left="173"/>
+            </w:pPr>
+            <w:r>
+              <w:rPr>
+                <w:b/>
+                <w:color w:val="1B3A6B"/>
+                <w:sz w:val="22"/>
+              </w:rPr>
+              <w:t xml:space="preserve">6.  </w:t>
+            </w:r>
+            <w:r>
+              <w:rPr>
+                <w:b/>
+                <w:color w:val="1B3A6B"/>
+                <w:sz w:val="22"/>
+              </w:rPr>
+              <w:t>Follow-up enviado após paciente dizer NÃO explicitamente</w:t>
+            </w:r>
+          </w:p>
+        </w:tc>
+      </w:tr>
+    </w:tbl>
+    <w:p/>
+    <w:p>
+      <w:r>
+        <w:rPr>
+          <w:b/>
+          <w:color w:val="1B3A6B"/>
+          <w:sz w:val="20"/>
+        </w:rPr>
+        <w:t xml:space="preserve">REGRA QUE DEVE EXISTIR:  </w:t>
+      </w:r>
+      <w:r>
+        <w:rPr>
+          <w:sz w:val="20"/>
+        </w:rPr>
       </w:r>
     </w:p>
     <w:p>
       <w:pPr>
-        <w:ind w:left="432"/>
+        <w:ind w:left="288"/>
+      </w:pPr>
+    </w:p>
+    <w:p>
+      <w:pPr>
+        <w:ind w:left="360"/>
       </w:pPr>
       <w:r>
         <w:rPr>
-          <w:color w:val="0070C0"/>
           <w:sz w:val="20"/>
         </w:rPr>
-        <w:t>→ Clara: "não conseguimos garantir atestado retroativo. O médico pode avaliar... emitir atestado a partir de hoje"</w:t>
+        <w:t>1.  Responder com encerramento gentil ("Sem problemas! Sempre que precisar pode nos chamar 🧡")</w:t>
       </w:r>
     </w:p>
     <w:p>
       <w:pPr>
-        <w:ind w:left="432"/>
+        <w:ind w:left="360"/>
       </w:pPr>
       <w:r>
         <w:rPr>
-          <w:color w:val="404040"/>
           <w:sz w:val="20"/>
         </w:rPr>
-        <w:t>→ Intervenção manual necessária.</w:t>
+        <w:t>2.  Cancelar TODOS os follow-ups agendados para aquele contato</w:t>
+      </w:r>
+    </w:p>
+    <w:p>
+      <w:pPr>
+        <w:ind w:left="360"/>
+      </w:pPr>
+      <w:r>
+        <w:rPr>
+          <w:sz w:val="20"/>
+        </w:rPr>
+        <w:t>3.  Não enviar mais nenhuma mensagem automática</w:t>
       </w:r>
     </w:p>
     <w:p/>
@@ -157,15 +2250,589 @@
       <w:r>
         <w:rPr>
           <w:b/>
+          <w:color w:val="770000"/>
+          <w:sz w:val="20"/>
         </w:rPr>
-        <w:t>COMPORTAMENTO CORRETO:</w:t>
+        <w:t xml:space="preserve">CASO 1  </w:t>
+      </w:r>
+      <w:r>
+        <w:rPr>
+          <w:sz w:val="20"/>
+        </w:rPr>
+        <w:t>Leandro — 11/06/2026</w:t>
+      </w:r>
+    </w:p>
+    <w:tbl>
+      <w:tblPr>
+        <w:tblW w:type="auto" w:w="0"/>
+        <w:tblLook w:firstColumn="1" w:firstRow="1" w:lastColumn="0" w:lastRow="0" w:noHBand="0" w:noVBand="1" w:val="04A0"/>
+      </w:tblPr>
+      <w:tblGrid>
+        <w:gridCol w:w="9746"/>
+      </w:tblGrid>
+      <w:tr>
+        <w:tc>
+          <w:tcPr>
+            <w:tcW w:type="dxa" w:w="9746"/>
+            <w:shd w:val="clear" w:color="auto" w:fill="F0F0F0"/>
+            <w:tcBorders>
+              <w:top w:val="single" w:sz="6" w:space="0" w:color="BBBBBB"/>
+              <w:bottom w:val="single" w:sz="6" w:space="0" w:color="BBBBBB"/>
+              <w:left w:val="single" w:sz="6" w:space="0" w:color="BBBBBB"/>
+              <w:right w:val="single" w:sz="6" w:space="0" w:color="BBBBBB"/>
+            </w:tcBorders>
+          </w:tcPr>
+          <w:p>
+            <w:pPr>
+              <w:spacing w:before="20" w:after="20"/>
+              <w:ind w:left="144"/>
+            </w:pPr>
+            <w:r>
+              <w:rPr>
+                <w:rFonts w:ascii="Consolas" w:hAnsi="Consolas"/>
+                <w:color w:val="333333"/>
+                <w:sz w:val="19"/>
+              </w:rPr>
+              <w:t>07:51  Paciente:  NÃO (não quer marcar)</w:t>
+            </w:r>
+          </w:p>
+          <w:p>
+            <w:pPr>
+              <w:spacing w:before="20" w:after="20"/>
+              <w:ind w:left="144"/>
+            </w:pPr>
+            <w:r>
+              <w:rPr>
+                <w:rFonts w:ascii="Consolas" w:hAnsi="Consolas"/>
+                <w:color w:val="1A6B1A"/>
+                <w:sz w:val="19"/>
+              </w:rPr>
+              <w:t>07:51  Clara:     "Sem problemas! Sempre que precisar pode nos chamar. 🧡"  ✅</w:t>
+            </w:r>
+          </w:p>
+          <w:p>
+            <w:pPr>
+              <w:spacing w:before="20" w:after="20"/>
+              <w:ind w:left="144"/>
+            </w:pPr>
+            <w:r>
+              <w:rPr>
+                <w:rFonts w:ascii="Consolas" w:hAnsi="Consolas"/>
+                <w:color w:val="B00000"/>
+                <w:sz w:val="19"/>
+              </w:rPr>
+              <w:t>09:01  Clara:     novo follow-up sobre atestado  ❌  — ignorou o NÃO anterior</w:t>
+            </w:r>
+          </w:p>
+        </w:tc>
+      </w:tr>
+    </w:tbl>
+    <w:p/>
+    <w:p>
+      <w:r>
+        <w:rPr>
+          <w:b/>
+          <w:color w:val="770000"/>
+          <w:sz w:val="20"/>
+        </w:rPr>
+        <w:t xml:space="preserve">CASO 2  </w:t>
+      </w:r>
+      <w:r>
+        <w:rPr>
+          <w:sz w:val="20"/>
+        </w:rPr>
+        <w:t>Danielle — 09 e 10/06/2026</w:t>
+      </w:r>
+    </w:p>
+    <w:tbl>
+      <w:tblPr>
+        <w:tblW w:type="auto" w:w="0"/>
+        <w:tblLook w:firstColumn="1" w:firstRow="1" w:lastColumn="0" w:lastRow="0" w:noHBand="0" w:noVBand="1" w:val="04A0"/>
+      </w:tblPr>
+      <w:tblGrid>
+        <w:gridCol w:w="9746"/>
+      </w:tblGrid>
+      <w:tr>
+        <w:tc>
+          <w:tcPr>
+            <w:tcW w:type="dxa" w:w="9746"/>
+            <w:shd w:val="clear" w:color="auto" w:fill="F0F0F0"/>
+            <w:tcBorders>
+              <w:top w:val="single" w:sz="6" w:space="0" w:color="BBBBBB"/>
+              <w:bottom w:val="single" w:sz="6" w:space="0" w:color="BBBBBB"/>
+              <w:left w:val="single" w:sz="6" w:space="0" w:color="BBBBBB"/>
+              <w:right w:val="single" w:sz="6" w:space="0" w:color="BBBBBB"/>
+            </w:tcBorders>
+          </w:tcPr>
+          <w:p>
+            <w:pPr>
+              <w:spacing w:before="20" w:after="20"/>
+              <w:ind w:left="144"/>
+            </w:pPr>
+            <w:r>
+              <w:rPr>
+                <w:rFonts w:ascii="Consolas" w:hAnsi="Consolas"/>
+                <w:color w:val="333333"/>
+                <w:sz w:val="19"/>
+              </w:rPr>
+              <w:t>08:57 09/06  Paciente:  "Não" (ao continuar)</w:t>
+            </w:r>
+          </w:p>
+          <w:p>
+            <w:pPr>
+              <w:spacing w:before="20" w:after="20"/>
+              <w:ind w:left="144"/>
+            </w:pPr>
+            <w:r>
+              <w:rPr>
+                <w:rFonts w:ascii="Consolas" w:hAnsi="Consolas"/>
+                <w:color w:val="1A6B1A"/>
+                <w:sz w:val="19"/>
+              </w:rPr>
+              <w:t>08:58 09/06  Clara:     "Sem problemas! Sempre que precisar pode nos chamar. 🧡"  ✅</w:t>
+            </w:r>
+          </w:p>
+          <w:p>
+            <w:pPr>
+              <w:spacing w:before="20" w:after="20"/>
+              <w:ind w:left="144"/>
+            </w:pPr>
+            <w:r>
+              <w:rPr>
+                <w:rFonts w:ascii="Consolas" w:hAnsi="Consolas"/>
+                <w:color w:val="B00000"/>
+                <w:sz w:val="19"/>
+              </w:rPr>
+              <w:t>09:11 09/06  Clara:     1º follow-up  ❌</w:t>
+            </w:r>
+          </w:p>
+          <w:p>
+            <w:pPr>
+              <w:spacing w:before="20" w:after="20"/>
+              <w:ind w:left="144"/>
+            </w:pPr>
+            <w:r>
+              <w:rPr>
+                <w:rFonts w:ascii="Consolas" w:hAnsi="Consolas"/>
+                <w:color w:val="B00000"/>
+                <w:sz w:val="19"/>
+              </w:rPr>
+              <w:t>10:01 09/06  Clara:     2º follow-up  ❌</w:t>
+            </w:r>
+          </w:p>
+          <w:p>
+            <w:pPr>
+              <w:spacing w:before="20" w:after="20"/>
+              <w:ind w:left="144"/>
+            </w:pPr>
+            <w:r>
+              <w:rPr>
+                <w:rFonts w:ascii="Consolas" w:hAnsi="Consolas"/>
+                <w:color w:val="B00000"/>
+                <w:sz w:val="19"/>
+              </w:rPr>
+              <w:t>09:01 10/06  Clara:     3º follow-up (dia seguinte!)  ❌</w:t>
+            </w:r>
+          </w:p>
+          <w:p>
+            <w:pPr>
+              <w:spacing w:before="20" w:after="20"/>
+              <w:ind w:left="144"/>
+            </w:pPr>
+            <w:r>
+              <w:rPr>
+                <w:rFonts w:ascii="Consolas" w:hAnsi="Consolas"/>
+                <w:color w:val="333333"/>
+                <w:sz w:val="19"/>
+              </w:rPr>
+              <w:t>Total: 3 follow-ups após NÃO explícito, em 2 dias diferentes.</w:t>
+            </w:r>
+          </w:p>
+        </w:tc>
+      </w:tr>
+    </w:tbl>
+    <w:p/>
+    <w:tbl>
+      <w:tblPr>
+        <w:tblW w:type="auto" w:w="0"/>
+        <w:tblLook w:firstColumn="1" w:firstRow="1" w:lastColumn="0" w:lastRow="0" w:noHBand="0" w:noVBand="1" w:val="04A0"/>
+      </w:tblPr>
+      <w:tblGrid>
+        <w:gridCol w:w="9746"/>
+      </w:tblGrid>
+      <w:tr>
+        <w:tc>
+          <w:tcPr>
+            <w:tcW w:type="dxa" w:w="9746"/>
+            <w:shd w:val="clear" w:color="auto" w:fill="EAF4EA"/>
+            <w:tcBorders>
+              <w:top w:val="single" w:sz="8" w:space="0" w:color="2E7D32"/>
+              <w:bottom w:val="single" w:sz="8" w:space="0" w:color="2E7D32"/>
+              <w:left w:val="single" w:sz="8" w:space="0" w:color="2E7D32"/>
+              <w:right w:val="single" w:sz="8" w:space="0" w:color="2E7D32"/>
+            </w:tcBorders>
+          </w:tcPr>
+          <w:p>
+            <w:pPr>
+              <w:spacing w:before="100"/>
+              <w:ind w:left="173"/>
+            </w:pPr>
+            <w:r>
+              <w:rPr>
+                <w:b/>
+                <w:color w:val="1B5E20"/>
+                <w:sz w:val="20"/>
+              </w:rPr>
+              <w:t>⚙  AÇÃO TÉCNICA — n8n — Workflow de follow-up + Supabase</w:t>
+            </w:r>
+          </w:p>
+          <w:p>
+            <w:pPr>
+              <w:spacing w:before="20" w:after="20"/>
+              <w:ind w:left="216"/>
+            </w:pPr>
+            <w:r>
+              <w:rPr>
+                <w:color w:val="1B3A20"/>
+                <w:sz w:val="20"/>
+              </w:rPr>
+              <w:t>Adicionar condição no INÍCIO do workflow de follow-up:</w:t>
+            </w:r>
+          </w:p>
+          <w:p>
+            <w:pPr>
+              <w:spacing w:before="20" w:after="20"/>
+              <w:ind w:left="216"/>
+            </w:pPr>
+            <w:r>
+              <w:rPr>
+                <w:color w:val="1B3A20"/>
+                <w:sz w:val="20"/>
+              </w:rPr>
+            </w:r>
+          </w:p>
+          <w:p>
+            <w:pPr>
+              <w:spacing w:before="20" w:after="20"/>
+              <w:ind w:left="216"/>
+            </w:pPr>
+            <w:r>
+              <w:rPr>
+                <w:rFonts w:ascii="Consolas" w:hAnsi="Consolas"/>
+                <w:color w:val="1B5E20"/>
+                <w:sz w:val="18"/>
+              </w:rPr>
+              <w:t>SELECT estado FROM conversas WHERE telefone = {{telefone}}</w:t>
+            </w:r>
+          </w:p>
+          <w:p>
+            <w:pPr>
+              <w:spacing w:before="20" w:after="20"/>
+              <w:ind w:left="216"/>
+            </w:pPr>
+            <w:r>
+              <w:rPr>
+                <w:color w:val="1B3A20"/>
+                <w:sz w:val="20"/>
+              </w:rPr>
+            </w:r>
+          </w:p>
+          <w:p>
+            <w:pPr>
+              <w:spacing w:before="20" w:after="20"/>
+              <w:ind w:left="216"/>
+            </w:pPr>
+            <w:r>
+              <w:rPr>
+                <w:rFonts w:ascii="Consolas" w:hAnsi="Consolas"/>
+                <w:color w:val="1B5E20"/>
+                <w:sz w:val="18"/>
+              </w:rPr>
+              <w:t>if estado IN ('recusou', 'nao_quer_prosseguir', 'encerrado_pelo_paciente',</w:t>
+            </w:r>
+          </w:p>
+          <w:p>
+            <w:pPr>
+              <w:spacing w:before="20" w:after="20"/>
+              <w:ind w:left="216"/>
+            </w:pPr>
+            <w:r>
+              <w:rPr>
+                <w:color w:val="1B3A20"/>
+                <w:sz w:val="20"/>
+              </w:rPr>
+              <w:t xml:space="preserve">              'servico_negado'):</w:t>
+            </w:r>
+          </w:p>
+          <w:p>
+            <w:pPr>
+              <w:spacing w:before="20" w:after="20"/>
+              <w:ind w:left="216"/>
+            </w:pPr>
+            <w:r>
+              <w:rPr>
+                <w:rFonts w:ascii="Consolas" w:hAnsi="Consolas"/>
+                <w:color w:val="1B5E20"/>
+                <w:sz w:val="18"/>
+              </w:rPr>
+              <w:t xml:space="preserve">    → PARAR aqui. Não enviar follow-up.</w:t>
+            </w:r>
+          </w:p>
+          <w:p>
+            <w:pPr>
+              <w:spacing w:before="20" w:after="20"/>
+              <w:ind w:left="216"/>
+            </w:pPr>
+            <w:r>
+              <w:rPr>
+                <w:color w:val="1B3A20"/>
+                <w:sz w:val="20"/>
+              </w:rPr>
+            </w:r>
+          </w:p>
+          <w:p>
+            <w:pPr>
+              <w:spacing w:before="20" w:after="20"/>
+              <w:ind w:left="216"/>
+            </w:pPr>
+            <w:r>
+              <w:rPr>
+                <w:color w:val="1B3A20"/>
+                <w:sz w:val="20"/>
+              </w:rPr>
+              <w:t>Quando paciente responder NÃO em qualquer etapa:</w:t>
+            </w:r>
+          </w:p>
+          <w:p>
+            <w:pPr>
+              <w:spacing w:before="20" w:after="20"/>
+              <w:ind w:left="216"/>
+            </w:pPr>
+            <w:r>
+              <w:rPr>
+                <w:rFonts w:ascii="Consolas" w:hAnsi="Consolas"/>
+                <w:color w:val="1B5E20"/>
+                <w:sz w:val="18"/>
+              </w:rPr>
+              <w:t>UPDATE conversas SET estado = 'recusou' WHERE telefone = {{telefone}}</w:t>
+            </w:r>
+          </w:p>
+          <w:p>
+            <w:pPr>
+              <w:spacing w:before="20" w:after="20"/>
+              <w:ind w:left="216"/>
+            </w:pPr>
+            <w:r>
+              <w:rPr>
+                <w:color w:val="1B3A20"/>
+                <w:sz w:val="20"/>
+              </w:rPr>
+            </w:r>
+          </w:p>
+          <w:p>
+            <w:pPr>
+              <w:spacing w:before="20" w:after="20"/>
+              <w:ind w:left="216"/>
+            </w:pPr>
+            <w:r>
+              <w:rPr>
+                <w:rFonts w:ascii="Consolas" w:hAnsi="Consolas"/>
+                <w:color w:val="1B5E20"/>
+                <w:sz w:val="18"/>
+              </w:rPr>
+              <w:t>// Isso bloqueia todos os follow-ups futuros até nova conversa ser iniciada.</w:t>
+            </w:r>
+          </w:p>
+          <w:p>
+            <w:pPr>
+              <w:spacing w:after="80"/>
+            </w:pPr>
+          </w:p>
+        </w:tc>
+      </w:tr>
+    </w:tbl>
+    <w:p/>
+    <w:p>
+      <w:pPr>
+        <w:spacing w:before="40" w:after="40"/>
+        <w:pBdr>
+          <w:bottom w:val="single" w:sz="4" w:space="1" w:color="CCCCCC"/>
+        </w:pBdr>
+      </w:pPr>
+    </w:p>
+    <w:tbl>
+      <w:tblPr>
+        <w:tblW w:type="auto" w:w="0"/>
+        <w:tblLook w:firstColumn="1" w:firstRow="1" w:lastColumn="0" w:lastRow="0" w:noHBand="0" w:noVBand="1" w:val="04A0"/>
+      </w:tblPr>
+      <w:tblGrid>
+        <w:gridCol w:w="9746"/>
+      </w:tblGrid>
+      <w:tr>
+        <w:tc>
+          <w:tcPr>
+            <w:tcW w:type="dxa" w:w="9746"/>
+            <w:shd w:val="clear" w:color="auto" w:fill="D6E4F7"/>
+          </w:tcPr>
+          <w:p>
+            <w:pPr>
+              <w:spacing w:before="100" w:after="100"/>
+              <w:ind w:left="173"/>
+            </w:pPr>
+            <w:r>
+              <w:rPr>
+                <w:b/>
+                <w:color w:val="1B3A6B"/>
+                <w:sz w:val="22"/>
+              </w:rPr>
+              <w:t xml:space="preserve">7.  </w:t>
+            </w:r>
+            <w:r>
+              <w:rPr>
+                <w:b/>
+                <w:color w:val="1B3A6B"/>
+                <w:sz w:val="22"/>
+              </w:rPr>
+              <w:t>Follow-up enviado após Clara NEGAR o serviço</w:t>
+            </w:r>
+          </w:p>
+        </w:tc>
+      </w:tr>
+    </w:tbl>
+    <w:p/>
+    <w:p>
+      <w:r>
+        <w:rPr>
+          <w:b/>
+          <w:color w:val="770000"/>
+          <w:sz w:val="20"/>
+        </w:rPr>
+        <w:t xml:space="preserve">EVIDÊNCIA  </w:t>
+      </w:r>
+      <w:r>
+        <w:rPr>
+          <w:sz w:val="20"/>
+        </w:rPr>
+        <w:t>Dayane — 10 e 11/06/2026</w:t>
+      </w:r>
+    </w:p>
+    <w:tbl>
+      <w:tblPr>
+        <w:tblW w:type="auto" w:w="0"/>
+        <w:tblLook w:firstColumn="1" w:firstRow="1" w:lastColumn="0" w:lastRow="0" w:noHBand="0" w:noVBand="1" w:val="04A0"/>
+      </w:tblPr>
+      <w:tblGrid>
+        <w:gridCol w:w="9746"/>
+      </w:tblGrid>
+      <w:tr>
+        <w:tc>
+          <w:tcPr>
+            <w:tcW w:type="dxa" w:w="9746"/>
+            <w:shd w:val="clear" w:color="auto" w:fill="F0F0F0"/>
+            <w:tcBorders>
+              <w:top w:val="single" w:sz="6" w:space="0" w:color="BBBBBB"/>
+              <w:bottom w:val="single" w:sz="6" w:space="0" w:color="BBBBBB"/>
+              <w:left w:val="single" w:sz="6" w:space="0" w:color="BBBBBB"/>
+              <w:right w:val="single" w:sz="6" w:space="0" w:color="BBBBBB"/>
+            </w:tcBorders>
+          </w:tcPr>
+          <w:p>
+            <w:pPr>
+              <w:spacing w:before="20" w:after="20"/>
+              <w:ind w:left="144"/>
+            </w:pPr>
+            <w:r>
+              <w:rPr>
+                <w:rFonts w:ascii="Consolas" w:hAnsi="Consolas"/>
+                <w:color w:val="333333"/>
+                <w:sz w:val="19"/>
+              </w:rPr>
+              <w:t>13:53 10/06  Paciente:  "Qual o valor do ASO?"</w:t>
+            </w:r>
+          </w:p>
+          <w:p>
+            <w:pPr>
+              <w:spacing w:before="20" w:after="20"/>
+              <w:ind w:left="144"/>
+            </w:pPr>
+            <w:r>
+              <w:rPr>
+                <w:rFonts w:ascii="Consolas" w:hAnsi="Consolas"/>
+                <w:color w:val="1A6B1A"/>
+                <w:sz w:val="19"/>
+              </w:rPr>
+              <w:t>13:53 10/06  Clara:     "O ASO é feito em clínicas presenciais, não aqui na REMMED."  ✅</w:t>
+            </w:r>
+          </w:p>
+          <w:p>
+            <w:pPr>
+              <w:spacing w:before="20" w:after="20"/>
+              <w:ind w:left="144"/>
+            </w:pPr>
+            <w:r>
+              <w:rPr>
+                <w:rFonts w:ascii="Consolas" w:hAnsi="Consolas"/>
+                <w:color w:val="B00000"/>
+                <w:sz w:val="19"/>
+              </w:rPr>
+              <w:t>14:11 10/06  Clara:     "Posso te ajudar com informações sobre clínicas de medicina do trabalho?"  ❌</w:t>
+            </w:r>
+          </w:p>
+          <w:p>
+            <w:pPr>
+              <w:spacing w:before="20" w:after="20"/>
+              <w:ind w:left="144"/>
+            </w:pPr>
+            <w:r>
+              <w:rPr>
+                <w:rFonts w:ascii="Consolas" w:hAnsi="Consolas"/>
+                <w:color w:val="B00000"/>
+                <w:sz w:val="19"/>
+              </w:rPr>
+              <w:t>15:01 10/06  Clara:     "Posso ajudar com indicações de clínicas em sua região?"  ❌❌</w:t>
+            </w:r>
+          </w:p>
+          <w:p>
+            <w:pPr>
+              <w:spacing w:before="20" w:after="20"/>
+              <w:ind w:left="144"/>
+            </w:pPr>
+            <w:r>
+              <w:rPr>
+                <w:rFonts w:ascii="Consolas" w:hAnsi="Consolas"/>
+                <w:color w:val="B00000"/>
+                <w:sz w:val="19"/>
+              </w:rPr>
+              <w:t>14:01 11/06  Clara:     "Clínicas na sua região têm oferecido promoções especiais..."  ❌❌❌</w:t>
+            </w:r>
+          </w:p>
+        </w:tc>
+      </w:tr>
+    </w:tbl>
+    <w:p/>
+    <w:p>
+      <w:r>
+        <w:rPr>
+          <w:b/>
+          <w:color w:val="C00000"/>
+          <w:sz w:val="20"/>
+        </w:rPr>
+        <w:t xml:space="preserve">DOIS PROBLEMAS NESTE CASO:  </w:t>
+      </w:r>
+      <w:r>
+        <w:rPr>
+          <w:sz w:val="20"/>
+        </w:rPr>
       </w:r>
     </w:p>
     <w:p>
       <w:r>
-        <w:t>"Não realizamos atestado retroativo. O atestado é emitido apenas a partir da data da consulta."</w:t>
+        <w:rPr>
+          <w:sz w:val="20"/>
+        </w:rPr>
+        <w:t>(a)  Follow-up enviado após atendimento já encerrado — Clara negou o serviço e acabou ali.</w:t>
         <w:br/>
-        <w:t>→ Perguntar se deseja continuar para consulta de hoje ou encerrar.</w:t>
+        <w:t>(b)  Follow-up ofereceu "indicar clínicas na região" — Clara NÃO consegue fazer isso.</w:t>
       </w:r>
     </w:p>
     <w:p/>
@@ -173,1189 +2840,240 @@
       <w:r>
         <w:rPr>
           <w:b/>
+          <w:color w:val="C00000"/>
+          <w:sz w:val="20"/>
         </w:rPr>
-        <w:t>FRASES PROIBIDAS (nunca usar):</w:t>
+        <w:t xml:space="preserve">REGRA:  </w:t>
       </w:r>
-    </w:p>
-    <w:p>
       <w:r>
         <w:rPr>
-          <w:b/>
-          <w:color w:val="C00000"/>
+          <w:sz w:val="20"/>
         </w:rPr>
-        <w:t>"não conseguimos garantir atestado retroativo" / "se o médico considerar adequado" / "talvez o médico possa"</w:t>
+        <w:t>Quando Clara NEGA um serviço, NÃO deve haver nenhum follow-up.</w:t>
       </w:r>
     </w:p>
     <w:p/>
-    <w:p>
-      <w:r>
-        <w:rPr>
-          <w:b/>
-          <w:color w:val="1A6B1A"/>
-        </w:rPr>
-        <w:t>✅ SOLUÇÃO — No prompt — Regra de atestado retroativo</w:t>
-      </w:r>
-    </w:p>
-    <w:p>
-      <w:pPr>
-        <w:ind w:left="432"/>
-      </w:pPr>
-      <w:r>
-        <w:t>Localizar no prompt a seção V4/V5 (Atestado) e adicionar ANTES das respostas sobre atestado:</w:t>
-      </w:r>
-    </w:p>
-    <w:p>
-      <w:pPr>
-        <w:ind w:left="432"/>
-      </w:pPr>
-    </w:p>
-    <w:p>
-      <w:pPr>
-        <w:ind w:left="432"/>
-      </w:pPr>
-      <w:r>
-        <w:t xml:space="preserve">   ⚠️ REGRA INVIOLÁVEL — ATESTADO RETROATIVO:</w:t>
-      </w:r>
-    </w:p>
-    <w:p>
-      <w:pPr>
-        <w:ind w:left="432"/>
-      </w:pPr>
-      <w:r>
-        <w:t xml:space="preserve">   Se o paciente pedir atestado de dias anteriores ("de ontem", "da semana passada",</w:t>
-      </w:r>
-    </w:p>
-    <w:p>
-      <w:pPr>
-        <w:ind w:left="432"/>
-      </w:pPr>
-      <w:r>
-        <w:t xml:space="preserve">   "retroativo"), responda EXATAMENTE:</w:t>
-      </w:r>
-    </w:p>
-    <w:p>
-      <w:pPr>
-        <w:ind w:left="432"/>
-      </w:pPr>
-      <w:r>
-        <w:t xml:space="preserve">   "Não realizamos atestado retroativo. O atestado é emitido apenas a partir da data</w:t>
-      </w:r>
-    </w:p>
-    <w:p>
-      <w:pPr>
-        <w:ind w:left="432"/>
-      </w:pPr>
-      <w:r>
-        <w:t xml:space="preserve">   da consulta. Posso te ajudar a marcar uma consulta para hoje?"</w:t>
-      </w:r>
-    </w:p>
-    <w:p>
-      <w:pPr>
-        <w:ind w:left="432"/>
-      </w:pPr>
-    </w:p>
-    <w:p>
-      <w:pPr>
-        <w:ind w:left="432"/>
-      </w:pPr>
-      <w:r>
-        <w:t xml:space="preserve">   PROIBIDO usar as frases: "não conseguimos garantir", "o médico pode avaliar se é</w:t>
-      </w:r>
-    </w:p>
-    <w:p>
-      <w:pPr>
-        <w:ind w:left="432"/>
-      </w:pPr>
-      <w:r>
-        <w:t xml:space="preserve">   possível", "talvez o médico possa". Não existe exceção.</w:t>
-      </w:r>
-    </w:p>
+    <w:tbl>
+      <w:tblPr>
+        <w:tblW w:type="auto" w:w="0"/>
+        <w:tblLook w:firstColumn="1" w:firstRow="1" w:lastColumn="0" w:lastRow="0" w:noHBand="0" w:noVBand="1" w:val="04A0"/>
+      </w:tblPr>
+      <w:tblGrid>
+        <w:gridCol w:w="9746"/>
+      </w:tblGrid>
+      <w:tr>
+        <w:tc>
+          <w:tcPr>
+            <w:tcW w:type="dxa" w:w="9746"/>
+            <w:shd w:val="clear" w:color="auto" w:fill="EAF4EA"/>
+            <w:tcBorders>
+              <w:top w:val="single" w:sz="8" w:space="0" w:color="2E7D32"/>
+              <w:bottom w:val="single" w:sz="8" w:space="0" w:color="2E7D32"/>
+              <w:left w:val="single" w:sz="8" w:space="0" w:color="2E7D32"/>
+              <w:right w:val="single" w:sz="8" w:space="0" w:color="2E7D32"/>
+            </w:tcBorders>
+          </w:tcPr>
+          <w:p>
+            <w:pPr>
+              <w:spacing w:before="100"/>
+              <w:ind w:left="173"/>
+            </w:pPr>
+            <w:r>
+              <w:rPr>
+                <w:b/>
+                <w:color w:val="1B5E20"/>
+                <w:sz w:val="20"/>
+              </w:rPr>
+              <w:t>⚙  AÇÃO TÉCNICA — n8n — Workflow de follow-up + Prompt</w:t>
+            </w:r>
+          </w:p>
+          <w:p>
+            <w:pPr>
+              <w:spacing w:before="20" w:after="20"/>
+              <w:ind w:left="216"/>
+            </w:pPr>
+            <w:r>
+              <w:rPr>
+                <w:color w:val="1B3A20"/>
+                <w:sz w:val="20"/>
+              </w:rPr>
+              <w:t>PARTE A — No workflow (n8n):</w:t>
+            </w:r>
+          </w:p>
+          <w:p>
+            <w:pPr>
+              <w:spacing w:before="20" w:after="20"/>
+              <w:ind w:left="216"/>
+            </w:pPr>
+            <w:r>
+              <w:rPr>
+                <w:color w:val="1B3A20"/>
+                <w:sz w:val="20"/>
+              </w:rPr>
+              <w:t xml:space="preserve">  Incluir "servico_negado" no conjunto de estados que bloqueiam follow-up.</w:t>
+            </w:r>
+          </w:p>
+          <w:p>
+            <w:pPr>
+              <w:spacing w:before="20" w:after="20"/>
+              <w:ind w:left="216"/>
+            </w:pPr>
+            <w:r>
+              <w:rPr>
+                <w:color w:val="1B3A20"/>
+                <w:sz w:val="20"/>
+              </w:rPr>
+              <w:t xml:space="preserve">  Quando Clara encerrar por recusa de serviço, gravar:</w:t>
+            </w:r>
+          </w:p>
+          <w:p>
+            <w:pPr>
+              <w:spacing w:before="20" w:after="20"/>
+              <w:ind w:left="216"/>
+            </w:pPr>
+            <w:r>
+              <w:rPr>
+                <w:rFonts w:ascii="Consolas" w:hAnsi="Consolas"/>
+                <w:color w:val="1B5E20"/>
+                <w:sz w:val="18"/>
+              </w:rPr>
+              <w:t xml:space="preserve">  UPDATE conversas SET estado = 'servico_negado' WHERE telefone = {{telefone}}</w:t>
+            </w:r>
+          </w:p>
+          <w:p>
+            <w:pPr>
+              <w:spacing w:before="20" w:after="20"/>
+              <w:ind w:left="216"/>
+            </w:pPr>
+            <w:r>
+              <w:rPr>
+                <w:color w:val="1B3A20"/>
+                <w:sz w:val="20"/>
+              </w:rPr>
+            </w:r>
+          </w:p>
+          <w:p>
+            <w:pPr>
+              <w:spacing w:before="20" w:after="20"/>
+              <w:ind w:left="216"/>
+            </w:pPr>
+            <w:r>
+              <w:rPr>
+                <w:color w:val="1B3A20"/>
+                <w:sz w:val="20"/>
+              </w:rPr>
+              <w:t>PARTE B — No prompt:</w:t>
+            </w:r>
+          </w:p>
+          <w:p>
+            <w:pPr>
+              <w:spacing w:before="20" w:after="20"/>
+              <w:ind w:left="216"/>
+            </w:pPr>
+            <w:r>
+              <w:rPr>
+                <w:color w:val="1B3A20"/>
+                <w:sz w:val="20"/>
+              </w:rPr>
+              <w:t xml:space="preserve">  Após qualquer recusa (ASO, acompanhante, emergência, serviço fora do escopo):</w:t>
+            </w:r>
+          </w:p>
+          <w:p>
+            <w:pPr>
+              <w:spacing w:before="20" w:after="20"/>
+              <w:ind w:left="216"/>
+            </w:pPr>
+            <w:r>
+              <w:rPr>
+                <w:color w:val="1B3A20"/>
+                <w:sz w:val="20"/>
+              </w:rPr>
+              <w:t xml:space="preserve">  "Encerrar com gentileza. NÃO oferecer indicações locais, preços de</w:t>
+            </w:r>
+          </w:p>
+          <w:p>
+            <w:pPr>
+              <w:spacing w:before="20" w:after="20"/>
+              <w:ind w:left="216"/>
+            </w:pPr>
+            <w:r>
+              <w:rPr>
+                <w:color w:val="1B3A20"/>
+                <w:sz w:val="20"/>
+              </w:rPr>
+              <w:t xml:space="preserve">   outras clínicas, promoções de terceiros ou serviços que a REMMED</w:t>
+            </w:r>
+          </w:p>
+          <w:p>
+            <w:pPr>
+              <w:spacing w:before="20" w:after="20"/>
+              <w:ind w:left="216"/>
+            </w:pPr>
+            <w:r>
+              <w:rPr>
+                <w:color w:val="1B3A20"/>
+                <w:sz w:val="20"/>
+              </w:rPr>
+              <w:t xml:space="preserve">   Telemedicina não oferece."</w:t>
+            </w:r>
+          </w:p>
+          <w:p>
+            <w:pPr>
+              <w:spacing w:after="80"/>
+            </w:pPr>
+          </w:p>
+        </w:tc>
+      </w:tr>
+    </w:tbl>
     <w:p/>
     <w:p>
       <w:r>
         <w:br w:type="page"/>
       </w:r>
     </w:p>
-    <w:p>
-      <w:pPr>
-        <w:pStyle w:val="Heading2"/>
-      </w:pPr>
-      <w:r>
-        <w:rPr>
-          <w:color w:val="C00000"/>
-        </w:rPr>
-        <w:t>2. V7 — Múltiplas queixas: Clara escolheu sem perguntar</w:t>
-      </w:r>
-    </w:p>
-    <w:p>
-      <w:r>
-        <w:rPr>
-          <w:b/>
-        </w:rPr>
-        <w:t>EVIDÊNCIA — Conversa teste (11/06 ~12:23):</w:t>
-      </w:r>
-    </w:p>
-    <w:p/>
-    <w:p>
-      <w:pPr>
-        <w:ind w:left="432"/>
-      </w:pPr>
-      <w:r>
-        <w:rPr>
-          <w:color w:val="404040"/>
-          <w:sz w:val="20"/>
-        </w:rPr>
-        <w:t>Paciente: "Tenho tosse, febre, estou com dor de cabeça, dor no joelho, também estou com gripe, e também estou cansada"</w:t>
-      </w:r>
-    </w:p>
-    <w:p>
-      <w:pPr>
-        <w:ind w:left="432"/>
-      </w:pPr>
-      <w:r>
-        <w:rPr>
-          <w:color w:val="0070C0"/>
-          <w:sz w:val="20"/>
-        </w:rPr>
-        <w:t>→ Clara ignorou joelho e cansaço, foi direto para checklist respiratório.</w:t>
-      </w:r>
-    </w:p>
+    <w:tbl>
+      <w:tblPr>
+        <w:tblW w:type="auto" w:w="0"/>
+        <w:tblLook w:firstColumn="1" w:firstRow="1" w:lastColumn="0" w:lastRow="0" w:noHBand="0" w:noVBand="1" w:val="04A0"/>
+      </w:tblPr>
+      <w:tblGrid>
+        <w:gridCol w:w="9746"/>
+      </w:tblGrid>
+      <w:tr>
+        <w:tc>
+          <w:tcPr>
+            <w:tcW w:type="dxa" w:w="9746"/>
+            <w:shd w:val="clear" w:color="auto" w:fill="D6E4F7"/>
+          </w:tcPr>
+          <w:p>
+            <w:pPr>
+              <w:spacing w:before="100" w:after="100"/>
+              <w:ind w:left="173"/>
+            </w:pPr>
+            <w:r>
+              <w:rPr>
+                <w:b/>
+                <w:color w:val="1B3A6B"/>
+                <w:sz w:val="22"/>
+              </w:rPr>
+              <w:t xml:space="preserve">8.  </w:t>
+            </w:r>
+            <w:r>
+              <w:rPr>
+                <w:b/>
+                <w:color w:val="1B3A6B"/>
+                <w:sz w:val="22"/>
+              </w:rPr>
+              <w:t>Regra geral de follow-up — definição completa</w:t>
+            </w:r>
+          </w:p>
+        </w:tc>
+      </w:tr>
+    </w:tbl>
     <w:p/>
     <w:p>
       <w:r>
-        <w:rPr>
-          <w:b/>
-        </w:rPr>
-        <w:t>COMPORTAMENTO CORRETO:</w:t>
-      </w:r>
-    </w:p>
-    <w:p>
-      <w:r>
-        <w:t>Quando 3 ou mais queixas não relacionadas são listadas, Clara deve perguntar:</w:t>
-        <w:br/>
-        <w:t>"Qual é o seu principal sintoma agora para eu verificar se consigo te atender por aqui?"</w:t>
-        <w:br/>
-        <w:t>Só depois de receber a resposta, escolher o grupo de triagem.</w:t>
-      </w:r>
-    </w:p>
-    <w:p/>
-    <w:p>
-      <w:r>
-        <w:rPr>
-          <w:b/>
-          <w:color w:val="1A6B1A"/>
-        </w:rPr>
-        <w:t>✅ SOLUÇÃO — No prompt — Reintroduzir verificação V7</w:t>
-      </w:r>
-    </w:p>
-    <w:p>
-      <w:pPr>
-        <w:ind w:left="432"/>
-      </w:pPr>
-      <w:r>
-        <w:t>Adicionar no início da seção de identificação de sintomas (antes do mapeamento de grupos):</w:t>
-      </w:r>
-    </w:p>
-    <w:p>
-      <w:pPr>
-        <w:ind w:left="432"/>
-      </w:pPr>
-    </w:p>
-    <w:p>
-      <w:pPr>
-        <w:ind w:left="432"/>
-      </w:pPr>
-      <w:r>
-        <w:t xml:space="preserve">   ✅ V7 — MÚLTIPLAS QUEIXAS:</w:t>
-      </w:r>
-    </w:p>
-    <w:p>
-      <w:pPr>
-        <w:ind w:left="432"/>
-      </w:pPr>
-      <w:r>
-        <w:t xml:space="preserve">   Se o paciente listar 3 ou mais sintomas/queixas diferentes e não relacionados entre si,</w:t>
-      </w:r>
-    </w:p>
-    <w:p>
-      <w:pPr>
-        <w:ind w:left="432"/>
-      </w:pPr>
-      <w:r>
-        <w:t xml:space="preserve">   NÃO escolha o grupo de triagem ainda. Pergunte primeiro:</w:t>
-      </w:r>
-    </w:p>
-    <w:p>
-      <w:pPr>
-        <w:ind w:left="432"/>
-      </w:pPr>
-      <w:r>
-        <w:t xml:space="preserve">   "Qual é o seu principal sintoma agora para eu verificar se consigo te atender por aqui?"</w:t>
-      </w:r>
-    </w:p>
-    <w:p>
-      <w:pPr>
-        <w:ind w:left="432"/>
-      </w:pPr>
-      <w:r>
-        <w:t xml:space="preserve">   Aguarde a resposta e só então siga para o grupo correto.</w:t>
-      </w:r>
-    </w:p>
-    <w:p>
-      <w:pPr>
-        <w:ind w:left="432"/>
-      </w:pPr>
-    </w:p>
-    <w:p>
-      <w:pPr>
-        <w:ind w:left="432"/>
-      </w:pPr>
-      <w:r>
-        <w:t xml:space="preserve">   EXEMPLOS que ativam V7:</w:t>
-      </w:r>
-    </w:p>
-    <w:p>
-      <w:pPr>
-        <w:ind w:left="432"/>
-      </w:pPr>
-      <w:r>
-        <w:t xml:space="preserve">   • "tosse, febre, dor no joelho, cansaço, dor de cabeça"</w:t>
-      </w:r>
-    </w:p>
-    <w:p>
-      <w:pPr>
-        <w:ind w:left="432"/>
-      </w:pPr>
-      <w:r>
-        <w:t xml:space="preserve">   • "dor de barriga, ansiedade e manchas na pele"</w:t>
-      </w:r>
-    </w:p>
-    <w:p>
-      <w:pPr>
-        <w:ind w:left="432"/>
-      </w:pPr>
-      <w:r>
-        <w:t xml:space="preserve">   • "gripe, dor nas costas e insônia"</w:t>
-      </w:r>
-    </w:p>
-    <w:p/>
-    <w:p/>
-    <w:p>
-      <w:pPr>
-        <w:pStyle w:val="Heading2"/>
-      </w:pPr>
-      <w:r>
-        <w:rPr>
-          <w:color w:val="C00000"/>
-        </w:rPr>
-        <w:t>3. V9 — Atestado de acompanhante: comportamento inconsistente</w:t>
-      </w:r>
-    </w:p>
-    <w:p>
-      <w:r>
-        <w:t>Nos testes de 11/06 o comportamento foi intermitente: às vezes recusou corretamente, às vezes tratou como consulta normal.</w:t>
-        <w:br/>
-        <w:t>Caso real documentado: Raissa (11/06) — Clara encaminhou para consulta em vez de recusar.</w:t>
-      </w:r>
-    </w:p>
-    <w:p/>
-    <w:p>
-      <w:r>
-        <w:rPr>
-          <w:b/>
-        </w:rPr>
-        <w:t>COMPORTAMENTO ESPERADO:</w:t>
-      </w:r>
-    </w:p>
-    <w:p>
-      <w:r>
-        <w:t>Qualquer menção a "atestado de acompanhante", "fui acompanhar familiar", "precisei ficar com filho/mãe no hospital" → recusa imediata + encerramento.</w:t>
-      </w:r>
-    </w:p>
-    <w:p/>
-    <w:p>
-      <w:r>
-        <w:rPr>
-          <w:b/>
-        </w:rPr>
-        <w:t>TEXTO A USAR:</w:t>
-      </w:r>
-    </w:p>
-    <w:p>
-      <w:r>
-        <w:t>"Infelizmente não emitimos atestado de acompanhante. Esse documento deve ser solicitado diretamente na unidade onde o familiar foi atendido."</w:t>
-      </w:r>
-    </w:p>
-    <w:p/>
-    <w:p>
-      <w:r>
-        <w:rPr>
-          <w:b/>
-          <w:color w:val="1A6B1A"/>
-        </w:rPr>
-        <w:t>✅ SOLUÇÃO — No prompt — Reintroduzir verificação V9</w:t>
-      </w:r>
-    </w:p>
-    <w:p>
-      <w:pPr>
-        <w:ind w:left="432"/>
-      </w:pPr>
-      <w:r>
-        <w:t>Adicionar como uma das primeiras verificações, ANTES de qualquer pergunta de triagem:</w:t>
-      </w:r>
-    </w:p>
-    <w:p>
-      <w:pPr>
-        <w:ind w:left="432"/>
-      </w:pPr>
-    </w:p>
-    <w:p>
-      <w:pPr>
-        <w:ind w:left="432"/>
-      </w:pPr>
-      <w:r>
-        <w:t xml:space="preserve">   ✅ V9 — ATESTADO DE ACOMPANHANTE:</w:t>
-      </w:r>
-    </w:p>
-    <w:p>
-      <w:pPr>
-        <w:ind w:left="432"/>
-      </w:pPr>
-      <w:r>
-        <w:t xml:space="preserve">   Se o paciente mencionar qualquer variação de:</w:t>
-      </w:r>
-    </w:p>
-    <w:p>
-      <w:pPr>
-        <w:ind w:left="432"/>
-      </w:pPr>
-      <w:r>
-        <w:t xml:space="preserve">   "atestado de acompanhante" / "fui acompanhar [familiar]" / "precisei ficar com meu</w:t>
-      </w:r>
-    </w:p>
-    <w:p>
-      <w:pPr>
-        <w:ind w:left="432"/>
-      </w:pPr>
-      <w:r>
-        <w:t xml:space="preserve">   [filho/mãe/pai/parente] no hospital ou médico" / "acompanhei alguém":</w:t>
-      </w:r>
-    </w:p>
-    <w:p>
-      <w:pPr>
-        <w:ind w:left="432"/>
-      </w:pPr>
-    </w:p>
-    <w:p>
-      <w:pPr>
-        <w:ind w:left="432"/>
-      </w:pPr>
-      <w:r>
-        <w:t xml:space="preserve">   → Responda IMEDIATAMENTE: "Infelizmente não emitimos atestado de acompanhante.</w:t>
-      </w:r>
-    </w:p>
-    <w:p>
-      <w:pPr>
-        <w:ind w:left="432"/>
-      </w:pPr>
-      <w:r>
-        <w:t xml:space="preserve">     Esse documento deve ser solicitado diretamente na unidade onde o familiar foi atendido."</w:t>
-      </w:r>
-    </w:p>
-    <w:p>
-      <w:pPr>
-        <w:ind w:left="432"/>
-      </w:pPr>
-      <w:r>
-        <w:t xml:space="preserve">   → ENCERRAR o atendimento. Não continuar a triagem.</w:t>
-      </w:r>
-    </w:p>
-    <w:p>
-      <w:pPr>
-        <w:ind w:left="432"/>
-      </w:pPr>
-    </w:p>
-    <w:p>
-      <w:pPr>
-        <w:ind w:left="432"/>
-      </w:pPr>
-      <w:r>
-        <w:t xml:space="preserve">   IMPORTANTE: Esta verificação deve ser consistente — não pode falhar intermitentemente.</w:t>
-      </w:r>
-    </w:p>
-    <w:p>
-      <w:pPr>
-        <w:ind w:left="432"/>
-      </w:pPr>
-      <w:r>
-        <w:t xml:space="preserve">   Revisar similaridade semântica para garantir cobertura de todas as variações.</w:t>
-      </w:r>
-    </w:p>
-    <w:p/>
-    <w:p>
-      <w:r>
-        <w:br w:type="page"/>
-      </w:r>
-    </w:p>
-    <w:p>
-      <w:pPr>
-        <w:pStyle w:val="Heading2"/>
-      </w:pPr>
-      <w:r>
-        <w:rPr>
-          <w:color w:val="C00000"/>
-        </w:rPr>
-        <w:t>4. V6 — Emagrecimento: passo extra desnecessário</w:t>
-      </w:r>
-    </w:p>
-    <w:p>
-      <w:r>
-        <w:t>Clara redirecionou corretamente para Consulta de Controle de Peso R$249 ✅, mas inseriu pergunta extra desnecessária: "além do peso, você está com algum sintoma físico agora?"</w:t>
-      </w:r>
-    </w:p>
-    <w:p/>
-    <w:p>
-      <w:r>
-        <w:rPr>
-          <w:b/>
-        </w:rPr>
-        <w:t>COMPORTAMENTO ESPERADO:</w:t>
-      </w:r>
-    </w:p>
-    <w:p>
-      <w:r>
-        <w:t>Ao identificar emagrecimento/obesidade/peso como queixa principal, Clara deve ir direto para:</w:t>
-        <w:br/>
-        <w:t>"Temos a Consulta de Controle de Peso com médica especializada. Valor: R$249. Posso te ajudar a agendar?"</w:t>
-      </w:r>
-    </w:p>
-    <w:p/>
-    <w:p>
-      <w:r>
-        <w:rPr>
-          <w:b/>
-          <w:color w:val="1A6B1A"/>
-        </w:rPr>
-        <w:t>✅ SOLUÇÃO — No prompt — Reintroduzir verificação V6 sem desvio</w:t>
-      </w:r>
-    </w:p>
-    <w:p>
-      <w:pPr>
-        <w:ind w:left="432"/>
-      </w:pPr>
-      <w:r>
-        <w:t>Na seção de identificação de queixa (opções 1 ou 2), adicionar ANTES dos grupos de sintomas:</w:t>
-      </w:r>
-    </w:p>
-    <w:p>
-      <w:pPr>
-        <w:ind w:left="432"/>
-      </w:pPr>
-    </w:p>
-    <w:p>
-      <w:pPr>
-        <w:ind w:left="432"/>
-      </w:pPr>
-      <w:r>
-        <w:t xml:space="preserve">   ✅ V6 — EMAGRECIMENTO / PESO:</w:t>
-      </w:r>
-    </w:p>
-    <w:p>
-      <w:pPr>
-        <w:ind w:left="432"/>
-      </w:pPr>
-      <w:r>
-        <w:t xml:space="preserve">   Se o paciente mencionar: "emagrecer", "perder peso", "obesidade", "sobrepeso",</w:t>
-      </w:r>
-    </w:p>
-    <w:p>
-      <w:pPr>
-        <w:ind w:left="432"/>
-      </w:pPr>
-      <w:r>
-        <w:t xml:space="preserve">   "controle de peso", "tratamento para peso", "quero emagrecer":</w:t>
-      </w:r>
-    </w:p>
-    <w:p>
-      <w:pPr>
-        <w:ind w:left="432"/>
-      </w:pPr>
-    </w:p>
-    <w:p>
-      <w:pPr>
-        <w:ind w:left="432"/>
-      </w:pPr>
-      <w:r>
-        <w:t xml:space="preserve">   → NÃO perguntar sobre outros sintomas físicos.</w:t>
-      </w:r>
-    </w:p>
-    <w:p>
-      <w:pPr>
-        <w:ind w:left="432"/>
-      </w:pPr>
-      <w:r>
-        <w:t xml:space="preserve">   → NÃO encaminhar para clínico geral (R$79).</w:t>
-      </w:r>
-    </w:p>
-    <w:p>
-      <w:pPr>
-        <w:ind w:left="432"/>
-      </w:pPr>
-      <w:r>
-        <w:t xml:space="preserve">   → Responder diretamente:</w:t>
-      </w:r>
-    </w:p>
-    <w:p>
-      <w:pPr>
-        <w:ind w:left="432"/>
-      </w:pPr>
-      <w:r>
-        <w:t xml:space="preserve">     "Temos a Consulta de Controle de Peso com médica especializada,</w:t>
-      </w:r>
-    </w:p>
-    <w:p>
-      <w:pPr>
-        <w:ind w:left="432"/>
-      </w:pPr>
-      <w:r>
-        <w:t xml:space="preserve">      voltada para avaliação e tratamento do peso. Valor: R$249.</w:t>
-      </w:r>
-    </w:p>
-    <w:p>
-      <w:pPr>
-        <w:ind w:left="432"/>
-      </w:pPr>
-      <w:r>
-        <w:t xml:space="preserve">      Posso te ajudar a agendar?"</w:t>
-      </w:r>
-    </w:p>
-    <w:p>
-      <w:pPr>
-        <w:ind w:left="432"/>
-      </w:pPr>
-    </w:p>
-    <w:p>
-      <w:pPr>
-        <w:ind w:left="432"/>
-      </w:pPr>
-      <w:r>
-        <w:t xml:space="preserve">   ATENÇÃO: Cada paciente encaminhado errado para clínico geral (R$79) representa</w:t>
-      </w:r>
-    </w:p>
-    <w:p>
-      <w:pPr>
-        <w:ind w:left="432"/>
-      </w:pPr>
-      <w:r>
-        <w:t xml:space="preserve">   perda de R$170 por consulta em relação ao serviço correto (R$249).</w:t>
-      </w:r>
-    </w:p>
-    <w:p/>
-    <w:p>
-      <w:r>
-        <w:br w:type="page"/>
-      </w:r>
-    </w:p>
-    <w:p>
-      <w:pPr>
-        <w:pStyle w:val="Heading1"/>
-      </w:pPr>
-      <w:r>
-        <w:rPr>
-          <w:color w:val="1F497D"/>
-        </w:rPr>
-        <w:t>PARTE 2 — PROBLEMAS DE FOLLOW-UP (WORKFLOW N8N)</w:t>
-      </w:r>
-    </w:p>
-    <w:p>
-      <w:r>
-        <w:t>Os itens abaixo são correções a serem feitas no workflow de follow-up no n8n, não no prompt.</w:t>
-      </w:r>
-    </w:p>
-    <w:p/>
-    <w:p>
-      <w:pPr>
-        <w:pStyle w:val="Heading2"/>
-      </w:pPr>
-      <w:r>
-        <w:rPr>
-          <w:color w:val="1F497D"/>
-        </w:rPr>
-        <w:t>5. [NOME DO CLIENTE] aparece como texto literal</w:t>
-      </w:r>
-    </w:p>
-    <w:p>
-      <w:r>
-        <w:rPr>
-          <w:b/>
-        </w:rPr>
-        <w:t>MENSAGEM ENVIADA:</w:t>
-      </w:r>
-    </w:p>
-    <w:p/>
-    <w:p>
-      <w:pPr>
-        <w:ind w:left="432"/>
-      </w:pPr>
-      <w:r>
-        <w:rPr>
-          <w:color w:val="404040"/>
-          <w:sz w:val="20"/>
-        </w:rPr>
-        <w:t>"Olá, [NOME DO CLIENTE]. Eu entendo que estar acima do peso pode ser frustrante e desafiador..."</w:t>
-      </w:r>
-    </w:p>
-    <w:p/>
-    <w:p>
-      <w:r>
-        <w:t>A variável de nome não foi substituída. O paciente recebeu o placeholder literal — extremamente prejudicial à imagem da clínica.</w:t>
-      </w:r>
-    </w:p>
-    <w:p/>
-    <w:p>
-      <w:r>
-        <w:rPr>
-          <w:b/>
-        </w:rPr>
-        <w:t>CORREÇÃO:</w:t>
-      </w:r>
-    </w:p>
-    <w:p>
-      <w:r>
-        <w:t>Garantir fallback quando nome não disponível. Se não houver nome, usar apenas "Olá!" ou "Oi!" sem variável.</w:t>
-      </w:r>
-    </w:p>
-    <w:p/>
-    <w:p>
-      <w:r>
-        <w:rPr>
-          <w:b/>
-          <w:color w:val="1A6B1A"/>
-        </w:rPr>
-        <w:t>✅ SOLUÇÃO — No n8n — Nó de template do follow-up</w:t>
-      </w:r>
-    </w:p>
-    <w:p>
-      <w:pPr>
-        <w:ind w:left="432"/>
-      </w:pPr>
-      <w:r>
-        <w:t>No nó que monta o texto do follow-up, adicionar verificação antes de usar o nome:</w:t>
-      </w:r>
-    </w:p>
-    <w:p>
-      <w:pPr>
-        <w:ind w:left="432"/>
-      </w:pPr>
-    </w:p>
-    <w:p>
-      <w:pPr>
-        <w:ind w:left="432"/>
-      </w:pPr>
-      <w:r>
-        <w:t xml:space="preserve">   • Se nome disponível: "Olá, {{nome}}! ..."</w:t>
-      </w:r>
-    </w:p>
-    <w:p>
-      <w:pPr>
-        <w:ind w:left="432"/>
-      </w:pPr>
-      <w:r>
-        <w:t xml:space="preserve">   • Se nome NÃO disponível ou vazio: "Olá! ..." (sem variável)</w:t>
-      </w:r>
-    </w:p>
-    <w:p>
-      <w:pPr>
-        <w:ind w:left="432"/>
-      </w:pPr>
-    </w:p>
-    <w:p>
-      <w:pPr>
-        <w:ind w:left="432"/>
-      </w:pPr>
-      <w:r>
-        <w:t xml:space="preserve">   Em JavaScript (nó Code):</w:t>
-      </w:r>
-    </w:p>
-    <w:p>
-      <w:pPr>
-        <w:ind w:left="432"/>
-      </w:pPr>
-      <w:r>
-        <w:t xml:space="preserve">   const nome = $json.nome || '';</w:t>
-      </w:r>
-    </w:p>
-    <w:p>
-      <w:pPr>
-        <w:ind w:left="432"/>
-      </w:pPr>
-      <w:r>
-        <w:t xml:space="preserve">   const saudacao = nome ? `Olá, ${nome}!` : 'Olá!';</w:t>
-      </w:r>
-    </w:p>
-    <w:p/>
-    <w:p/>
-    <w:p>
-      <w:pPr>
-        <w:pStyle w:val="Heading2"/>
-      </w:pPr>
-      <w:r>
-        <w:rPr>
-          <w:color w:val="1F497D"/>
-        </w:rPr>
-        <w:t>6. Follow-up enviado após paciente dizer NÃO explicitamente</w:t>
-      </w:r>
-    </w:p>
-    <w:p>
-      <w:r>
-        <w:rPr>
-          <w:b/>
-        </w:rPr>
-        <w:t>REGRA QUE DEVE EXISTIR:</w:t>
-      </w:r>
-    </w:p>
-    <w:p>
-      <w:r>
-        <w:t>Quando o paciente responde NÃO ou demonstra que não quer prosseguir, o sistema deve:</w:t>
-        <w:br/>
-        <w:t>1. Responder com mensagem de encerramento gentil ("Sem problemas! Sempre que precisar pode nos chamar 🧡")</w:t>
-        <w:br/>
-        <w:t>2. Cancelar TODOS os follow-ups agendados para aquele contato</w:t>
-        <w:br/>
-        <w:t>3. Não enviar mais nenhuma mensagem automática</w:t>
-      </w:r>
-    </w:p>
-    <w:p/>
-    <w:p>
-      <w:r>
-        <w:rPr>
-          <w:b/>
-        </w:rPr>
-        <w:t>CASO 1 — Leandro (11/06):</w:t>
-      </w:r>
-    </w:p>
-    <w:p/>
-    <w:p>
-      <w:pPr>
-        <w:ind w:left="432"/>
-      </w:pPr>
-      <w:r>
-        <w:rPr>
-          <w:color w:val="404040"/>
-          <w:sz w:val="20"/>
-        </w:rPr>
-        <w:t>07:51 — Paciente: NÃO (não quer marcar)</w:t>
-      </w:r>
-    </w:p>
-    <w:p>
-      <w:pPr>
-        <w:ind w:left="432"/>
-      </w:pPr>
-      <w:r>
-        <w:rPr>
-          <w:color w:val="1A6B1A"/>
-          <w:sz w:val="20"/>
-        </w:rPr>
-        <w:t>07:51 — Clara: "Sem problemas! Sempre que precisar pode nos chamar. 🧡" ✅</w:t>
-      </w:r>
-    </w:p>
-    <w:p>
-      <w:pPr>
-        <w:ind w:left="432"/>
-      </w:pPr>
-      <w:r>
-        <w:rPr>
-          <w:color w:val="C00000"/>
-          <w:sz w:val="20"/>
-        </w:rPr>
-        <w:t>09:01 — Clara envia novo follow-up sobre atestado ❌ — completamente ignorou o NÃO anterior</w:t>
-      </w:r>
-    </w:p>
-    <w:p/>
-    <w:p>
-      <w:r>
-        <w:rPr>
-          <w:b/>
-        </w:rPr>
-        <w:t>CASO 2 — Danielle (09–10/06):</w:t>
-      </w:r>
-    </w:p>
-    <w:p/>
-    <w:p>
-      <w:pPr>
-        <w:ind w:left="432"/>
-      </w:pPr>
-      <w:r>
-        <w:rPr>
-          <w:color w:val="404040"/>
-          <w:sz w:val="20"/>
-        </w:rPr>
-        <w:t>08:57 09/06 — Paciente: "Não" (ao continuar)</w:t>
-      </w:r>
-    </w:p>
-    <w:p>
-      <w:pPr>
-        <w:ind w:left="432"/>
-      </w:pPr>
-      <w:r>
-        <w:rPr>
-          <w:color w:val="1A6B1A"/>
-          <w:sz w:val="20"/>
-        </w:rPr>
-        <w:t>08:58 09/06 — Clara: "Sem problemas! Sempre que precisar pode nos chamar. 🧡" ✅</w:t>
-      </w:r>
-    </w:p>
-    <w:p>
-      <w:pPr>
-        <w:ind w:left="432"/>
-      </w:pPr>
-      <w:r>
-        <w:rPr>
-          <w:color w:val="C00000"/>
-          <w:sz w:val="20"/>
-        </w:rPr>
-        <w:t>09:11 09/06 — Clara envia follow-up ❌</w:t>
-      </w:r>
-    </w:p>
-    <w:p>
-      <w:pPr>
-        <w:ind w:left="432"/>
-      </w:pPr>
-      <w:r>
-        <w:rPr>
-          <w:color w:val="C00000"/>
-          <w:sz w:val="20"/>
-        </w:rPr>
-        <w:t>10:01 09/06 — Clara envia segundo follow-up ❌</w:t>
-      </w:r>
-    </w:p>
-    <w:p>
-      <w:pPr>
-        <w:ind w:left="432"/>
-      </w:pPr>
-      <w:r>
-        <w:rPr>
-          <w:color w:val="C00000"/>
-          <w:sz w:val="20"/>
-        </w:rPr>
-        <w:t>09:01 10/06 — Clara envia terceiro follow-up (no dia seguinte!) ❌</w:t>
-      </w:r>
-    </w:p>
-    <w:p>
-      <w:pPr>
-        <w:ind w:left="432"/>
-      </w:pPr>
-      <w:r>
-        <w:rPr>
-          <w:color w:val="404040"/>
-          <w:sz w:val="20"/>
-        </w:rPr>
-        <w:t>Total: 3 follow-ups depois do NÃO explícito, em 2 dias diferentes.</w:t>
-      </w:r>
-    </w:p>
-    <w:p/>
-    <w:p/>
-    <w:p>
-      <w:r>
-        <w:rPr>
-          <w:b/>
-          <w:color w:val="1A6B1A"/>
-        </w:rPr>
-        <w:t>✅ SOLUÇÃO — No n8n — Workflow de follow-up</w:t>
-      </w:r>
-    </w:p>
-    <w:p>
-      <w:pPr>
-        <w:ind w:left="432"/>
-      </w:pPr>
-      <w:r>
-        <w:t>Adicionar condição no início do workflow de follow-up:</w:t>
-      </w:r>
-    </w:p>
-    <w:p>
-      <w:pPr>
-        <w:ind w:left="432"/>
-      </w:pPr>
-    </w:p>
-    <w:p>
-      <w:pPr>
-        <w:ind w:left="432"/>
-      </w:pPr>
-      <w:r>
-        <w:t xml:space="preserve">   • Consultar o estado da última conversa do contato no Supabase</w:t>
-      </w:r>
-    </w:p>
-    <w:p>
-      <w:pPr>
-        <w:ind w:left="432"/>
-      </w:pPr>
-      <w:r>
-        <w:t xml:space="preserve">   • Se ultimo_estado = "recusou" / "nao_quer_prosseguir" / "encerrado_pelo_paciente":</w:t>
-      </w:r>
-    </w:p>
-    <w:p>
-      <w:pPr>
-        <w:ind w:left="432"/>
-      </w:pPr>
-      <w:r>
-        <w:t xml:space="preserve">     → CANCELAR o follow-up. Não enviar nada.</w:t>
-      </w:r>
-    </w:p>
-    <w:p>
-      <w:pPr>
-        <w:ind w:left="432"/>
-      </w:pPr>
-    </w:p>
-    <w:p>
-      <w:pPr>
-        <w:ind w:left="432"/>
-      </w:pPr>
-      <w:r>
-        <w:t xml:space="preserve">   Quando o paciente responder NÃO em qualquer etapa:</w:t>
-      </w:r>
-    </w:p>
-    <w:p>
-      <w:pPr>
-        <w:ind w:left="432"/>
-      </w:pPr>
-      <w:r>
-        <w:t xml:space="preserve">   → Gravar no Supabase: UPDATE conversas SET estado = 'recusou' WHERE telefone = ...</w:t>
-      </w:r>
-    </w:p>
-    <w:p>
-      <w:pPr>
-        <w:ind w:left="432"/>
-      </w:pPr>
-      <w:r>
-        <w:t xml:space="preserve">   → Isso bloqueia automaticamente todos os follow-ups futuros para aquele contato</w:t>
-      </w:r>
-    </w:p>
-    <w:p>
-      <w:pPr>
-        <w:ind w:left="432"/>
-      </w:pPr>
-      <w:r>
-        <w:t xml:space="preserve">      até ele iniciar nova conversa.</w:t>
-      </w:r>
-    </w:p>
-    <w:p/>
-    <w:p/>
-    <w:p>
-      <w:pPr>
-        <w:pStyle w:val="Heading2"/>
-      </w:pPr>
-      <w:r>
-        <w:rPr>
-          <w:color w:val="1F497D"/>
-        </w:rPr>
-        <w:t>7. Follow-up enviado após Clara NEGAR o serviço</w:t>
-      </w:r>
-    </w:p>
-    <w:p>
-      <w:r>
-        <w:rPr>
-          <w:b/>
-        </w:rPr>
-        <w:t>EVIDÊNCIA — Conversa Dayane (10–11/06):</w:t>
-      </w:r>
-    </w:p>
-    <w:p/>
-    <w:p>
-      <w:pPr>
-        <w:ind w:left="432"/>
-      </w:pPr>
-      <w:r>
-        <w:rPr>
-          <w:color w:val="404040"/>
-          <w:sz w:val="20"/>
-        </w:rPr>
-        <w:t>13:53 10/06 — Paciente: "Qual o valor do ASO?"</w:t>
-      </w:r>
-    </w:p>
-    <w:p>
-      <w:pPr>
-        <w:ind w:left="432"/>
-      </w:pPr>
-      <w:r>
-        <w:rPr>
-          <w:color w:val="1A6B1A"/>
-          <w:sz w:val="20"/>
-        </w:rPr>
-        <w:t>13:53 10/06 — Clara: "o ASO é feito em clínicas de medicina do trabalho, não aqui na REMMED." ✅</w:t>
-      </w:r>
-    </w:p>
-    <w:p>
-      <w:pPr>
-        <w:ind w:left="432"/>
-      </w:pPr>
-      <w:r>
-        <w:rPr>
-          <w:color w:val="C00000"/>
-          <w:sz w:val="20"/>
-        </w:rPr>
-        <w:t>14:11 10/06 — Clara: "Posso te ajudar com mais informações sobre clínicas de medicina do trabalho?" ❌</w:t>
-      </w:r>
-    </w:p>
-    <w:p>
-      <w:pPr>
-        <w:ind w:left="432"/>
-      </w:pPr>
-      <w:r>
-        <w:rPr>
-          <w:color w:val="C00000"/>
-          <w:sz w:val="20"/>
-        </w:rPr>
-        <w:t>15:01 10/06 — Clara: "Posso ajudar com indicações de clínicas em sua região?" ❌❌</w:t>
-      </w:r>
-    </w:p>
-    <w:p>
-      <w:pPr>
-        <w:ind w:left="432"/>
-      </w:pPr>
-      <w:r>
-        <w:rPr>
-          <w:color w:val="C00000"/>
-          <w:sz w:val="20"/>
-        </w:rPr>
-        <w:t>14:01 11/06 — Clara: "algumas clínicas na sua região têm oferecido promoções especiais..." ❌❌❌</w:t>
-      </w:r>
-    </w:p>
-    <w:p/>
-    <w:p>
-      <w:r>
-        <w:rPr>
-          <w:b/>
-        </w:rPr>
-        <w:t>DOIS PROBLEMAS NESTE CASO:</w:t>
-      </w:r>
-    </w:p>
-    <w:p>
-      <w:r>
-        <w:t>(a) Follow-up foi enviado após a conversa já estar encerrada — Clara negou o serviço e o atendimento acabou ali.</w:t>
-        <w:br/>
-        <w:br/>
-        <w:t>(b) O follow-up ofereceu "indicar clínicas na região" — isso é algo que Clara NÃO consegue fazer. Nunca deve prometer indicações locais ou informações que não tem acesso.</w:t>
-      </w:r>
-    </w:p>
-    <w:p/>
-    <w:p>
-      <w:r>
-        <w:rPr>
-          <w:b/>
-        </w:rPr>
-        <w:t xml:space="preserve">REGRA: </w:t>
-      </w:r>
-      <w:r>
-        <w:t>Quando Clara NEGA um serviço (ASO, atestado de acompanhante, emergência encaminhada ao SAMU etc.), o atendimento é encerrado e NÃO deve haver follow-up.</w:t>
-      </w:r>
-    </w:p>
-    <w:p/>
-    <w:p>
-      <w:r>
-        <w:rPr>
-          <w:b/>
-          <w:color w:val="1A6B1A"/>
-        </w:rPr>
-        <w:t>✅ SOLUÇÃO — No n8n — Workflow de follow-up + Prompt</w:t>
-      </w:r>
-    </w:p>
-    <w:p>
-      <w:pPr>
-        <w:ind w:left="432"/>
-      </w:pPr>
-      <w:r>
-        <w:t>PARTE A — No workflow de follow-up (n8n):</w:t>
-      </w:r>
-    </w:p>
-    <w:p>
-      <w:pPr>
-        <w:ind w:left="432"/>
-      </w:pPr>
-      <w:r>
-        <w:t xml:space="preserve">   • Adicionar ao conjunto de estados que bloqueiam follow-up:</w:t>
-      </w:r>
-    </w:p>
-    <w:p>
-      <w:pPr>
-        <w:ind w:left="432"/>
-      </w:pPr>
-      <w:r>
-        <w:t xml:space="preserve">     estado = "servico_negado" (ASO, acompanhante, emergência, etc.)</w:t>
-      </w:r>
-    </w:p>
-    <w:p>
-      <w:pPr>
-        <w:ind w:left="432"/>
-      </w:pPr>
-      <w:r>
-        <w:t xml:space="preserve">   • Quando Clara encerrar por negar um serviço, gravar esse estado no Supabase.</w:t>
-      </w:r>
-    </w:p>
-    <w:p>
-      <w:pPr>
-        <w:ind w:left="432"/>
-      </w:pPr>
-    </w:p>
-    <w:p>
-      <w:pPr>
-        <w:ind w:left="432"/>
-      </w:pPr>
-      <w:r>
-        <w:t>PARTE B — No prompt:</w:t>
-      </w:r>
-    </w:p>
-    <w:p>
-      <w:pPr>
-        <w:ind w:left="432"/>
-      </w:pPr>
-      <w:r>
-        <w:t xml:space="preserve">   • Após qualquer recusa de serviço (ASO, acompanhante, emergência), adicionar instrução:</w:t>
-      </w:r>
-    </w:p>
-    <w:p>
-      <w:pPr>
-        <w:ind w:left="432"/>
-      </w:pPr>
-      <w:r>
-        <w:t xml:space="preserve">     "Registrar estado da conversa como ENCERRADO-NEGADO. Não oferecer alternativas</w:t>
-      </w:r>
-    </w:p>
-    <w:p>
-      <w:pPr>
-        <w:ind w:left="432"/>
-      </w:pPr>
-      <w:r>
-        <w:t xml:space="preserve">      que a REMMED não pode cumprir (indicações locais, preços de outras clínicas, promoções</w:t>
-      </w:r>
-    </w:p>
-    <w:p>
-      <w:pPr>
-        <w:ind w:left="432"/>
-      </w:pPr>
-      <w:r>
-        <w:t xml:space="preserve">      de terceiros). Encerrar com gentileza e nada mais."</w:t>
-      </w:r>
-    </w:p>
-    <w:p/>
-    <w:p>
-      <w:r>
-        <w:br w:type="page"/>
-      </w:r>
-    </w:p>
-    <w:p>
-      <w:pPr>
-        <w:pStyle w:val="Heading2"/>
-      </w:pPr>
-      <w:r>
-        <w:rPr>
-          <w:color w:val="1F497D"/>
-        </w:rPr>
-        <w:t>8. Regra geral de follow-up — definição completa</w:t>
-      </w:r>
-    </w:p>
-    <w:p>
-      <w:r>
-        <w:t>Com base nos casos analisados, a regra deve ser:</w:t>
+        <w:t>Com base em todos os casos analisados, a política de follow-up deve seguir esta tabela:</w:t>
       </w:r>
     </w:p>
     <w:p/>
@@ -1366,36 +3084,46 @@
         <w:tblLook w:firstColumn="1" w:firstRow="1" w:lastColumn="0" w:lastRow="0" w:noHBand="0" w:noVBand="1" w:val="04A0"/>
       </w:tblPr>
       <w:tblGrid>
-        <w:gridCol w:w="2880"/>
-        <w:gridCol w:w="2880"/>
-        <w:gridCol w:w="2880"/>
+        <w:gridCol w:w="3249"/>
+        <w:gridCol w:w="3249"/>
+        <w:gridCol w:w="3249"/>
       </w:tblGrid>
       <w:tr>
         <w:tc>
           <w:tcPr>
-            <w:tcW w:type="dxa" w:w="2880"/>
-            <w:shd w:val="clear" w:color="auto" w:fill="1F497D"/>
+            <w:tcW w:type="dxa" w:w="3249"/>
+            <w:shd w:val="clear" w:color="auto" w:fill="1B3A6B"/>
           </w:tcPr>
           <w:p>
+            <w:pPr>
+              <w:spacing w:before="100" w:after="100"/>
+              <w:jc w:val="center"/>
+            </w:pPr>
             <w:r>
               <w:rPr>
                 <w:b/>
                 <w:color w:val="FFFFFF"/>
+                <w:sz w:val="20"/>
               </w:rPr>
-              <w:t>Situação</w:t>
+              <w:t>Situação do paciente</w:t>
             </w:r>
           </w:p>
         </w:tc>
         <w:tc>
           <w:tcPr>
-            <w:tcW w:type="dxa" w:w="2880"/>
-            <w:shd w:val="clear" w:color="auto" w:fill="1F497D"/>
+            <w:tcW w:type="dxa" w:w="3249"/>
+            <w:shd w:val="clear" w:color="auto" w:fill="1B3A6B"/>
           </w:tcPr>
           <w:p>
+            <w:pPr>
+              <w:spacing w:before="100" w:after="100"/>
+              <w:jc w:val="center"/>
+            </w:pPr>
             <w:r>
               <w:rPr>
                 <w:b/>
                 <w:color w:val="FFFFFF"/>
+                <w:sz w:val="20"/>
               </w:rPr>
               <w:t>Follow-up permitido?</w:t>
             </w:r>
@@ -1403,14 +3131,19 @@
         </w:tc>
         <w:tc>
           <w:tcPr>
-            <w:tcW w:type="dxa" w:w="2880"/>
-            <w:shd w:val="clear" w:color="auto" w:fill="1F497D"/>
+            <w:tcW w:type="dxa" w:w="3249"/>
+            <w:shd w:val="clear" w:color="auto" w:fill="1B3A6B"/>
           </w:tcPr>
           <w:p>
+            <w:pPr>
+              <w:spacing w:before="100" w:after="100"/>
+              <w:jc w:val="center"/>
+            </w:pPr>
             <w:r>
               <w:rPr>
                 <w:b/>
                 <w:color w:val="FFFFFF"/>
+                <w:sz w:val="20"/>
               </w:rPr>
               <w:t>Observação</w:t>
             </w:r>
@@ -1420,34 +3153,59 @@
       <w:tr>
         <w:tc>
           <w:tcPr>
-            <w:tcW w:type="dxa" w:w="2880"/>
-            <w:shd w:val="clear" w:color="auto" w:fill="D7FFD7"/>
+            <w:tcW w:type="dxa" w:w="3249"/>
+            <w:shd w:val="clear" w:color="auto" w:fill="FAFAFA"/>
           </w:tcPr>
           <w:p>
+            <w:pPr>
+              <w:spacing w:before="80" w:after="80"/>
+              <w:ind w:left="72"/>
+            </w:pPr>
             <w:r>
-              <w:t>Paciente não respondeu nada após iniciar triagem</w:t>
+              <w:rPr>
+                <w:sz w:val="20"/>
+              </w:rPr>
+              <w:t>Paciente não respondeu após iniciar triagem</w:t>
             </w:r>
           </w:p>
         </w:tc>
         <w:tc>
           <w:tcPr>
-            <w:tcW w:type="dxa" w:w="2880"/>
-            <w:shd w:val="clear" w:color="auto" w:fill="D7FFD7"/>
+            <w:tcW w:type="dxa" w:w="3249"/>
+            <w:shd w:val="clear" w:color="auto" w:fill="D7F0D7"/>
           </w:tcPr>
           <w:p>
+            <w:pPr>
+              <w:spacing w:before="80" w:after="80"/>
+              <w:jc w:val="center"/>
+            </w:pPr>
             <w:r>
-              <w:t>✅ SIM — 1 lembrete gentil</w:t>
+              <w:rPr>
+                <w:b/>
+                <w:color w:val="2E7D32"/>
+                <w:sz w:val="20"/>
+              </w:rPr>
+              <w:t>✅ SIM</w:t>
+              <w:br/>
+              <w:t>1 lembrete gentil</w:t>
             </w:r>
           </w:p>
         </w:tc>
         <w:tc>
           <w:tcPr>
-            <w:tcW w:type="dxa" w:w="2880"/>
-            <w:shd w:val="clear" w:color="auto" w:fill="D7FFD7"/>
+            <w:tcW w:type="dxa" w:w="3249"/>
+            <w:shd w:val="clear" w:color="auto" w:fill="FAFAFA"/>
           </w:tcPr>
           <w:p>
+            <w:pPr>
+              <w:spacing w:before="80" w:after="80"/>
+              <w:ind w:left="72"/>
+            </w:pPr>
             <w:r>
-              <w:t>Aguardar pelo menos 30 min antes de enviar</w:t>
+              <w:rPr>
+                <w:sz w:val="20"/>
+              </w:rPr>
+              <w:t>Aguardar ≥ 30 min. Tom neutro e gentil.</w:t>
             </w:r>
           </w:p>
         </w:tc>
@@ -1455,34 +3213,57 @@
       <w:tr>
         <w:tc>
           <w:tcPr>
-            <w:tcW w:type="dxa" w:w="2880"/>
-            <w:shd w:val="clear" w:color="auto" w:fill="FFD7D7"/>
+            <w:tcW w:type="dxa" w:w="3249"/>
+            <w:shd w:val="clear" w:color="auto" w:fill="FAFAFA"/>
           </w:tcPr>
           <w:p>
+            <w:pPr>
+              <w:spacing w:before="80" w:after="80"/>
+              <w:ind w:left="72"/>
+            </w:pPr>
             <w:r>
-              <w:t>Paciente respondeu NÃO (não quer prosseguir)</w:t>
+              <w:rPr>
+                <w:sz w:val="20"/>
+              </w:rPr>
+              <w:t>Paciente respondeu NÃO</w:t>
             </w:r>
           </w:p>
         </w:tc>
         <w:tc>
           <w:tcPr>
-            <w:tcW w:type="dxa" w:w="2880"/>
-            <w:shd w:val="clear" w:color="auto" w:fill="FFD7D7"/>
+            <w:tcW w:type="dxa" w:w="3249"/>
+            <w:shd w:val="clear" w:color="auto" w:fill="FFE5E5"/>
           </w:tcPr>
           <w:p>
+            <w:pPr>
+              <w:spacing w:before="80" w:after="80"/>
+              <w:jc w:val="center"/>
+            </w:pPr>
             <w:r>
+              <w:rPr>
+                <w:b/>
+                <w:color w:val="C00000"/>
+                <w:sz w:val="20"/>
+              </w:rPr>
               <w:t>❌ NÃO</w:t>
             </w:r>
           </w:p>
         </w:tc>
         <w:tc>
           <w:tcPr>
-            <w:tcW w:type="dxa" w:w="2880"/>
-            <w:shd w:val="clear" w:color="auto" w:fill="FFD7D7"/>
+            <w:tcW w:type="dxa" w:w="3249"/>
+            <w:shd w:val="clear" w:color="auto" w:fill="FAFAFA"/>
           </w:tcPr>
           <w:p>
+            <w:pPr>
+              <w:spacing w:before="80" w:after="80"/>
+              <w:ind w:left="72"/>
+            </w:pPr>
             <w:r>
-              <w:t>Encerrar com "Sem problemas, pode nos chamar!" e parar</w:t>
+              <w:rPr>
+                <w:sz w:val="20"/>
+              </w:rPr>
+              <w:t>Encerrar: "Sem problemas, pode nos chamar!" e parar.</w:t>
             </w:r>
           </w:p>
         </w:tc>
@@ -1490,34 +3271,59 @@
       <w:tr>
         <w:tc>
           <w:tcPr>
-            <w:tcW w:type="dxa" w:w="2880"/>
-            <w:shd w:val="clear" w:color="auto" w:fill="FFD7D7"/>
+            <w:tcW w:type="dxa" w:w="3249"/>
+            <w:shd w:val="clear" w:color="auto" w:fill="FAFAFA"/>
           </w:tcPr>
           <w:p>
+            <w:pPr>
+              <w:spacing w:before="80" w:after="80"/>
+              <w:ind w:left="72"/>
+            </w:pPr>
             <w:r>
-              <w:t>Clara negou o serviço (ASO, acompanhante, emergência)</w:t>
+              <w:rPr>
+                <w:sz w:val="20"/>
+              </w:rPr>
+              <w:t>Clara negou o serviço</w:t>
+              <w:br/>
+              <w:t>(ASO, acompanhante...)</w:t>
             </w:r>
           </w:p>
         </w:tc>
         <w:tc>
           <w:tcPr>
-            <w:tcW w:type="dxa" w:w="2880"/>
-            <w:shd w:val="clear" w:color="auto" w:fill="FFD7D7"/>
+            <w:tcW w:type="dxa" w:w="3249"/>
+            <w:shd w:val="clear" w:color="auto" w:fill="FFE5E5"/>
           </w:tcPr>
           <w:p>
+            <w:pPr>
+              <w:spacing w:before="80" w:after="80"/>
+              <w:jc w:val="center"/>
+            </w:pPr>
             <w:r>
+              <w:rPr>
+                <w:b/>
+                <w:color w:val="C00000"/>
+                <w:sz w:val="20"/>
+              </w:rPr>
               <w:t>❌ NÃO</w:t>
             </w:r>
           </w:p>
         </w:tc>
         <w:tc>
           <w:tcPr>
-            <w:tcW w:type="dxa" w:w="2880"/>
-            <w:shd w:val="clear" w:color="auto" w:fill="FFD7D7"/>
+            <w:tcW w:type="dxa" w:w="3249"/>
+            <w:shd w:val="clear" w:color="auto" w:fill="FAFAFA"/>
           </w:tcPr>
           <w:p>
+            <w:pPr>
+              <w:spacing w:before="80" w:after="80"/>
+              <w:ind w:left="72"/>
+            </w:pPr>
             <w:r>
-              <w:t>Conversa encerrada — não há produto a oferecer</w:t>
+              <w:rPr>
+                <w:sz w:val="20"/>
+              </w:rPr>
+              <w:t>Conversa encerrada — sem produto a oferecer.</w:t>
             </w:r>
           </w:p>
         </w:tc>
@@ -1525,34 +3331,57 @@
       <w:tr>
         <w:tc>
           <w:tcPr>
-            <w:tcW w:type="dxa" w:w="2880"/>
-            <w:shd w:val="clear" w:color="auto" w:fill="FFD7D7"/>
+            <w:tcW w:type="dxa" w:w="3249"/>
+            <w:shd w:val="clear" w:color="auto" w:fill="FAFAFA"/>
           </w:tcPr>
           <w:p>
+            <w:pPr>
+              <w:spacing w:before="80" w:after="80"/>
+              <w:ind w:left="72"/>
+            </w:pPr>
             <w:r>
+              <w:rPr>
+                <w:sz w:val="20"/>
+              </w:rPr>
               <w:t>Paciente usou /reset</w:t>
             </w:r>
           </w:p>
         </w:tc>
         <w:tc>
           <w:tcPr>
-            <w:tcW w:type="dxa" w:w="2880"/>
-            <w:shd w:val="clear" w:color="auto" w:fill="FFD7D7"/>
+            <w:tcW w:type="dxa" w:w="3249"/>
+            <w:shd w:val="clear" w:color="auto" w:fill="FFE5E5"/>
           </w:tcPr>
           <w:p>
+            <w:pPr>
+              <w:spacing w:before="80" w:after="80"/>
+              <w:jc w:val="center"/>
+            </w:pPr>
             <w:r>
+              <w:rPr>
+                <w:b/>
+                <w:color w:val="C00000"/>
+                <w:sz w:val="20"/>
+              </w:rPr>
               <w:t>❌ NÃO</w:t>
             </w:r>
           </w:p>
         </w:tc>
         <w:tc>
           <w:tcPr>
-            <w:tcW w:type="dxa" w:w="2880"/>
-            <w:shd w:val="clear" w:color="auto" w:fill="FFD7D7"/>
+            <w:tcW w:type="dxa" w:w="3249"/>
+            <w:shd w:val="clear" w:color="auto" w:fill="FAFAFA"/>
           </w:tcPr>
           <w:p>
+            <w:pPr>
+              <w:spacing w:before="80" w:after="80"/>
+              <w:ind w:left="72"/>
+            </w:pPr>
             <w:r>
-              <w:t>Cancelar follow-ups da sessão anterior imediatamente</w:t>
+              <w:rPr>
+                <w:sz w:val="20"/>
+              </w:rPr>
+              <w:t>Cancelar follow-ups da sessão anterior imediatamente.</w:t>
             </w:r>
           </w:p>
         </w:tc>
@@ -1560,34 +3389,61 @@
       <w:tr>
         <w:tc>
           <w:tcPr>
-            <w:tcW w:type="dxa" w:w="2880"/>
-            <w:shd w:val="clear" w:color="auto" w:fill="D7FFD7"/>
+            <w:tcW w:type="dxa" w:w="3249"/>
+            <w:shd w:val="clear" w:color="auto" w:fill="FAFAFA"/>
           </w:tcPr>
           <w:p>
+            <w:pPr>
+              <w:spacing w:before="80" w:after="80"/>
+              <w:ind w:left="72"/>
+            </w:pPr>
             <w:r>
-              <w:t>Paciente respondeu SIM mas não finalizou pagamento</w:t>
+              <w:rPr>
+                <w:sz w:val="20"/>
+              </w:rPr>
+              <w:t>Paciente respondeu SIM mas não</w:t>
+              <w:br/>
+              <w:t>finalizou pagamento</w:t>
             </w:r>
           </w:p>
         </w:tc>
         <w:tc>
           <w:tcPr>
-            <w:tcW w:type="dxa" w:w="2880"/>
-            <w:shd w:val="clear" w:color="auto" w:fill="D7FFD7"/>
+            <w:tcW w:type="dxa" w:w="3249"/>
+            <w:shd w:val="clear" w:color="auto" w:fill="D7F0D7"/>
           </w:tcPr>
           <w:p>
+            <w:pPr>
+              <w:spacing w:before="80" w:after="80"/>
+              <w:jc w:val="center"/>
+            </w:pPr>
             <w:r>
-              <w:t>✅ SIM — 1 lembrete</w:t>
+              <w:rPr>
+                <w:b/>
+                <w:color w:val="2E7D32"/>
+                <w:sz w:val="20"/>
+              </w:rPr>
+              <w:t>✅ SIM</w:t>
+              <w:br/>
+              <w:t>1 lembrete</w:t>
             </w:r>
           </w:p>
         </w:tc>
         <w:tc>
           <w:tcPr>
-            <w:tcW w:type="dxa" w:w="2880"/>
-            <w:shd w:val="clear" w:color="auto" w:fill="D7FFD7"/>
+            <w:tcW w:type="dxa" w:w="3249"/>
+            <w:shd w:val="clear" w:color="auto" w:fill="FAFAFA"/>
           </w:tcPr>
           <w:p>
+            <w:pPr>
+              <w:spacing w:before="80" w:after="80"/>
+              <w:ind w:left="72"/>
+            </w:pPr>
             <w:r>
-              <w:t>Máximo 1 mensagem, tom neutro</w:t>
+              <w:rPr>
+                <w:sz w:val="20"/>
+              </w:rPr>
+              <w:t>Máximo 1 mensagem. Tom neutro.</w:t>
             </w:r>
           </w:p>
         </w:tc>
@@ -1595,54 +3451,121 @@
       <w:tr>
         <w:tc>
           <w:tcPr>
-            <w:tcW w:type="dxa" w:w="2880"/>
-            <w:shd w:val="clear" w:color="auto" w:fill="FFD7D7"/>
+            <w:tcW w:type="dxa" w:w="3249"/>
+            <w:shd w:val="clear" w:color="auto" w:fill="FAFAFA"/>
           </w:tcPr>
           <w:p>
+            <w:pPr>
+              <w:spacing w:before="80" w:after="80"/>
+              <w:ind w:left="72"/>
+            </w:pPr>
             <w:r>
-              <w:t>Paciente já agendou</w:t>
+              <w:rPr>
+                <w:sz w:val="20"/>
+              </w:rPr>
+              <w:t>Paciente agendou consulta</w:t>
             </w:r>
           </w:p>
         </w:tc>
         <w:tc>
           <w:tcPr>
-            <w:tcW w:type="dxa" w:w="2880"/>
-            <w:shd w:val="clear" w:color="auto" w:fill="FFD7D7"/>
+            <w:tcW w:type="dxa" w:w="3249"/>
+            <w:shd w:val="clear" w:color="auto" w:fill="D7F0D7"/>
           </w:tcPr>
           <w:p>
+            <w:pPr>
+              <w:spacing w:before="80" w:after="80"/>
+              <w:jc w:val="center"/>
+            </w:pPr>
             <w:r>
-              <w:t>❌ NÃO</w:t>
+              <w:rPr>
+                <w:b/>
+                <w:color w:val="2E7D32"/>
+                <w:sz w:val="20"/>
+              </w:rPr>
+              <w:t>✅ SIM</w:t>
+              <w:br/>
+              <w:t>Follow-up da clínica</w:t>
             </w:r>
           </w:p>
         </w:tc>
         <w:tc>
           <w:tcPr>
-            <w:tcW w:type="dxa" w:w="2880"/>
-            <w:shd w:val="clear" w:color="auto" w:fill="FFD7D7"/>
+            <w:tcW w:type="dxa" w:w="3249"/>
+            <w:shd w:val="clear" w:color="auto" w:fill="FAFAFA"/>
           </w:tcPr>
           <w:p>
+            <w:pPr>
+              <w:spacing w:before="80" w:after="80"/>
+              <w:ind w:left="72"/>
+            </w:pPr>
             <w:r>
-              <w:t>Não incomodar quem já converteu</w:t>
+              <w:rPr>
+                <w:sz w:val="20"/>
+              </w:rPr>
+              <w:t>Enviar confirmação de agendamento com data, hora e link. Nada mais.</w:t>
             </w:r>
           </w:p>
         </w:tc>
       </w:tr>
     </w:tbl>
     <w:p/>
-    <w:p>
-      <w:r>
-        <w:rPr>
-          <w:b/>
-        </w:rPr>
-        <w:t xml:space="preserve">NUNCA prometer no follow-up o que não consegue entregar: </w:t>
-      </w:r>
-      <w:r>
-        <w:t>"indicação de clínicas na sua região", "promoções especiais de clínicas", "informações de outras unidades". Clara só tem acesso ao sistema da REMMED Telemedicina.</w:t>
-      </w:r>
-    </w:p>
+    <w:tbl>
+      <w:tblPr>
+        <w:tblW w:type="auto" w:w="0"/>
+        <w:tblLook w:firstColumn="1" w:firstRow="1" w:lastColumn="0" w:lastRow="0" w:noHBand="0" w:noVBand="1" w:val="04A0"/>
+      </w:tblPr>
+      <w:tblGrid>
+        <w:gridCol w:w="9746"/>
+      </w:tblGrid>
+      <w:tr>
+        <w:tc>
+          <w:tcPr>
+            <w:tcW w:type="dxa" w:w="9746"/>
+            <w:shd w:val="clear" w:color="auto" w:fill="FFF3CD"/>
+            <w:tcBorders>
+              <w:top w:val="single" w:sz="8" w:space="0" w:color="E0A800"/>
+              <w:bottom w:val="single" w:sz="8" w:space="0" w:color="E0A800"/>
+              <w:left w:val="single" w:sz="8" w:space="0" w:color="E0A800"/>
+              <w:right w:val="single" w:sz="8" w:space="0" w:color="E0A800"/>
+            </w:tcBorders>
+          </w:tcPr>
+          <w:p>
+            <w:pPr>
+              <w:spacing w:before="140"/>
+              <w:ind w:left="173"/>
+            </w:pPr>
+            <w:r>
+              <w:rPr>
+                <w:b/>
+                <w:color w:val="7B4F00"/>
+                <w:sz w:val="20"/>
+              </w:rPr>
+              <w:t>⚠  NUNCA prometer no follow-up o que não consegue entregar:</w:t>
+            </w:r>
+          </w:p>
+          <w:p>
+            <w:pPr>
+              <w:spacing w:after="140"/>
+              <w:ind w:left="216"/>
+            </w:pPr>
+            <w:r>
+              <w:rPr>
+                <w:color w:val="553800"/>
+                <w:sz w:val="20"/>
+              </w:rPr>
+              <w:t>"Indicação de clínicas na sua região" / "Promoções especiais de clínicas" / "Informações de outras unidades"</w:t>
+              <w:br/>
+              <w:br/>
+              <w:t>Clara tem acesso SOMENTE ao sistema da REMMED Telemedicina.</w:t>
+            </w:r>
+          </w:p>
+        </w:tc>
+      </w:tr>
+    </w:tbl>
     <w:sectPr>
       <w:pgSz w:w="12240" w:h="15840"/>
-      <w:pgMar w:top="1440" w:right="1800" w:bottom="1440" w:left="1800" w:header="720" w:footer="720" w:gutter="0"/>
+      <w:pgMar w:top="1020" w:right="1247" w:bottom="1020" w:left="1247" w:header="720" w:footer="720" w:gutter="0"/>
       <w:cols w:space="720"/>
       <w:docGrid w:linePitch="360"/>
     </w:sectPr>
@@ -2015,7 +3938,7 @@
     <w:rsid w:val="00FC693F"/>
     <w:rPr>
       <w:rFonts w:ascii="Calibri" w:hAnsi="Calibri"/>
-      <w:sz w:val="22"/>
+      <w:sz w:val="21"/>
     </w:rPr>
   </w:style>
   <w:style w:type="paragraph" w:styleId="Header">

</xml_diff>

<commit_message>
Update feedback doc: triagem only, remove follow-up section
Smaller focused document for Nicolas with only the 4 prompt
corrections (retroactive attestation, V7, V9, V6).

https://claude.ai/code/session_01QV8d4yT7wUXju8L84Xs7y2
</commit_message>
<xml_diff>
--- a/Feedback_Triagem_Nicolas_FINAL.docx
+++ b/Feedback_Triagem_Nicolas_FINAL.docx
@@ -18,44 +18,43 @@
           </w:tcPr>
           <w:p>
             <w:pPr>
-              <w:spacing w:before="440" w:after="120"/>
+              <w:spacing w:before="400" w:after="80"/>
               <w:jc w:val="center"/>
             </w:pPr>
             <w:r>
               <w:rPr>
                 <w:b/>
                 <w:color w:val="FFFFFF"/>
-                <w:sz w:val="44"/>
+                <w:sz w:val="36"/>
               </w:rPr>
-              <w:t>FEEDBACK DE QUALIDADE</w:t>
+              <w:t>FEEDBACK DE QUALIDADE — TRIAGEM CLARA</w:t>
             </w:r>
           </w:p>
           <w:p>
             <w:pPr>
-              <w:spacing w:after="160"/>
-              <w:jc w:val="center"/>
-            </w:pPr>
-            <w:r>
-              <w:rPr>
-                <w:b/>
-                <w:color w:val="A8D0FF"/>
-                <w:sz w:val="28"/>
-              </w:rPr>
-              <w:t>TRIAGEM CLARA — CORREÇÕES NECESSÁRIAS</w:t>
-            </w:r>
-          </w:p>
-          <w:p>
-            <w:pPr>
-              <w:spacing w:after="360"/>
+              <w:spacing w:after="120"/>
               <w:jc w:val="center"/>
             </w:pPr>
             <w:r>
               <w:rPr>
                 <w:i/>
+                <w:color w:val="A8D0FF"/>
+                <w:sz w:val="24"/>
+              </w:rPr>
+              <w:t>Correções necessárias no prompt de triagem</w:t>
+            </w:r>
+          </w:p>
+          <w:p>
+            <w:pPr>
+              <w:spacing w:after="320"/>
+              <w:jc w:val="center"/>
+            </w:pPr>
+            <w:r>
+              <w:rPr>
                 <w:color w:val="CCDDFF"/>
-                <w:sz w:val="21"/>
+                <w:sz w:val="19"/>
               </w:rPr>
-              <w:t>Última análise — Testes realizados em 09–11/06/2026</w:t>
+              <w:t>Testes realizados em 09–11/06/2026   |   Elaborado em 12/06/2026   |   Destinatário: Nicolas (dev)</w:t>
             </w:r>
           </w:p>
         </w:tc>
@@ -68,14 +67,15 @@
         <w:tblLook w:firstColumn="1" w:firstRow="1" w:lastColumn="0" w:lastRow="0" w:noHBand="0" w:noVBand="1" w:val="04A0"/>
       </w:tblPr>
       <w:tblGrid>
-        <w:gridCol w:w="3249"/>
-        <w:gridCol w:w="3249"/>
-        <w:gridCol w:w="3249"/>
+        <w:gridCol w:w="2436"/>
+        <w:gridCol w:w="2436"/>
+        <w:gridCol w:w="2436"/>
+        <w:gridCol w:w="2436"/>
       </w:tblGrid>
       <w:tr>
         <w:tc>
           <w:tcPr>
-            <w:tcW w:type="dxa" w:w="3249"/>
+            <w:tcW w:type="dxa" w:w="2436"/>
             <w:shd w:val="clear" w:color="auto" w:fill="E8EEF7"/>
             <w:tcBorders>
               <w:top w:val="single" w:sz="6" w:space="0" w:color="1B3A6B"/>
@@ -94,7 +94,7 @@
                 <w:color w:val="666688"/>
                 <w:sz w:val="16"/>
               </w:rPr>
-              <w:t>Data dos testes</w:t>
+              <w:t>Itens a corrigir</w:t>
               <w:br/>
             </w:r>
             <w:r>
@@ -103,13 +103,13 @@
                 <w:color w:val="1B3A6B"/>
                 <w:sz w:val="21"/>
               </w:rPr>
-              <w:t>09–11/06/2026</w:t>
+              <w:t>4</w:t>
             </w:r>
           </w:p>
         </w:tc>
         <w:tc>
           <w:tcPr>
-            <w:tcW w:type="dxa" w:w="3249"/>
+            <w:tcW w:type="dxa" w:w="2436"/>
             <w:shd w:val="clear" w:color="auto" w:fill="E8EEF7"/>
             <w:tcBorders>
               <w:top w:val="single" w:sz="6" w:space="0" w:color="1B3A6B"/>
@@ -128,7 +128,7 @@
                 <w:color w:val="666688"/>
                 <w:sz w:val="16"/>
               </w:rPr>
-              <w:t>Elaborado em</w:t>
+              <w:t>Prioridade</w:t>
               <w:br/>
             </w:r>
             <w:r>
@@ -137,13 +137,13 @@
                 <w:color w:val="1B3A6B"/>
                 <w:sz w:val="21"/>
               </w:rPr>
-              <w:t>12/06/2026</w:t>
+              <w:t>🔴 Alta</w:t>
             </w:r>
           </w:p>
         </w:tc>
         <w:tc>
           <w:tcPr>
-            <w:tcW w:type="dxa" w:w="3249"/>
+            <w:tcW w:type="dxa" w:w="2436"/>
             <w:shd w:val="clear" w:color="auto" w:fill="E8EEF7"/>
             <w:tcBorders>
               <w:top w:val="single" w:sz="6" w:space="0" w:color="1B3A6B"/>
@@ -162,7 +162,7 @@
                 <w:color w:val="666688"/>
                 <w:sz w:val="16"/>
               </w:rPr>
-              <w:t>Destinatário</w:t>
+              <w:t>Onde mexer</w:t>
               <w:br/>
             </w:r>
             <w:r>
@@ -171,7 +171,41 @@
                 <w:color w:val="1B3A6B"/>
                 <w:sz w:val="21"/>
               </w:rPr>
-              <w:t>Nicolas (dev)</w:t>
+              <w:t>Prompt de triagem</w:t>
+            </w:r>
+          </w:p>
+        </w:tc>
+        <w:tc>
+          <w:tcPr>
+            <w:tcW w:type="dxa" w:w="2436"/>
+            <w:shd w:val="clear" w:color="auto" w:fill="E8EEF7"/>
+            <w:tcBorders>
+              <w:top w:val="single" w:sz="6" w:space="0" w:color="1B3A6B"/>
+              <w:bottom w:val="single" w:sz="6" w:space="0" w:color="1B3A6B"/>
+              <w:left w:val="single" w:sz="6" w:space="0" w:color="1B3A6B"/>
+              <w:right w:val="single" w:sz="6" w:space="0" w:color="1B3A6B"/>
+            </w:tcBorders>
+          </w:tcPr>
+          <w:p>
+            <w:pPr>
+              <w:spacing w:before="120" w:after="120"/>
+              <w:jc w:val="center"/>
+            </w:pPr>
+            <w:r>
+              <w:rPr>
+                <w:color w:val="666688"/>
+                <w:sz w:val="16"/>
+              </w:rPr>
+              <w:t>Status</w:t>
+              <w:br/>
+            </w:r>
+            <w:r>
+              <w:rPr>
+                <w:b/>
+                <w:color w:val="1B3A6B"/>
+                <w:sz w:val="21"/>
+              </w:rPr>
+              <w:t>Aguardando correção</w:t>
             </w:r>
           </w:p>
         </w:tc>
@@ -181,17 +215,15 @@
     <w:tbl>
       <w:tblPr>
         <w:tblW w:type="auto" w:w="0"/>
-        <w:jc w:val="center"/>
         <w:tblLook w:firstColumn="1" w:firstRow="1" w:lastColumn="0" w:lastRow="0" w:noHBand="0" w:noVBand="1" w:val="04A0"/>
       </w:tblPr>
       <w:tblGrid>
-        <w:gridCol w:w="4873"/>
-        <w:gridCol w:w="4873"/>
+        <w:gridCol w:w="9746"/>
       </w:tblGrid>
       <w:tr>
         <w:tc>
           <w:tcPr>
-            <w:tcW w:type="dxa" w:w="4873"/>
+            <w:tcW w:type="dxa" w:w="9746"/>
             <w:shd w:val="clear" w:color="auto" w:fill="FFF8F0"/>
             <w:tcBorders>
               <w:top w:val="single" w:sz="6" w:space="0" w:color="E08000"/>
@@ -203,144 +235,63 @@
           <w:p>
             <w:pPr>
               <w:spacing w:before="120"/>
-              <w:ind w:left="144"/>
+              <w:ind w:left="173"/>
             </w:pPr>
             <w:r>
               <w:rPr>
                 <w:b/>
-                <w:color w:val="B85C00"/>
+                <w:color w:val="B85800"/>
                 <w:sz w:val="20"/>
               </w:rPr>
-              <w:t>PARTE 1 — PROMPT DE TRIAGEM</w:t>
-              <w:br/>
+              <w:t>ITENS DESTE DOCUMENTO:</w:t>
             </w:r>
           </w:p>
           <w:p>
             <w:pPr>
-              <w:ind w:left="144"/>
+              <w:ind w:left="173"/>
             </w:pPr>
             <w:r>
               <w:rPr>
                 <w:color w:val="444444"/>
-                <w:sz w:val="19"/>
+                <w:sz w:val="20"/>
               </w:rPr>
               <w:t xml:space="preserve">   1. Linguagem proibida — atestado retroativo</w:t>
             </w:r>
           </w:p>
           <w:p>
             <w:pPr>
-              <w:ind w:left="144"/>
+              <w:ind w:left="173"/>
             </w:pPr>
             <w:r>
               <w:rPr>
                 <w:color w:val="444444"/>
-                <w:sz w:val="19"/>
+                <w:sz w:val="20"/>
               </w:rPr>
-              <w:t xml:space="preserve">   2. V7 — Múltiplas queixas</w:t>
+              <w:t xml:space="preserve">   2. V7 — Múltiplas queixas: Clara escolheu grupo sem perguntar o principal</w:t>
             </w:r>
           </w:p>
           <w:p>
             <w:pPr>
-              <w:ind w:left="144"/>
+              <w:ind w:left="173"/>
             </w:pPr>
             <w:r>
               <w:rPr>
                 <w:color w:val="444444"/>
-                <w:sz w:val="19"/>
+                <w:sz w:val="20"/>
               </w:rPr>
-              <w:t xml:space="preserve">   3. V9 — Atestado de acompanhante</w:t>
+              <w:t xml:space="preserve">   3. V9 — Atestado de acompanhante: comportamento inconsistente</w:t>
             </w:r>
           </w:p>
           <w:p>
             <w:pPr>
-              <w:ind w:left="144"/>
+              <w:ind w:left="173"/>
             </w:pPr>
             <w:r>
               <w:rPr>
                 <w:color w:val="444444"/>
-                <w:sz w:val="19"/>
-              </w:rPr>
-              <w:t xml:space="preserve">   4. V6 — Emagrecimento</w:t>
-            </w:r>
-          </w:p>
-          <w:p>
-            <w:pPr>
-              <w:spacing w:after="120"/>
-            </w:pPr>
-          </w:p>
-        </w:tc>
-        <w:tc>
-          <w:tcPr>
-            <w:tcW w:type="dxa" w:w="4873"/>
-            <w:shd w:val="clear" w:color="auto" w:fill="F0F8FF"/>
-            <w:tcBorders>
-              <w:top w:val="single" w:sz="6" w:space="0" w:color="1B3A6B"/>
-              <w:bottom w:val="single" w:sz="6" w:space="0" w:color="1B3A6B"/>
-              <w:left w:val="single" w:sz="6" w:space="0" w:color="1B3A6B"/>
-              <w:right w:val="single" w:sz="6" w:space="0" w:color="1B3A6B"/>
-            </w:tcBorders>
-          </w:tcPr>
-          <w:p>
-            <w:pPr>
-              <w:spacing w:before="120"/>
-              <w:ind w:left="144"/>
-            </w:pPr>
-            <w:r>
-              <w:rPr>
-                <w:b/>
-                <w:color w:val="1B3A6B"/>
                 <w:sz w:val="20"/>
               </w:rPr>
-              <w:t>PARTE 2 — WORKFLOW DE FOLLOW-UP (n8n)</w:t>
-              <w:br/>
-            </w:r>
-          </w:p>
-          <w:p>
-            <w:pPr>
-              <w:ind w:left="144"/>
-            </w:pPr>
-            <w:r>
-              <w:rPr>
-                <w:color w:val="444444"/>
-                <w:sz w:val="19"/>
-              </w:rPr>
-              <w:t xml:space="preserve">   5. [NOME DO CLIENTE] — variável não substituída</w:t>
-            </w:r>
-          </w:p>
-          <w:p>
-            <w:pPr>
-              <w:ind w:left="144"/>
-            </w:pPr>
-            <w:r>
-              <w:rPr>
-                <w:color w:val="444444"/>
-                <w:sz w:val="19"/>
-              </w:rPr>
-              <w:t xml:space="preserve">   6. Follow-up após NÃO explícito</w:t>
-            </w:r>
-          </w:p>
-          <w:p>
-            <w:pPr>
-              <w:ind w:left="144"/>
-            </w:pPr>
-            <w:r>
-              <w:rPr>
-                <w:color w:val="444444"/>
-                <w:sz w:val="19"/>
-              </w:rPr>
-              <w:t xml:space="preserve">   7. Follow-up após serviço negado (ASO)</w:t>
-            </w:r>
-          </w:p>
-          <w:p>
-            <w:pPr>
-              <w:ind w:left="144"/>
-            </w:pPr>
-            <w:r>
-              <w:rPr>
-                <w:color w:val="444444"/>
-                <w:sz w:val="19"/>
-              </w:rPr>
-              <w:t xml:space="preserve">   8. Regra geral de follow-up</w:t>
+              <w:t xml:space="preserve">   4. V6 — Emagrecimento: passo extra desnecessário</w:t>
             </w:r>
           </w:p>
           <w:p>
@@ -359,7 +310,6 @@
     <w:tbl>
       <w:tblPr>
         <w:tblW w:type="auto" w:w="0"/>
-        <w:jc w:val="center"/>
         <w:tblLook w:firstColumn="1" w:firstRow="1" w:lastColumn="0" w:lastRow="0" w:noHBand="0" w:noVBand="1" w:val="04A0"/>
       </w:tblPr>
       <w:tblGrid>
@@ -368,7 +318,7 @@
       <w:tr>
         <w:tc>
           <w:tcPr>
-            <w:tcW w:type="dxa" w:w="9360"/>
+            <w:tcW w:type="dxa" w:w="9746"/>
             <w:shd w:val="clear" w:color="auto" w:fill="B8460A"/>
           </w:tcPr>
           <w:p>
@@ -383,7 +333,7 @@
                 <w:color w:val="FFFFFF"/>
                 <w:sz w:val="24"/>
               </w:rPr>
-              <w:t xml:space="preserve">  PARTE 1   PROMPT DE TRIAGEM</w:t>
+              <w:t xml:space="preserve">  CORREÇÕES NECESSÁRIAS NO PROMPT DE TRIAGEM</w:t>
             </w:r>
           </w:p>
         </w:tc>
@@ -412,7 +362,7 @@
             <w:r>
               <w:rPr>
                 <w:b/>
-                <w:color w:val="1B3A6B"/>
+                <w:color w:val="B8460A"/>
                 <w:sz w:val="22"/>
               </w:rPr>
               <w:t xml:space="preserve">1.  </w:t>
@@ -420,7 +370,7 @@
             <w:r>
               <w:rPr>
                 <w:b/>
-                <w:color w:val="1B3A6B"/>
+                <w:color w:val="B8460A"/>
                 <w:sz w:val="22"/>
               </w:rPr>
               <w:t>Linguagem proibida — Atestado retroativo</w:t>
@@ -456,11 +406,6 @@
         </w:rPr>
         <w:t xml:space="preserve">O QUE ACONTECEU:  </w:t>
       </w:r>
-      <w:r>
-        <w:rPr>
-          <w:sz w:val="20"/>
-        </w:rPr>
-      </w:r>
     </w:p>
     <w:p>
       <w:r>
@@ -472,9 +417,10 @@
         <w:t>"não conseguimos garantir atestado retroativo" e "o médico pode avaliar seu caso e, se considerar adequado, emitir um atestado a partir da data de hoje."</w:t>
         <w:br/>
         <w:br/>
-        <w:t>PROBLEMA: "não conseguimos garantir" sugere que talvez seja possível. Gerou expectativa falsa — intervenção manual necessária.</w:t>
+        <w:t>PROBLEMA: a expressão "não conseguimos garantir" sugere que talvez seja possível. Gerou expectativa falsa — foi necessária intervenção manual.</w:t>
       </w:r>
     </w:p>
+    <w:p/>
     <w:p>
       <w:r>
         <w:rPr>
@@ -503,7 +449,7 @@
         <w:tc>
           <w:tcPr>
             <w:tcW w:type="dxa" w:w="9746"/>
-            <w:shd w:val="clear" w:color="auto" w:fill="F0F0F0"/>
+            <w:shd w:val="clear" w:color="auto" w:fill="F4F4F4"/>
             <w:tcBorders>
               <w:top w:val="single" w:sz="6" w:space="0" w:color="BBBBBB"/>
               <w:bottom w:val="single" w:sz="6" w:space="0" w:color="BBBBBB"/>
@@ -566,11 +512,6 @@
         </w:rPr>
         <w:t xml:space="preserve">COMPORTAMENTO CORRETO:  </w:t>
       </w:r>
-      <w:r>
-        <w:rPr>
-          <w:sz w:val="20"/>
-        </w:rPr>
-      </w:r>
     </w:p>
     <w:p>
       <w:r>
@@ -579,7 +520,7 @@
         </w:rPr>
         <w:t>"Não realizamos atestado retroativo. O atestado é emitido apenas a partir da data da consulta."</w:t>
         <w:br/>
-        <w:t>→ Perguntar se deseja consulta para hoje ou encerrar.</w:t>
+        <w:t>→ Perguntar se deseja continuar para consulta de hoje ou encerrar.</w:t>
       </w:r>
     </w:p>
     <w:p/>
@@ -704,24 +645,26 @@
           </w:p>
           <w:p>
             <w:pPr>
-              <w:spacing w:before="20" w:after="20"/>
+              <w:spacing w:before="20"/>
               <w:ind w:left="216"/>
             </w:pPr>
             <w:r>
               <w:rPr>
+                <w:rFonts w:ascii="Calibri" w:hAnsi="Calibri"/>
                 <w:color w:val="1B3A20"/>
                 <w:sz w:val="20"/>
               </w:rPr>
-              <w:t>Adicionar ANTES das respostas sobre atestado a seguinte regra inviolável:</w:t>
+              <w:t>Adicionar ANTES das respostas sobre atestado:</w:t>
             </w:r>
           </w:p>
           <w:p>
             <w:pPr>
-              <w:spacing w:before="20" w:after="20"/>
+              <w:spacing w:before="20"/>
               <w:ind w:left="216"/>
             </w:pPr>
             <w:r>
               <w:rPr>
+                <w:rFonts w:ascii="Calibri" w:hAnsi="Calibri"/>
                 <w:color w:val="1B3A20"/>
                 <w:sz w:val="20"/>
               </w:rPr>
@@ -729,24 +672,26 @@
           </w:p>
           <w:p>
             <w:pPr>
-              <w:spacing w:before="20" w:after="20"/>
+              <w:spacing w:before="20"/>
               <w:ind w:left="216"/>
             </w:pPr>
             <w:r>
               <w:rPr>
-                <w:color w:val="1B3A20"/>
-                <w:sz w:val="20"/>
+                <w:rFonts w:ascii="Consolas" w:hAnsi="Consolas"/>
+                <w:color w:val="1B5E20"/>
+                <w:sz w:val="18"/>
               </w:rPr>
               <w:t>⚠ REGRA — ATESTADO RETROATIVO:</w:t>
             </w:r>
           </w:p>
           <w:p>
             <w:pPr>
-              <w:spacing w:before="20" w:after="20"/>
+              <w:spacing w:before="20"/>
               <w:ind w:left="216"/>
             </w:pPr>
             <w:r>
               <w:rPr>
+                <w:rFonts w:ascii="Calibri" w:hAnsi="Calibri"/>
                 <w:color w:val="1B3A20"/>
                 <w:sz w:val="20"/>
               </w:rPr>
@@ -755,24 +700,26 @@
           </w:p>
           <w:p>
             <w:pPr>
-              <w:spacing w:before="20" w:after="20"/>
+              <w:spacing w:before="20"/>
               <w:ind w:left="216"/>
             </w:pPr>
             <w:r>
               <w:rPr>
+                <w:rFonts w:ascii="Calibri" w:hAnsi="Calibri"/>
                 <w:color w:val="1B3A20"/>
                 <w:sz w:val="20"/>
               </w:rPr>
-              <w:t>passada", "retroativo"), responda EXATAMENTE:</w:t>
+              <w:t>passada", "retroativo"), responder EXATAMENTE:</w:t>
             </w:r>
           </w:p>
           <w:p>
             <w:pPr>
-              <w:spacing w:before="20" w:after="20"/>
+              <w:spacing w:before="20"/>
               <w:ind w:left="216"/>
             </w:pPr>
             <w:r>
               <w:rPr>
+                <w:rFonts w:ascii="Calibri" w:hAnsi="Calibri"/>
                 <w:color w:val="1B3A20"/>
                 <w:sz w:val="20"/>
               </w:rPr>
@@ -781,11 +728,12 @@
           </w:p>
           <w:p>
             <w:pPr>
-              <w:spacing w:before="20" w:after="20"/>
+              <w:spacing w:before="20"/>
               <w:ind w:left="216"/>
             </w:pPr>
             <w:r>
               <w:rPr>
+                <w:rFonts w:ascii="Calibri" w:hAnsi="Calibri"/>
                 <w:color w:val="1B3A20"/>
                 <w:sz w:val="20"/>
               </w:rPr>
@@ -794,11 +742,12 @@
           </w:p>
           <w:p>
             <w:pPr>
-              <w:spacing w:before="20" w:after="20"/>
+              <w:spacing w:before="20"/>
               <w:ind w:left="216"/>
             </w:pPr>
             <w:r>
               <w:rPr>
+                <w:rFonts w:ascii="Calibri" w:hAnsi="Calibri"/>
                 <w:color w:val="1B3A20"/>
                 <w:sz w:val="20"/>
               </w:rPr>
@@ -806,24 +755,26 @@
           </w:p>
           <w:p>
             <w:pPr>
-              <w:spacing w:before="20" w:after="20"/>
+              <w:spacing w:before="20"/>
               <w:ind w:left="216"/>
             </w:pPr>
             <w:r>
               <w:rPr>
+                <w:rFonts w:ascii="Calibri" w:hAnsi="Calibri"/>
                 <w:color w:val="1B3A20"/>
                 <w:sz w:val="20"/>
               </w:rPr>
-              <w:t>NUNCA use: "não conseguimos garantir" / "o médico pode avaliar se é possível".</w:t>
+              <w:t>NUNCA usar: "não conseguimos garantir" / "o médico pode avaliar se é possível".</w:t>
             </w:r>
           </w:p>
           <w:p>
             <w:pPr>
-              <w:spacing w:before="20" w:after="20"/>
+              <w:spacing w:before="20"/>
               <w:ind w:left="216"/>
             </w:pPr>
             <w:r>
               <w:rPr>
+                <w:rFonts w:ascii="Calibri" w:hAnsi="Calibri"/>
                 <w:color w:val="1B3A20"/>
                 <w:sz w:val="20"/>
               </w:rPr>
@@ -841,9 +792,9 @@
     <w:p/>
     <w:p>
       <w:pPr>
-        <w:spacing w:before="40" w:after="40"/>
+        <w:spacing w:before="40" w:after="120"/>
         <w:pBdr>
-          <w:bottom w:val="single" w:sz="4" w:space="1" w:color="CCCCCC"/>
+          <w:bottom w:val="single" w:sz="4" w:space="1" w:color="DDDDDD"/>
         </w:pBdr>
       </w:pPr>
     </w:p>
@@ -869,7 +820,7 @@
             <w:r>
               <w:rPr>
                 <w:b/>
-                <w:color w:val="1B3A6B"/>
+                <w:color w:val="B8460A"/>
                 <w:sz w:val="22"/>
               </w:rPr>
               <w:t xml:space="preserve">2.  </w:t>
@@ -877,10 +828,10 @@
             <w:r>
               <w:rPr>
                 <w:b/>
-                <w:color w:val="1B3A6B"/>
+                <w:color w:val="B8460A"/>
                 <w:sz w:val="22"/>
               </w:rPr>
-              <w:t>V7 — Múltiplas queixas: Clara escolheu grupo sem perguntar</w:t>
+              <w:t>V7 — Múltiplas queixas: Clara escolheu grupo sem perguntar o principal</w:t>
             </w:r>
           </w:p>
         </w:tc>
@@ -915,7 +866,7 @@
         <w:tc>
           <w:tcPr>
             <w:tcW w:type="dxa" w:w="9746"/>
-            <w:shd w:val="clear" w:color="auto" w:fill="F0F0F0"/>
+            <w:shd w:val="clear" w:color="auto" w:fill="F4F4F4"/>
             <w:tcBorders>
               <w:top w:val="single" w:sz="6" w:space="0" w:color="BBBBBB"/>
               <w:bottom w:val="single" w:sz="6" w:space="0" w:color="BBBBBB"/>
@@ -964,11 +915,6 @@
         </w:rPr>
         <w:t xml:space="preserve">COMPORTAMENTO CORRETO:  </w:t>
       </w:r>
-      <w:r>
-        <w:rPr>
-          <w:sz w:val="20"/>
-        </w:rPr>
-      </w:r>
     </w:p>
     <w:p>
       <w:r>
@@ -979,7 +925,7 @@
         <w:br/>
         <w:t>"Qual é o seu principal sintoma agora para eu verificar se consigo te atender por aqui?"</w:t>
         <w:br/>
-        <w:t>Só após receber a resposta, escolher o grupo de triagem.</w:t>
+        <w:t>Só após receber a resposta escolher o grupo de triagem.</w:t>
       </w:r>
     </w:p>
     <w:p/>
@@ -1019,11 +965,12 @@
           </w:p>
           <w:p>
             <w:pPr>
-              <w:spacing w:before="20" w:after="20"/>
+              <w:spacing w:before="20"/>
               <w:ind w:left="216"/>
             </w:pPr>
             <w:r>
               <w:rPr>
+                <w:rFonts w:ascii="Calibri" w:hAnsi="Calibri"/>
                 <w:color w:val="1B3A20"/>
                 <w:sz w:val="20"/>
               </w:rPr>
@@ -1032,11 +979,12 @@
           </w:p>
           <w:p>
             <w:pPr>
-              <w:spacing w:before="20" w:after="20"/>
+              <w:spacing w:before="20"/>
               <w:ind w:left="216"/>
             </w:pPr>
             <w:r>
               <w:rPr>
+                <w:rFonts w:ascii="Calibri" w:hAnsi="Calibri"/>
                 <w:color w:val="1B3A20"/>
                 <w:sz w:val="20"/>
               </w:rPr>
@@ -1044,24 +992,26 @@
           </w:p>
           <w:p>
             <w:pPr>
-              <w:spacing w:before="20" w:after="20"/>
+              <w:spacing w:before="20"/>
               <w:ind w:left="216"/>
             </w:pPr>
             <w:r>
               <w:rPr>
-                <w:color w:val="1B3A20"/>
-                <w:sz w:val="20"/>
+                <w:rFonts w:ascii="Consolas" w:hAnsi="Consolas"/>
+                <w:color w:val="1B5E20"/>
+                <w:sz w:val="18"/>
               </w:rPr>
               <w:t>✅ V7 — MÚLTIPLAS QUEIXAS:</w:t>
             </w:r>
           </w:p>
           <w:p>
             <w:pPr>
-              <w:spacing w:before="20" w:after="20"/>
+              <w:spacing w:before="20"/>
               <w:ind w:left="216"/>
             </w:pPr>
             <w:r>
               <w:rPr>
+                <w:rFonts w:ascii="Calibri" w:hAnsi="Calibri"/>
                 <w:color w:val="1B3A20"/>
                 <w:sz w:val="20"/>
               </w:rPr>
@@ -1070,11 +1020,12 @@
           </w:p>
           <w:p>
             <w:pPr>
-              <w:spacing w:before="20" w:after="20"/>
+              <w:spacing w:before="20"/>
               <w:ind w:left="216"/>
             </w:pPr>
             <w:r>
               <w:rPr>
+                <w:rFonts w:ascii="Calibri" w:hAnsi="Calibri"/>
                 <w:color w:val="1B3A20"/>
                 <w:sz w:val="20"/>
               </w:rPr>
@@ -1083,11 +1034,12 @@
           </w:p>
           <w:p>
             <w:pPr>
-              <w:spacing w:before="20" w:after="20"/>
+              <w:spacing w:before="20"/>
               <w:ind w:left="216"/>
             </w:pPr>
             <w:r>
               <w:rPr>
+                <w:rFonts w:ascii="Calibri" w:hAnsi="Calibri"/>
                 <w:color w:val="1B3A20"/>
                 <w:sz w:val="20"/>
               </w:rPr>
@@ -1096,11 +1048,12 @@
           </w:p>
           <w:p>
             <w:pPr>
-              <w:spacing w:before="20" w:after="20"/>
+              <w:spacing w:before="20"/>
               <w:ind w:left="216"/>
             </w:pPr>
             <w:r>
               <w:rPr>
+                <w:rFonts w:ascii="Calibri" w:hAnsi="Calibri"/>
                 <w:color w:val="1B3A20"/>
                 <w:sz w:val="20"/>
               </w:rPr>
@@ -1109,11 +1062,12 @@
           </w:p>
           <w:p>
             <w:pPr>
-              <w:spacing w:before="20" w:after="20"/>
+              <w:spacing w:before="20"/>
               <w:ind w:left="216"/>
             </w:pPr>
             <w:r>
               <w:rPr>
+                <w:rFonts w:ascii="Calibri" w:hAnsi="Calibri"/>
                 <w:color w:val="1B3A20"/>
                 <w:sz w:val="20"/>
               </w:rPr>
@@ -1122,11 +1076,12 @@
           </w:p>
           <w:p>
             <w:pPr>
-              <w:spacing w:before="20" w:after="20"/>
+              <w:spacing w:before="20"/>
               <w:ind w:left="216"/>
             </w:pPr>
             <w:r>
               <w:rPr>
+                <w:rFonts w:ascii="Calibri" w:hAnsi="Calibri"/>
                 <w:color w:val="1B3A20"/>
                 <w:sz w:val="20"/>
               </w:rPr>
@@ -1134,11 +1089,12 @@
           </w:p>
           <w:p>
             <w:pPr>
-              <w:spacing w:before="20" w:after="20"/>
+              <w:spacing w:before="20"/>
               <w:ind w:left="216"/>
             </w:pPr>
             <w:r>
               <w:rPr>
+                <w:rFonts w:ascii="Calibri" w:hAnsi="Calibri"/>
                 <w:color w:val="1B3A20"/>
                 <w:sz w:val="20"/>
               </w:rPr>
@@ -1147,11 +1103,12 @@
           </w:p>
           <w:p>
             <w:pPr>
-              <w:spacing w:before="20" w:after="20"/>
+              <w:spacing w:before="20"/>
               <w:ind w:left="216"/>
             </w:pPr>
             <w:r>
               <w:rPr>
+                <w:rFonts w:ascii="Calibri" w:hAnsi="Calibri"/>
                 <w:color w:val="1B3A20"/>
                 <w:sz w:val="20"/>
               </w:rPr>
@@ -1160,11 +1117,12 @@
           </w:p>
           <w:p>
             <w:pPr>
-              <w:spacing w:before="20" w:after="20"/>
+              <w:spacing w:before="20"/>
               <w:ind w:left="216"/>
             </w:pPr>
             <w:r>
               <w:rPr>
+                <w:rFonts w:ascii="Calibri" w:hAnsi="Calibri"/>
                 <w:color w:val="1B3A20"/>
                 <w:sz w:val="20"/>
               </w:rPr>
@@ -1182,9 +1140,9 @@
     <w:p/>
     <w:p>
       <w:pPr>
-        <w:spacing w:before="40" w:after="40"/>
+        <w:spacing w:before="40" w:after="120"/>
         <w:pBdr>
-          <w:bottom w:val="single" w:sz="4" w:space="1" w:color="CCCCCC"/>
+          <w:bottom w:val="single" w:sz="4" w:space="1" w:color="DDDDDD"/>
         </w:pBdr>
       </w:pPr>
     </w:p>
@@ -1210,7 +1168,7 @@
             <w:r>
               <w:rPr>
                 <w:b/>
-                <w:color w:val="1B3A6B"/>
+                <w:color w:val="B8460A"/>
                 <w:sz w:val="22"/>
               </w:rPr>
               <w:t xml:space="preserve">3.  </w:t>
@@ -1218,7 +1176,7 @@
             <w:r>
               <w:rPr>
                 <w:b/>
-                <w:color w:val="1B3A6B"/>
+                <w:color w:val="B8460A"/>
                 <w:sz w:val="22"/>
               </w:rPr>
               <w:t>V9 — Atestado de acompanhante: comportamento inconsistente</w:t>
@@ -1236,6 +1194,7 @@
         <w:t>Nos testes de 11/06 o comportamento foi INTERMITENTE: às vezes recusou corretamente, às vezes tratou como consulta normal.</w:t>
       </w:r>
     </w:p>
+    <w:p/>
     <w:p>
       <w:r>
         <w:rPr>
@@ -1264,7 +1223,7 @@
         <w:tc>
           <w:tcPr>
             <w:tcW w:type="dxa" w:w="9746"/>
-            <w:shd w:val="clear" w:color="auto" w:fill="F0F0F0"/>
+            <w:shd w:val="clear" w:color="auto" w:fill="F4F4F4"/>
             <w:tcBorders>
               <w:top w:val="single" w:sz="6" w:space="0" w:color="BBBBBB"/>
               <w:bottom w:val="single" w:sz="6" w:space="0" w:color="BBBBBB"/>
@@ -1283,7 +1242,7 @@
                 <w:color w:val="333333"/>
                 <w:sz w:val="19"/>
               </w:rPr>
-              <w:t>Paciente solicitou atestado de acompanhante.</w:t>
+              <w:t>Paciente:  solicitou atestado de acompanhante.</w:t>
             </w:r>
           </w:p>
           <w:p>
@@ -1297,7 +1256,7 @@
                 <w:color w:val="005AA0"/>
                 <w:sz w:val="19"/>
               </w:rPr>
-              <w:t>Clara:  encaminhou para consulta em vez de recusar  ❌</w:t>
+              <w:t>Clara:     encaminhou para consulta em vez de recusar  ❌</w:t>
             </w:r>
           </w:p>
         </w:tc>
@@ -1313,11 +1272,6 @@
         </w:rPr>
         <w:t xml:space="preserve">COMPORTAMENTO ESPERADO:  </w:t>
       </w:r>
-      <w:r>
-        <w:rPr>
-          <w:sz w:val="20"/>
-        </w:rPr>
-      </w:r>
     </w:p>
     <w:p>
       <w:r>
@@ -1327,7 +1281,7 @@
         <w:t>Qualquer menção a "atestado de acompanhante", "fui acompanhar familiar", "precisei ficar com filho/mãe no hospital" → recusa imediata + encerramento.</w:t>
         <w:br/>
         <w:br/>
-        <w:t>TEXTO EXATO A USAR:</w:t>
+        <w:t>TEXTO EXATO:</w:t>
         <w:br/>
         <w:t>"Infelizmente não emitimos atestado de acompanhante. Esse documento deve ser solicitado diretamente na unidade onde o familiar foi atendido."</w:t>
       </w:r>
@@ -1369,11 +1323,12 @@
           </w:p>
           <w:p>
             <w:pPr>
-              <w:spacing w:before="20" w:after="20"/>
+              <w:spacing w:before="20"/>
               <w:ind w:left="216"/>
             </w:pPr>
             <w:r>
               <w:rPr>
+                <w:rFonts w:ascii="Calibri" w:hAnsi="Calibri"/>
                 <w:color w:val="1B3A20"/>
                 <w:sz w:val="20"/>
               </w:rPr>
@@ -1382,11 +1337,12 @@
           </w:p>
           <w:p>
             <w:pPr>
-              <w:spacing w:before="20" w:after="20"/>
+              <w:spacing w:before="20"/>
               <w:ind w:left="216"/>
             </w:pPr>
             <w:r>
               <w:rPr>
+                <w:rFonts w:ascii="Calibri" w:hAnsi="Calibri"/>
                 <w:color w:val="1B3A20"/>
                 <w:sz w:val="20"/>
               </w:rPr>
@@ -1394,24 +1350,26 @@
           </w:p>
           <w:p>
             <w:pPr>
-              <w:spacing w:before="20" w:after="20"/>
+              <w:spacing w:before="20"/>
               <w:ind w:left="216"/>
             </w:pPr>
             <w:r>
               <w:rPr>
-                <w:color w:val="1B3A20"/>
-                <w:sz w:val="20"/>
+                <w:rFonts w:ascii="Consolas" w:hAnsi="Consolas"/>
+                <w:color w:val="1B5E20"/>
+                <w:sz w:val="18"/>
               </w:rPr>
               <w:t>✅ V9 — ATESTADO DE ACOMPANHANTE:</w:t>
             </w:r>
           </w:p>
           <w:p>
             <w:pPr>
-              <w:spacing w:before="20" w:after="20"/>
+              <w:spacing w:before="20"/>
               <w:ind w:left="216"/>
             </w:pPr>
             <w:r>
               <w:rPr>
+                <w:rFonts w:ascii="Calibri" w:hAnsi="Calibri"/>
                 <w:color w:val="1B3A20"/>
                 <w:sz w:val="20"/>
               </w:rPr>
@@ -1420,11 +1378,12 @@
           </w:p>
           <w:p>
             <w:pPr>
-              <w:spacing w:before="20" w:after="20"/>
+              <w:spacing w:before="20"/>
               <w:ind w:left="216"/>
             </w:pPr>
             <w:r>
               <w:rPr>
+                <w:rFonts w:ascii="Calibri" w:hAnsi="Calibri"/>
                 <w:color w:val="1B3A20"/>
                 <w:sz w:val="20"/>
               </w:rPr>
@@ -1433,11 +1392,12 @@
           </w:p>
           <w:p>
             <w:pPr>
-              <w:spacing w:before="20" w:after="20"/>
+              <w:spacing w:before="20"/>
               <w:ind w:left="216"/>
             </w:pPr>
             <w:r>
               <w:rPr>
+                <w:rFonts w:ascii="Calibri" w:hAnsi="Calibri"/>
                 <w:color w:val="1B3A20"/>
                 <w:sz w:val="20"/>
               </w:rPr>
@@ -1445,11 +1405,12 @@
           </w:p>
           <w:p>
             <w:pPr>
-              <w:spacing w:before="20" w:after="20"/>
+              <w:spacing w:before="20"/>
               <w:ind w:left="216"/>
             </w:pPr>
             <w:r>
               <w:rPr>
+                <w:rFonts w:ascii="Calibri" w:hAnsi="Calibri"/>
                 <w:color w:val="1B3A20"/>
                 <w:sz w:val="20"/>
               </w:rPr>
@@ -1458,7 +1419,7 @@
           </w:p>
           <w:p>
             <w:pPr>
-              <w:spacing w:before="20" w:after="20"/>
+              <w:spacing w:before="20"/>
               <w:ind w:left="216"/>
             </w:pPr>
             <w:r>
@@ -1472,11 +1433,12 @@
           </w:p>
           <w:p>
             <w:pPr>
-              <w:spacing w:before="20" w:after="20"/>
+              <w:spacing w:before="20"/>
               <w:ind w:left="216"/>
             </w:pPr>
             <w:r>
               <w:rPr>
+                <w:rFonts w:ascii="Calibri" w:hAnsi="Calibri"/>
                 <w:color w:val="1B3A20"/>
                 <w:sz w:val="20"/>
               </w:rPr>
@@ -1485,11 +1447,12 @@
           </w:p>
           <w:p>
             <w:pPr>
-              <w:spacing w:before="20" w:after="20"/>
+              <w:spacing w:before="20"/>
               <w:ind w:left="216"/>
             </w:pPr>
             <w:r>
               <w:rPr>
+                <w:rFonts w:ascii="Calibri" w:hAnsi="Calibri"/>
                 <w:color w:val="1B3A20"/>
                 <w:sz w:val="20"/>
               </w:rPr>
@@ -1498,7 +1461,7 @@
           </w:p>
           <w:p>
             <w:pPr>
-              <w:spacing w:before="20" w:after="20"/>
+              <w:spacing w:before="20"/>
               <w:ind w:left="216"/>
             </w:pPr>
             <w:r>
@@ -1512,11 +1475,12 @@
           </w:p>
           <w:p>
             <w:pPr>
-              <w:spacing w:before="20" w:after="20"/>
+              <w:spacing w:before="20"/>
               <w:ind w:left="216"/>
             </w:pPr>
             <w:r>
               <w:rPr>
+                <w:rFonts w:ascii="Calibri" w:hAnsi="Calibri"/>
                 <w:color w:val="1B3A20"/>
                 <w:sz w:val="20"/>
               </w:rPr>
@@ -1524,13 +1488,14 @@
           </w:p>
           <w:p>
             <w:pPr>
-              <w:spacing w:before="20" w:after="20"/>
+              <w:spacing w:before="20"/>
               <w:ind w:left="216"/>
             </w:pPr>
             <w:r>
               <w:rPr>
-                <w:color w:val="1B3A20"/>
-                <w:sz w:val="20"/>
+                <w:rFonts w:ascii="Consolas" w:hAnsi="Consolas"/>
+                <w:color w:val="1B5E20"/>
+                <w:sz w:val="18"/>
               </w:rPr>
               <w:t>⚠ Revisar similaridade semântica — comportamento não pode ser intermitente.</w:t>
             </w:r>
@@ -1546,9 +1511,9 @@
     <w:p/>
     <w:p>
       <w:pPr>
-        <w:spacing w:before="40" w:after="40"/>
+        <w:spacing w:before="40" w:after="120"/>
         <w:pBdr>
-          <w:bottom w:val="single" w:sz="4" w:space="1" w:color="CCCCCC"/>
+          <w:bottom w:val="single" w:sz="4" w:space="1" w:color="DDDDDD"/>
         </w:pBdr>
       </w:pPr>
     </w:p>
@@ -1574,7 +1539,7 @@
             <w:r>
               <w:rPr>
                 <w:b/>
-                <w:color w:val="1B3A6B"/>
+                <w:color w:val="B8460A"/>
                 <w:sz w:val="22"/>
               </w:rPr>
               <w:t xml:space="preserve">4.  </w:t>
@@ -1582,7 +1547,7 @@
             <w:r>
               <w:rPr>
                 <w:b/>
-                <w:color w:val="1B3A6B"/>
+                <w:color w:val="B8460A"/>
                 <w:sz w:val="22"/>
               </w:rPr>
               <w:t>V6 — Emagrecimento: passo extra desnecessário</w:t>
@@ -1601,22 +1566,18 @@
         </w:rPr>
         <w:t xml:space="preserve">O QUE ACONTECEU:  </w:t>
       </w:r>
-      <w:r>
-        <w:rPr>
-          <w:sz w:val="20"/>
-        </w:rPr>
-      </w:r>
     </w:p>
     <w:p>
       <w:r>
         <w:rPr>
           <w:sz w:val="20"/>
         </w:rPr>
-        <w:t>Clara redirecionou corretamente para Consulta de Controle de Peso R$249 ✅, mas inseriu pergunta extra desnecessária:</w:t>
+        <w:t>Clara redirecionou corretamente para Consulta de Controle de Peso R$249 ✅, mas inseriu uma pergunta extra desnecessária antes de redirecionar:</w:t>
         <w:br/>
         <w:t>"além do peso, você está com algum sintoma físico agora?"</w:t>
       </w:r>
     </w:p>
+    <w:p/>
     <w:p>
       <w:r>
         <w:rPr>
@@ -1625,11 +1586,6 @@
           <w:sz w:val="20"/>
         </w:rPr>
         <w:t xml:space="preserve">COMPORTAMENTO ESPERADO:  </w:t>
-      </w:r>
-      <w:r>
-        <w:rPr>
-          <w:sz w:val="20"/>
-        </w:rPr>
       </w:r>
     </w:p>
     <w:p>
@@ -1679,11 +1635,12 @@
           </w:p>
           <w:p>
             <w:pPr>
-              <w:spacing w:before="20" w:after="20"/>
+              <w:spacing w:before="20"/>
               <w:ind w:left="216"/>
             </w:pPr>
             <w:r>
               <w:rPr>
+                <w:rFonts w:ascii="Calibri" w:hAnsi="Calibri"/>
                 <w:color w:val="1B3A20"/>
                 <w:sz w:val="20"/>
               </w:rPr>
@@ -1692,11 +1649,12 @@
           </w:p>
           <w:p>
             <w:pPr>
-              <w:spacing w:before="20" w:after="20"/>
+              <w:spacing w:before="20"/>
               <w:ind w:left="216"/>
             </w:pPr>
             <w:r>
               <w:rPr>
+                <w:rFonts w:ascii="Calibri" w:hAnsi="Calibri"/>
                 <w:color w:val="1B3A20"/>
                 <w:sz w:val="20"/>
               </w:rPr>
@@ -1704,24 +1662,26 @@
           </w:p>
           <w:p>
             <w:pPr>
-              <w:spacing w:before="20" w:after="20"/>
+              <w:spacing w:before="20"/>
               <w:ind w:left="216"/>
             </w:pPr>
             <w:r>
               <w:rPr>
-                <w:color w:val="1B3A20"/>
-                <w:sz w:val="20"/>
+                <w:rFonts w:ascii="Consolas" w:hAnsi="Consolas"/>
+                <w:color w:val="1B5E20"/>
+                <w:sz w:val="18"/>
               </w:rPr>
               <w:t>✅ V6 — EMAGRECIMENTO / PESO:</w:t>
             </w:r>
           </w:p>
           <w:p>
             <w:pPr>
-              <w:spacing w:before="20" w:after="20"/>
+              <w:spacing w:before="20"/>
               <w:ind w:left="216"/>
             </w:pPr>
             <w:r>
               <w:rPr>
+                <w:rFonts w:ascii="Calibri" w:hAnsi="Calibri"/>
                 <w:color w:val="1B3A20"/>
                 <w:sz w:val="20"/>
               </w:rPr>
@@ -1730,24 +1690,26 @@
           </w:p>
           <w:p>
             <w:pPr>
-              <w:spacing w:before="20" w:after="20"/>
+              <w:spacing w:before="20"/>
               <w:ind w:left="216"/>
             </w:pPr>
             <w:r>
               <w:rPr>
+                <w:rFonts w:ascii="Calibri" w:hAnsi="Calibri"/>
                 <w:color w:val="1B3A20"/>
                 <w:sz w:val="20"/>
               </w:rPr>
-              <w:t>"controle de peso" / "tratamento para peso" / "quero emagrecer"</w:t>
+              <w:t>"controle de peso" / "tratamento para peso"</w:t>
             </w:r>
           </w:p>
           <w:p>
             <w:pPr>
-              <w:spacing w:before="20" w:after="20"/>
+              <w:spacing w:before="20"/>
               <w:ind w:left="216"/>
             </w:pPr>
             <w:r>
               <w:rPr>
+                <w:rFonts w:ascii="Calibri" w:hAnsi="Calibri"/>
                 <w:color w:val="1B3A20"/>
                 <w:sz w:val="20"/>
               </w:rPr>
@@ -1755,11 +1717,12 @@
           </w:p>
           <w:p>
             <w:pPr>
-              <w:spacing w:before="20" w:after="20"/>
+              <w:spacing w:before="20"/>
               <w:ind w:left="216"/>
             </w:pPr>
             <w:r>
               <w:rPr>
+                <w:rFonts w:ascii="Calibri" w:hAnsi="Calibri"/>
                 <w:color w:val="1B3A20"/>
                 <w:sz w:val="20"/>
               </w:rPr>
@@ -1768,7 +1731,7 @@
           </w:p>
           <w:p>
             <w:pPr>
-              <w:spacing w:before="20" w:after="20"/>
+              <w:spacing w:before="20"/>
               <w:ind w:left="216"/>
             </w:pPr>
             <w:r>
@@ -1782,7 +1745,7 @@
           </w:p>
           <w:p>
             <w:pPr>
-              <w:spacing w:before="20" w:after="20"/>
+              <w:spacing w:before="20"/>
               <w:ind w:left="216"/>
             </w:pPr>
             <w:r>
@@ -1796,7 +1759,7 @@
           </w:p>
           <w:p>
             <w:pPr>
-              <w:spacing w:before="20" w:after="20"/>
+              <w:spacing w:before="20"/>
               <w:ind w:left="216"/>
             </w:pPr>
             <w:r>
@@ -1810,11 +1773,12 @@
           </w:p>
           <w:p>
             <w:pPr>
-              <w:spacing w:before="20" w:after="20"/>
+              <w:spacing w:before="20"/>
               <w:ind w:left="216"/>
             </w:pPr>
             <w:r>
               <w:rPr>
+                <w:rFonts w:ascii="Calibri" w:hAnsi="Calibri"/>
                 <w:color w:val="1B3A20"/>
                 <w:sz w:val="20"/>
               </w:rPr>
@@ -1823,11 +1787,12 @@
           </w:p>
           <w:p>
             <w:pPr>
-              <w:spacing w:before="20" w:after="20"/>
+              <w:spacing w:before="20"/>
               <w:ind w:left="216"/>
             </w:pPr>
             <w:r>
               <w:rPr>
+                <w:rFonts w:ascii="Calibri" w:hAnsi="Calibri"/>
                 <w:color w:val="1B3A20"/>
                 <w:sz w:val="20"/>
               </w:rPr>
@@ -1836,11 +1801,12 @@
           </w:p>
           <w:p>
             <w:pPr>
-              <w:spacing w:before="20" w:after="20"/>
+              <w:spacing w:before="20"/>
               <w:ind w:left="216"/>
             </w:pPr>
             <w:r>
               <w:rPr>
+                <w:rFonts w:ascii="Calibri" w:hAnsi="Calibri"/>
                 <w:color w:val="1B3A20"/>
                 <w:sz w:val="20"/>
               </w:rPr>
@@ -1848,15 +1814,16 @@
           </w:p>
           <w:p>
             <w:pPr>
-              <w:spacing w:before="20" w:after="20"/>
+              <w:spacing w:before="20"/>
               <w:ind w:left="216"/>
             </w:pPr>
             <w:r>
               <w:rPr>
-                <w:color w:val="1B3A20"/>
-                <w:sz w:val="20"/>
+                <w:rFonts w:ascii="Consolas" w:hAnsi="Consolas"/>
+                <w:color w:val="1B5E20"/>
+                <w:sz w:val="18"/>
               </w:rPr>
-              <w:t>⚠ Atenção financeira: cada paciente encaminhado errado = perda de R$170/consulta.</w:t>
+              <w:t>⚠ Atenção: cada paciente encaminhado errado = perda de R$170 por consulta.</w:t>
             </w:r>
           </w:p>
           <w:p>
@@ -1868,1701 +1835,6 @@
       </w:tr>
     </w:tbl>
     <w:p/>
-    <w:p>
-      <w:r>
-        <w:br w:type="page"/>
-      </w:r>
-    </w:p>
-    <w:tbl>
-      <w:tblPr>
-        <w:tblW w:type="auto" w:w="0"/>
-        <w:jc w:val="center"/>
-        <w:tblLook w:firstColumn="1" w:firstRow="1" w:lastColumn="0" w:lastRow="0" w:noHBand="0" w:noVBand="1" w:val="04A0"/>
-      </w:tblPr>
-      <w:tblGrid>
-        <w:gridCol w:w="9746"/>
-      </w:tblGrid>
-      <w:tr>
-        <w:tc>
-          <w:tcPr>
-            <w:tcW w:type="dxa" w:w="9360"/>
-            <w:shd w:val="clear" w:color="auto" w:fill="1B3A6B"/>
-          </w:tcPr>
-          <w:p>
-            <w:pPr>
-              <w:spacing w:before="140" w:after="140"/>
-              <w:ind w:left="216"/>
-              <w:jc w:val="left"/>
-            </w:pPr>
-            <w:r>
-              <w:rPr>
-                <w:b/>
-                <w:color w:val="FFFFFF"/>
-                <w:sz w:val="24"/>
-              </w:rPr>
-              <w:t xml:space="preserve">  PARTE 2   WORKFLOW DE FOLLOW-UP  (n8n)</w:t>
-            </w:r>
-          </w:p>
-        </w:tc>
-      </w:tr>
-    </w:tbl>
-    <w:p/>
-    <w:tbl>
-      <w:tblPr>
-        <w:tblW w:type="auto" w:w="0"/>
-        <w:tblLook w:firstColumn="1" w:firstRow="1" w:lastColumn="0" w:lastRow="0" w:noHBand="0" w:noVBand="1" w:val="04A0"/>
-      </w:tblPr>
-      <w:tblGrid>
-        <w:gridCol w:w="9746"/>
-      </w:tblGrid>
-      <w:tr>
-        <w:tc>
-          <w:tcPr>
-            <w:tcW w:type="dxa" w:w="9746"/>
-            <w:shd w:val="clear" w:color="auto" w:fill="D6E4F7"/>
-          </w:tcPr>
-          <w:p>
-            <w:pPr>
-              <w:spacing w:before="100" w:after="100"/>
-              <w:ind w:left="173"/>
-            </w:pPr>
-            <w:r>
-              <w:rPr>
-                <w:b/>
-                <w:color w:val="1B3A6B"/>
-                <w:sz w:val="22"/>
-              </w:rPr>
-              <w:t xml:space="preserve">5.  </w:t>
-            </w:r>
-            <w:r>
-              <w:rPr>
-                <w:b/>
-                <w:color w:val="1B3A6B"/>
-                <w:sz w:val="22"/>
-              </w:rPr>
-              <w:t>[NOME DO CLIENTE] aparece como texto literal</w:t>
-            </w:r>
-          </w:p>
-        </w:tc>
-      </w:tr>
-    </w:tbl>
-    <w:p/>
-    <w:p>
-      <w:r>
-        <w:rPr>
-          <w:b/>
-          <w:color w:val="C00000"/>
-          <w:sz w:val="20"/>
-        </w:rPr>
-        <w:t xml:space="preserve">MENSAGEM ENVIADA:  </w:t>
-      </w:r>
-      <w:r>
-        <w:rPr>
-          <w:sz w:val="20"/>
-        </w:rPr>
-      </w:r>
-    </w:p>
-    <w:tbl>
-      <w:tblPr>
-        <w:tblW w:type="auto" w:w="0"/>
-        <w:tblLook w:firstColumn="1" w:firstRow="1" w:lastColumn="0" w:lastRow="0" w:noHBand="0" w:noVBand="1" w:val="04A0"/>
-      </w:tblPr>
-      <w:tblGrid>
-        <w:gridCol w:w="9746"/>
-      </w:tblGrid>
-      <w:tr>
-        <w:tc>
-          <w:tcPr>
-            <w:tcW w:type="dxa" w:w="9746"/>
-            <w:shd w:val="clear" w:color="auto" w:fill="F0F0F0"/>
-            <w:tcBorders>
-              <w:top w:val="single" w:sz="6" w:space="0" w:color="BBBBBB"/>
-              <w:bottom w:val="single" w:sz="6" w:space="0" w:color="BBBBBB"/>
-              <w:left w:val="single" w:sz="6" w:space="0" w:color="BBBBBB"/>
-              <w:right w:val="single" w:sz="6" w:space="0" w:color="BBBBBB"/>
-            </w:tcBorders>
-          </w:tcPr>
-          <w:p>
-            <w:pPr>
-              <w:spacing w:before="20" w:after="20"/>
-              <w:ind w:left="144"/>
-            </w:pPr>
-            <w:r>
-              <w:rPr>
-                <w:rFonts w:ascii="Consolas" w:hAnsi="Consolas"/>
-                <w:color w:val="B00000"/>
-                <w:sz w:val="19"/>
-              </w:rPr>
-              <w:t>"Olá, [NOME DO CLIENTE]. Eu entendo que estar acima do peso pode ser frustrante..."  ❌</w:t>
-            </w:r>
-          </w:p>
-        </w:tc>
-      </w:tr>
-    </w:tbl>
-    <w:p/>
-    <w:p>
-      <w:r>
-        <w:rPr>
-          <w:sz w:val="20"/>
-        </w:rPr>
-        <w:t>A variável de nome não foi substituída. O paciente recebeu o placeholder literal — extremamente prejudicial à imagem da clínica.</w:t>
-      </w:r>
-    </w:p>
-    <w:tbl>
-      <w:tblPr>
-        <w:tblW w:type="auto" w:w="0"/>
-        <w:tblLook w:firstColumn="1" w:firstRow="1" w:lastColumn="0" w:lastRow="0" w:noHBand="0" w:noVBand="1" w:val="04A0"/>
-      </w:tblPr>
-      <w:tblGrid>
-        <w:gridCol w:w="9746"/>
-      </w:tblGrid>
-      <w:tr>
-        <w:tc>
-          <w:tcPr>
-            <w:tcW w:type="dxa" w:w="9746"/>
-            <w:shd w:val="clear" w:color="auto" w:fill="EAF4EA"/>
-            <w:tcBorders>
-              <w:top w:val="single" w:sz="8" w:space="0" w:color="2E7D32"/>
-              <w:bottom w:val="single" w:sz="8" w:space="0" w:color="2E7D32"/>
-              <w:left w:val="single" w:sz="8" w:space="0" w:color="2E7D32"/>
-              <w:right w:val="single" w:sz="8" w:space="0" w:color="2E7D32"/>
-            </w:tcBorders>
-          </w:tcPr>
-          <w:p>
-            <w:pPr>
-              <w:spacing w:before="100"/>
-              <w:ind w:left="173"/>
-            </w:pPr>
-            <w:r>
-              <w:rPr>
-                <w:b/>
-                <w:color w:val="1B5E20"/>
-                <w:sz w:val="20"/>
-              </w:rPr>
-              <w:t>⚙  AÇÃO TÉCNICA — n8n — Nó de template do follow-up</w:t>
-            </w:r>
-          </w:p>
-          <w:p>
-            <w:pPr>
-              <w:spacing w:before="20" w:after="20"/>
-              <w:ind w:left="216"/>
-            </w:pPr>
-            <w:r>
-              <w:rPr>
-                <w:color w:val="1B3A20"/>
-                <w:sz w:val="20"/>
-              </w:rPr>
-              <w:t>No nó que monta o texto do follow-up, adicionar verificação:</w:t>
-            </w:r>
-          </w:p>
-          <w:p>
-            <w:pPr>
-              <w:spacing w:before="20" w:after="20"/>
-              <w:ind w:left="216"/>
-            </w:pPr>
-            <w:r>
-              <w:rPr>
-                <w:color w:val="1B3A20"/>
-                <w:sz w:val="20"/>
-              </w:rPr>
-            </w:r>
-          </w:p>
-          <w:p>
-            <w:pPr>
-              <w:spacing w:before="20" w:after="20"/>
-              <w:ind w:left="216"/>
-            </w:pPr>
-            <w:r>
-              <w:rPr>
-                <w:rFonts w:ascii="Consolas" w:hAnsi="Consolas"/>
-                <w:color w:val="1B5E20"/>
-                <w:sz w:val="18"/>
-              </w:rPr>
-              <w:t>const nome = $json.nome || '';</w:t>
-            </w:r>
-          </w:p>
-          <w:p>
-            <w:pPr>
-              <w:spacing w:before="20" w:after="20"/>
-              <w:ind w:left="216"/>
-            </w:pPr>
-            <w:r>
-              <w:rPr>
-                <w:rFonts w:ascii="Consolas" w:hAnsi="Consolas"/>
-                <w:color w:val="1B5E20"/>
-                <w:sz w:val="18"/>
-              </w:rPr>
-              <w:t>const saudacao = nome ? `Olá, ${nome}!` : 'Olá!';</w:t>
-            </w:r>
-          </w:p>
-          <w:p>
-            <w:pPr>
-              <w:spacing w:before="20" w:after="20"/>
-              <w:ind w:left="216"/>
-            </w:pPr>
-            <w:r>
-              <w:rPr>
-                <w:color w:val="1B3A20"/>
-                <w:sz w:val="20"/>
-              </w:rPr>
-            </w:r>
-          </w:p>
-          <w:p>
-            <w:pPr>
-              <w:spacing w:before="20" w:after="20"/>
-              <w:ind w:left="216"/>
-            </w:pPr>
-            <w:r>
-              <w:rPr>
-                <w:rFonts w:ascii="Consolas" w:hAnsi="Consolas"/>
-                <w:color w:val="1B5E20"/>
-                <w:sz w:val="18"/>
-              </w:rPr>
-              <w:t>// Usar "saudacao" no início de todas as mensagens de follow-up.</w:t>
-            </w:r>
-          </w:p>
-          <w:p>
-            <w:pPr>
-              <w:spacing w:before="20" w:after="20"/>
-              <w:ind w:left="216"/>
-            </w:pPr>
-            <w:r>
-              <w:rPr>
-                <w:rFonts w:ascii="Consolas" w:hAnsi="Consolas"/>
-                <w:color w:val="1B5E20"/>
-                <w:sz w:val="18"/>
-              </w:rPr>
-              <w:t>// NUNCA interpoler {{nome}} diretamente sem checar se existe.</w:t>
-            </w:r>
-          </w:p>
-          <w:p>
-            <w:pPr>
-              <w:spacing w:after="80"/>
-            </w:pPr>
-          </w:p>
-        </w:tc>
-      </w:tr>
-    </w:tbl>
-    <w:p/>
-    <w:p>
-      <w:pPr>
-        <w:spacing w:before="40" w:after="40"/>
-        <w:pBdr>
-          <w:bottom w:val="single" w:sz="4" w:space="1" w:color="CCCCCC"/>
-        </w:pBdr>
-      </w:pPr>
-    </w:p>
-    <w:tbl>
-      <w:tblPr>
-        <w:tblW w:type="auto" w:w="0"/>
-        <w:tblLook w:firstColumn="1" w:firstRow="1" w:lastColumn="0" w:lastRow="0" w:noHBand="0" w:noVBand="1" w:val="04A0"/>
-      </w:tblPr>
-      <w:tblGrid>
-        <w:gridCol w:w="9746"/>
-      </w:tblGrid>
-      <w:tr>
-        <w:tc>
-          <w:tcPr>
-            <w:tcW w:type="dxa" w:w="9746"/>
-            <w:shd w:val="clear" w:color="auto" w:fill="D6E4F7"/>
-          </w:tcPr>
-          <w:p>
-            <w:pPr>
-              <w:spacing w:before="100" w:after="100"/>
-              <w:ind w:left="173"/>
-            </w:pPr>
-            <w:r>
-              <w:rPr>
-                <w:b/>
-                <w:color w:val="1B3A6B"/>
-                <w:sz w:val="22"/>
-              </w:rPr>
-              <w:t xml:space="preserve">6.  </w:t>
-            </w:r>
-            <w:r>
-              <w:rPr>
-                <w:b/>
-                <w:color w:val="1B3A6B"/>
-                <w:sz w:val="22"/>
-              </w:rPr>
-              <w:t>Follow-up enviado após paciente dizer NÃO explicitamente</w:t>
-            </w:r>
-          </w:p>
-        </w:tc>
-      </w:tr>
-    </w:tbl>
-    <w:p/>
-    <w:p>
-      <w:r>
-        <w:rPr>
-          <w:b/>
-          <w:color w:val="1B3A6B"/>
-          <w:sz w:val="20"/>
-        </w:rPr>
-        <w:t xml:space="preserve">REGRA QUE DEVE EXISTIR:  </w:t>
-      </w:r>
-      <w:r>
-        <w:rPr>
-          <w:sz w:val="20"/>
-        </w:rPr>
-      </w:r>
-    </w:p>
-    <w:p>
-      <w:pPr>
-        <w:ind w:left="288"/>
-      </w:pPr>
-    </w:p>
-    <w:p>
-      <w:pPr>
-        <w:ind w:left="360"/>
-      </w:pPr>
-      <w:r>
-        <w:rPr>
-          <w:sz w:val="20"/>
-        </w:rPr>
-        <w:t>1.  Responder com encerramento gentil ("Sem problemas! Sempre que precisar pode nos chamar 🧡")</w:t>
-      </w:r>
-    </w:p>
-    <w:p>
-      <w:pPr>
-        <w:ind w:left="360"/>
-      </w:pPr>
-      <w:r>
-        <w:rPr>
-          <w:sz w:val="20"/>
-        </w:rPr>
-        <w:t>2.  Cancelar TODOS os follow-ups agendados para aquele contato</w:t>
-      </w:r>
-    </w:p>
-    <w:p>
-      <w:pPr>
-        <w:ind w:left="360"/>
-      </w:pPr>
-      <w:r>
-        <w:rPr>
-          <w:sz w:val="20"/>
-        </w:rPr>
-        <w:t>3.  Não enviar mais nenhuma mensagem automática</w:t>
-      </w:r>
-    </w:p>
-    <w:p/>
-    <w:p>
-      <w:r>
-        <w:rPr>
-          <w:b/>
-          <w:color w:val="770000"/>
-          <w:sz w:val="20"/>
-        </w:rPr>
-        <w:t xml:space="preserve">CASO 1  </w:t>
-      </w:r>
-      <w:r>
-        <w:rPr>
-          <w:sz w:val="20"/>
-        </w:rPr>
-        <w:t>Leandro — 11/06/2026</w:t>
-      </w:r>
-    </w:p>
-    <w:tbl>
-      <w:tblPr>
-        <w:tblW w:type="auto" w:w="0"/>
-        <w:tblLook w:firstColumn="1" w:firstRow="1" w:lastColumn="0" w:lastRow="0" w:noHBand="0" w:noVBand="1" w:val="04A0"/>
-      </w:tblPr>
-      <w:tblGrid>
-        <w:gridCol w:w="9746"/>
-      </w:tblGrid>
-      <w:tr>
-        <w:tc>
-          <w:tcPr>
-            <w:tcW w:type="dxa" w:w="9746"/>
-            <w:shd w:val="clear" w:color="auto" w:fill="F0F0F0"/>
-            <w:tcBorders>
-              <w:top w:val="single" w:sz="6" w:space="0" w:color="BBBBBB"/>
-              <w:bottom w:val="single" w:sz="6" w:space="0" w:color="BBBBBB"/>
-              <w:left w:val="single" w:sz="6" w:space="0" w:color="BBBBBB"/>
-              <w:right w:val="single" w:sz="6" w:space="0" w:color="BBBBBB"/>
-            </w:tcBorders>
-          </w:tcPr>
-          <w:p>
-            <w:pPr>
-              <w:spacing w:before="20" w:after="20"/>
-              <w:ind w:left="144"/>
-            </w:pPr>
-            <w:r>
-              <w:rPr>
-                <w:rFonts w:ascii="Consolas" w:hAnsi="Consolas"/>
-                <w:color w:val="333333"/>
-                <w:sz w:val="19"/>
-              </w:rPr>
-              <w:t>07:51  Paciente:  NÃO (não quer marcar)</w:t>
-            </w:r>
-          </w:p>
-          <w:p>
-            <w:pPr>
-              <w:spacing w:before="20" w:after="20"/>
-              <w:ind w:left="144"/>
-            </w:pPr>
-            <w:r>
-              <w:rPr>
-                <w:rFonts w:ascii="Consolas" w:hAnsi="Consolas"/>
-                <w:color w:val="1A6B1A"/>
-                <w:sz w:val="19"/>
-              </w:rPr>
-              <w:t>07:51  Clara:     "Sem problemas! Sempre que precisar pode nos chamar. 🧡"  ✅</w:t>
-            </w:r>
-          </w:p>
-          <w:p>
-            <w:pPr>
-              <w:spacing w:before="20" w:after="20"/>
-              <w:ind w:left="144"/>
-            </w:pPr>
-            <w:r>
-              <w:rPr>
-                <w:rFonts w:ascii="Consolas" w:hAnsi="Consolas"/>
-                <w:color w:val="B00000"/>
-                <w:sz w:val="19"/>
-              </w:rPr>
-              <w:t>09:01  Clara:     novo follow-up sobre atestado  ❌  — ignorou o NÃO anterior</w:t>
-            </w:r>
-          </w:p>
-        </w:tc>
-      </w:tr>
-    </w:tbl>
-    <w:p/>
-    <w:p>
-      <w:r>
-        <w:rPr>
-          <w:b/>
-          <w:color w:val="770000"/>
-          <w:sz w:val="20"/>
-        </w:rPr>
-        <w:t xml:space="preserve">CASO 2  </w:t>
-      </w:r>
-      <w:r>
-        <w:rPr>
-          <w:sz w:val="20"/>
-        </w:rPr>
-        <w:t>Danielle — 09 e 10/06/2026</w:t>
-      </w:r>
-    </w:p>
-    <w:tbl>
-      <w:tblPr>
-        <w:tblW w:type="auto" w:w="0"/>
-        <w:tblLook w:firstColumn="1" w:firstRow="1" w:lastColumn="0" w:lastRow="0" w:noHBand="0" w:noVBand="1" w:val="04A0"/>
-      </w:tblPr>
-      <w:tblGrid>
-        <w:gridCol w:w="9746"/>
-      </w:tblGrid>
-      <w:tr>
-        <w:tc>
-          <w:tcPr>
-            <w:tcW w:type="dxa" w:w="9746"/>
-            <w:shd w:val="clear" w:color="auto" w:fill="F0F0F0"/>
-            <w:tcBorders>
-              <w:top w:val="single" w:sz="6" w:space="0" w:color="BBBBBB"/>
-              <w:bottom w:val="single" w:sz="6" w:space="0" w:color="BBBBBB"/>
-              <w:left w:val="single" w:sz="6" w:space="0" w:color="BBBBBB"/>
-              <w:right w:val="single" w:sz="6" w:space="0" w:color="BBBBBB"/>
-            </w:tcBorders>
-          </w:tcPr>
-          <w:p>
-            <w:pPr>
-              <w:spacing w:before="20" w:after="20"/>
-              <w:ind w:left="144"/>
-            </w:pPr>
-            <w:r>
-              <w:rPr>
-                <w:rFonts w:ascii="Consolas" w:hAnsi="Consolas"/>
-                <w:color w:val="333333"/>
-                <w:sz w:val="19"/>
-              </w:rPr>
-              <w:t>08:57 09/06  Paciente:  "Não" (ao continuar)</w:t>
-            </w:r>
-          </w:p>
-          <w:p>
-            <w:pPr>
-              <w:spacing w:before="20" w:after="20"/>
-              <w:ind w:left="144"/>
-            </w:pPr>
-            <w:r>
-              <w:rPr>
-                <w:rFonts w:ascii="Consolas" w:hAnsi="Consolas"/>
-                <w:color w:val="1A6B1A"/>
-                <w:sz w:val="19"/>
-              </w:rPr>
-              <w:t>08:58 09/06  Clara:     "Sem problemas! Sempre que precisar pode nos chamar. 🧡"  ✅</w:t>
-            </w:r>
-          </w:p>
-          <w:p>
-            <w:pPr>
-              <w:spacing w:before="20" w:after="20"/>
-              <w:ind w:left="144"/>
-            </w:pPr>
-            <w:r>
-              <w:rPr>
-                <w:rFonts w:ascii="Consolas" w:hAnsi="Consolas"/>
-                <w:color w:val="B00000"/>
-                <w:sz w:val="19"/>
-              </w:rPr>
-              <w:t>09:11 09/06  Clara:     1º follow-up  ❌</w:t>
-            </w:r>
-          </w:p>
-          <w:p>
-            <w:pPr>
-              <w:spacing w:before="20" w:after="20"/>
-              <w:ind w:left="144"/>
-            </w:pPr>
-            <w:r>
-              <w:rPr>
-                <w:rFonts w:ascii="Consolas" w:hAnsi="Consolas"/>
-                <w:color w:val="B00000"/>
-                <w:sz w:val="19"/>
-              </w:rPr>
-              <w:t>10:01 09/06  Clara:     2º follow-up  ❌</w:t>
-            </w:r>
-          </w:p>
-          <w:p>
-            <w:pPr>
-              <w:spacing w:before="20" w:after="20"/>
-              <w:ind w:left="144"/>
-            </w:pPr>
-            <w:r>
-              <w:rPr>
-                <w:rFonts w:ascii="Consolas" w:hAnsi="Consolas"/>
-                <w:color w:val="B00000"/>
-                <w:sz w:val="19"/>
-              </w:rPr>
-              <w:t>09:01 10/06  Clara:     3º follow-up (dia seguinte!)  ❌</w:t>
-            </w:r>
-          </w:p>
-          <w:p>
-            <w:pPr>
-              <w:spacing w:before="20" w:after="20"/>
-              <w:ind w:left="144"/>
-            </w:pPr>
-            <w:r>
-              <w:rPr>
-                <w:rFonts w:ascii="Consolas" w:hAnsi="Consolas"/>
-                <w:color w:val="333333"/>
-                <w:sz w:val="19"/>
-              </w:rPr>
-              <w:t>Total: 3 follow-ups após NÃO explícito, em 2 dias diferentes.</w:t>
-            </w:r>
-          </w:p>
-        </w:tc>
-      </w:tr>
-    </w:tbl>
-    <w:p/>
-    <w:tbl>
-      <w:tblPr>
-        <w:tblW w:type="auto" w:w="0"/>
-        <w:tblLook w:firstColumn="1" w:firstRow="1" w:lastColumn="0" w:lastRow="0" w:noHBand="0" w:noVBand="1" w:val="04A0"/>
-      </w:tblPr>
-      <w:tblGrid>
-        <w:gridCol w:w="9746"/>
-      </w:tblGrid>
-      <w:tr>
-        <w:tc>
-          <w:tcPr>
-            <w:tcW w:type="dxa" w:w="9746"/>
-            <w:shd w:val="clear" w:color="auto" w:fill="EAF4EA"/>
-            <w:tcBorders>
-              <w:top w:val="single" w:sz="8" w:space="0" w:color="2E7D32"/>
-              <w:bottom w:val="single" w:sz="8" w:space="0" w:color="2E7D32"/>
-              <w:left w:val="single" w:sz="8" w:space="0" w:color="2E7D32"/>
-              <w:right w:val="single" w:sz="8" w:space="0" w:color="2E7D32"/>
-            </w:tcBorders>
-          </w:tcPr>
-          <w:p>
-            <w:pPr>
-              <w:spacing w:before="100"/>
-              <w:ind w:left="173"/>
-            </w:pPr>
-            <w:r>
-              <w:rPr>
-                <w:b/>
-                <w:color w:val="1B5E20"/>
-                <w:sz w:val="20"/>
-              </w:rPr>
-              <w:t>⚙  AÇÃO TÉCNICA — n8n — Workflow de follow-up + Supabase</w:t>
-            </w:r>
-          </w:p>
-          <w:p>
-            <w:pPr>
-              <w:spacing w:before="20" w:after="20"/>
-              <w:ind w:left="216"/>
-            </w:pPr>
-            <w:r>
-              <w:rPr>
-                <w:color w:val="1B3A20"/>
-                <w:sz w:val="20"/>
-              </w:rPr>
-              <w:t>Adicionar condição no INÍCIO do workflow de follow-up:</w:t>
-            </w:r>
-          </w:p>
-          <w:p>
-            <w:pPr>
-              <w:spacing w:before="20" w:after="20"/>
-              <w:ind w:left="216"/>
-            </w:pPr>
-            <w:r>
-              <w:rPr>
-                <w:color w:val="1B3A20"/>
-                <w:sz w:val="20"/>
-              </w:rPr>
-            </w:r>
-          </w:p>
-          <w:p>
-            <w:pPr>
-              <w:spacing w:before="20" w:after="20"/>
-              <w:ind w:left="216"/>
-            </w:pPr>
-            <w:r>
-              <w:rPr>
-                <w:rFonts w:ascii="Consolas" w:hAnsi="Consolas"/>
-                <w:color w:val="1B5E20"/>
-                <w:sz w:val="18"/>
-              </w:rPr>
-              <w:t>SELECT estado FROM conversas WHERE telefone = {{telefone}}</w:t>
-            </w:r>
-          </w:p>
-          <w:p>
-            <w:pPr>
-              <w:spacing w:before="20" w:after="20"/>
-              <w:ind w:left="216"/>
-            </w:pPr>
-            <w:r>
-              <w:rPr>
-                <w:color w:val="1B3A20"/>
-                <w:sz w:val="20"/>
-              </w:rPr>
-            </w:r>
-          </w:p>
-          <w:p>
-            <w:pPr>
-              <w:spacing w:before="20" w:after="20"/>
-              <w:ind w:left="216"/>
-            </w:pPr>
-            <w:r>
-              <w:rPr>
-                <w:rFonts w:ascii="Consolas" w:hAnsi="Consolas"/>
-                <w:color w:val="1B5E20"/>
-                <w:sz w:val="18"/>
-              </w:rPr>
-              <w:t>if estado IN ('recusou', 'nao_quer_prosseguir', 'encerrado_pelo_paciente',</w:t>
-            </w:r>
-          </w:p>
-          <w:p>
-            <w:pPr>
-              <w:spacing w:before="20" w:after="20"/>
-              <w:ind w:left="216"/>
-            </w:pPr>
-            <w:r>
-              <w:rPr>
-                <w:color w:val="1B3A20"/>
-                <w:sz w:val="20"/>
-              </w:rPr>
-              <w:t xml:space="preserve">              'servico_negado'):</w:t>
-            </w:r>
-          </w:p>
-          <w:p>
-            <w:pPr>
-              <w:spacing w:before="20" w:after="20"/>
-              <w:ind w:left="216"/>
-            </w:pPr>
-            <w:r>
-              <w:rPr>
-                <w:rFonts w:ascii="Consolas" w:hAnsi="Consolas"/>
-                <w:color w:val="1B5E20"/>
-                <w:sz w:val="18"/>
-              </w:rPr>
-              <w:t xml:space="preserve">    → PARAR aqui. Não enviar follow-up.</w:t>
-            </w:r>
-          </w:p>
-          <w:p>
-            <w:pPr>
-              <w:spacing w:before="20" w:after="20"/>
-              <w:ind w:left="216"/>
-            </w:pPr>
-            <w:r>
-              <w:rPr>
-                <w:color w:val="1B3A20"/>
-                <w:sz w:val="20"/>
-              </w:rPr>
-            </w:r>
-          </w:p>
-          <w:p>
-            <w:pPr>
-              <w:spacing w:before="20" w:after="20"/>
-              <w:ind w:left="216"/>
-            </w:pPr>
-            <w:r>
-              <w:rPr>
-                <w:color w:val="1B3A20"/>
-                <w:sz w:val="20"/>
-              </w:rPr>
-              <w:t>Quando paciente responder NÃO em qualquer etapa:</w:t>
-            </w:r>
-          </w:p>
-          <w:p>
-            <w:pPr>
-              <w:spacing w:before="20" w:after="20"/>
-              <w:ind w:left="216"/>
-            </w:pPr>
-            <w:r>
-              <w:rPr>
-                <w:rFonts w:ascii="Consolas" w:hAnsi="Consolas"/>
-                <w:color w:val="1B5E20"/>
-                <w:sz w:val="18"/>
-              </w:rPr>
-              <w:t>UPDATE conversas SET estado = 'recusou' WHERE telefone = {{telefone}}</w:t>
-            </w:r>
-          </w:p>
-          <w:p>
-            <w:pPr>
-              <w:spacing w:before="20" w:after="20"/>
-              <w:ind w:left="216"/>
-            </w:pPr>
-            <w:r>
-              <w:rPr>
-                <w:color w:val="1B3A20"/>
-                <w:sz w:val="20"/>
-              </w:rPr>
-            </w:r>
-          </w:p>
-          <w:p>
-            <w:pPr>
-              <w:spacing w:before="20" w:after="20"/>
-              <w:ind w:left="216"/>
-            </w:pPr>
-            <w:r>
-              <w:rPr>
-                <w:rFonts w:ascii="Consolas" w:hAnsi="Consolas"/>
-                <w:color w:val="1B5E20"/>
-                <w:sz w:val="18"/>
-              </w:rPr>
-              <w:t>// Isso bloqueia todos os follow-ups futuros até nova conversa ser iniciada.</w:t>
-            </w:r>
-          </w:p>
-          <w:p>
-            <w:pPr>
-              <w:spacing w:after="80"/>
-            </w:pPr>
-          </w:p>
-        </w:tc>
-      </w:tr>
-    </w:tbl>
-    <w:p/>
-    <w:p>
-      <w:pPr>
-        <w:spacing w:before="40" w:after="40"/>
-        <w:pBdr>
-          <w:bottom w:val="single" w:sz="4" w:space="1" w:color="CCCCCC"/>
-        </w:pBdr>
-      </w:pPr>
-    </w:p>
-    <w:tbl>
-      <w:tblPr>
-        <w:tblW w:type="auto" w:w="0"/>
-        <w:tblLook w:firstColumn="1" w:firstRow="1" w:lastColumn="0" w:lastRow="0" w:noHBand="0" w:noVBand="1" w:val="04A0"/>
-      </w:tblPr>
-      <w:tblGrid>
-        <w:gridCol w:w="9746"/>
-      </w:tblGrid>
-      <w:tr>
-        <w:tc>
-          <w:tcPr>
-            <w:tcW w:type="dxa" w:w="9746"/>
-            <w:shd w:val="clear" w:color="auto" w:fill="D6E4F7"/>
-          </w:tcPr>
-          <w:p>
-            <w:pPr>
-              <w:spacing w:before="100" w:after="100"/>
-              <w:ind w:left="173"/>
-            </w:pPr>
-            <w:r>
-              <w:rPr>
-                <w:b/>
-                <w:color w:val="1B3A6B"/>
-                <w:sz w:val="22"/>
-              </w:rPr>
-              <w:t xml:space="preserve">7.  </w:t>
-            </w:r>
-            <w:r>
-              <w:rPr>
-                <w:b/>
-                <w:color w:val="1B3A6B"/>
-                <w:sz w:val="22"/>
-              </w:rPr>
-              <w:t>Follow-up enviado após Clara NEGAR o serviço</w:t>
-            </w:r>
-          </w:p>
-        </w:tc>
-      </w:tr>
-    </w:tbl>
-    <w:p/>
-    <w:p>
-      <w:r>
-        <w:rPr>
-          <w:b/>
-          <w:color w:val="770000"/>
-          <w:sz w:val="20"/>
-        </w:rPr>
-        <w:t xml:space="preserve">EVIDÊNCIA  </w:t>
-      </w:r>
-      <w:r>
-        <w:rPr>
-          <w:sz w:val="20"/>
-        </w:rPr>
-        <w:t>Dayane — 10 e 11/06/2026</w:t>
-      </w:r>
-    </w:p>
-    <w:tbl>
-      <w:tblPr>
-        <w:tblW w:type="auto" w:w="0"/>
-        <w:tblLook w:firstColumn="1" w:firstRow="1" w:lastColumn="0" w:lastRow="0" w:noHBand="0" w:noVBand="1" w:val="04A0"/>
-      </w:tblPr>
-      <w:tblGrid>
-        <w:gridCol w:w="9746"/>
-      </w:tblGrid>
-      <w:tr>
-        <w:tc>
-          <w:tcPr>
-            <w:tcW w:type="dxa" w:w="9746"/>
-            <w:shd w:val="clear" w:color="auto" w:fill="F0F0F0"/>
-            <w:tcBorders>
-              <w:top w:val="single" w:sz="6" w:space="0" w:color="BBBBBB"/>
-              <w:bottom w:val="single" w:sz="6" w:space="0" w:color="BBBBBB"/>
-              <w:left w:val="single" w:sz="6" w:space="0" w:color="BBBBBB"/>
-              <w:right w:val="single" w:sz="6" w:space="0" w:color="BBBBBB"/>
-            </w:tcBorders>
-          </w:tcPr>
-          <w:p>
-            <w:pPr>
-              <w:spacing w:before="20" w:after="20"/>
-              <w:ind w:left="144"/>
-            </w:pPr>
-            <w:r>
-              <w:rPr>
-                <w:rFonts w:ascii="Consolas" w:hAnsi="Consolas"/>
-                <w:color w:val="333333"/>
-                <w:sz w:val="19"/>
-              </w:rPr>
-              <w:t>13:53 10/06  Paciente:  "Qual o valor do ASO?"</w:t>
-            </w:r>
-          </w:p>
-          <w:p>
-            <w:pPr>
-              <w:spacing w:before="20" w:after="20"/>
-              <w:ind w:left="144"/>
-            </w:pPr>
-            <w:r>
-              <w:rPr>
-                <w:rFonts w:ascii="Consolas" w:hAnsi="Consolas"/>
-                <w:color w:val="1A6B1A"/>
-                <w:sz w:val="19"/>
-              </w:rPr>
-              <w:t>13:53 10/06  Clara:     "O ASO é feito em clínicas presenciais, não aqui na REMMED."  ✅</w:t>
-            </w:r>
-          </w:p>
-          <w:p>
-            <w:pPr>
-              <w:spacing w:before="20" w:after="20"/>
-              <w:ind w:left="144"/>
-            </w:pPr>
-            <w:r>
-              <w:rPr>
-                <w:rFonts w:ascii="Consolas" w:hAnsi="Consolas"/>
-                <w:color w:val="B00000"/>
-                <w:sz w:val="19"/>
-              </w:rPr>
-              <w:t>14:11 10/06  Clara:     "Posso te ajudar com informações sobre clínicas de medicina do trabalho?"  ❌</w:t>
-            </w:r>
-          </w:p>
-          <w:p>
-            <w:pPr>
-              <w:spacing w:before="20" w:after="20"/>
-              <w:ind w:left="144"/>
-            </w:pPr>
-            <w:r>
-              <w:rPr>
-                <w:rFonts w:ascii="Consolas" w:hAnsi="Consolas"/>
-                <w:color w:val="B00000"/>
-                <w:sz w:val="19"/>
-              </w:rPr>
-              <w:t>15:01 10/06  Clara:     "Posso ajudar com indicações de clínicas em sua região?"  ❌❌</w:t>
-            </w:r>
-          </w:p>
-          <w:p>
-            <w:pPr>
-              <w:spacing w:before="20" w:after="20"/>
-              <w:ind w:left="144"/>
-            </w:pPr>
-            <w:r>
-              <w:rPr>
-                <w:rFonts w:ascii="Consolas" w:hAnsi="Consolas"/>
-                <w:color w:val="B00000"/>
-                <w:sz w:val="19"/>
-              </w:rPr>
-              <w:t>14:01 11/06  Clara:     "Clínicas na sua região têm oferecido promoções especiais..."  ❌❌❌</w:t>
-            </w:r>
-          </w:p>
-        </w:tc>
-      </w:tr>
-    </w:tbl>
-    <w:p/>
-    <w:p>
-      <w:r>
-        <w:rPr>
-          <w:b/>
-          <w:color w:val="C00000"/>
-          <w:sz w:val="20"/>
-        </w:rPr>
-        <w:t xml:space="preserve">DOIS PROBLEMAS NESTE CASO:  </w:t>
-      </w:r>
-      <w:r>
-        <w:rPr>
-          <w:sz w:val="20"/>
-        </w:rPr>
-      </w:r>
-    </w:p>
-    <w:p>
-      <w:r>
-        <w:rPr>
-          <w:sz w:val="20"/>
-        </w:rPr>
-        <w:t>(a)  Follow-up enviado após atendimento já encerrado — Clara negou o serviço e acabou ali.</w:t>
-        <w:br/>
-        <w:t>(b)  Follow-up ofereceu "indicar clínicas na região" — Clara NÃO consegue fazer isso.</w:t>
-      </w:r>
-    </w:p>
-    <w:p/>
-    <w:p>
-      <w:r>
-        <w:rPr>
-          <w:b/>
-          <w:color w:val="C00000"/>
-          <w:sz w:val="20"/>
-        </w:rPr>
-        <w:t xml:space="preserve">REGRA:  </w:t>
-      </w:r>
-      <w:r>
-        <w:rPr>
-          <w:sz w:val="20"/>
-        </w:rPr>
-        <w:t>Quando Clara NEGA um serviço, NÃO deve haver nenhum follow-up.</w:t>
-      </w:r>
-    </w:p>
-    <w:p/>
-    <w:tbl>
-      <w:tblPr>
-        <w:tblW w:type="auto" w:w="0"/>
-        <w:tblLook w:firstColumn="1" w:firstRow="1" w:lastColumn="0" w:lastRow="0" w:noHBand="0" w:noVBand="1" w:val="04A0"/>
-      </w:tblPr>
-      <w:tblGrid>
-        <w:gridCol w:w="9746"/>
-      </w:tblGrid>
-      <w:tr>
-        <w:tc>
-          <w:tcPr>
-            <w:tcW w:type="dxa" w:w="9746"/>
-            <w:shd w:val="clear" w:color="auto" w:fill="EAF4EA"/>
-            <w:tcBorders>
-              <w:top w:val="single" w:sz="8" w:space="0" w:color="2E7D32"/>
-              <w:bottom w:val="single" w:sz="8" w:space="0" w:color="2E7D32"/>
-              <w:left w:val="single" w:sz="8" w:space="0" w:color="2E7D32"/>
-              <w:right w:val="single" w:sz="8" w:space="0" w:color="2E7D32"/>
-            </w:tcBorders>
-          </w:tcPr>
-          <w:p>
-            <w:pPr>
-              <w:spacing w:before="100"/>
-              <w:ind w:left="173"/>
-            </w:pPr>
-            <w:r>
-              <w:rPr>
-                <w:b/>
-                <w:color w:val="1B5E20"/>
-                <w:sz w:val="20"/>
-              </w:rPr>
-              <w:t>⚙  AÇÃO TÉCNICA — n8n — Workflow de follow-up + Prompt</w:t>
-            </w:r>
-          </w:p>
-          <w:p>
-            <w:pPr>
-              <w:spacing w:before="20" w:after="20"/>
-              <w:ind w:left="216"/>
-            </w:pPr>
-            <w:r>
-              <w:rPr>
-                <w:color w:val="1B3A20"/>
-                <w:sz w:val="20"/>
-              </w:rPr>
-              <w:t>PARTE A — No workflow (n8n):</w:t>
-            </w:r>
-          </w:p>
-          <w:p>
-            <w:pPr>
-              <w:spacing w:before="20" w:after="20"/>
-              <w:ind w:left="216"/>
-            </w:pPr>
-            <w:r>
-              <w:rPr>
-                <w:color w:val="1B3A20"/>
-                <w:sz w:val="20"/>
-              </w:rPr>
-              <w:t xml:space="preserve">  Incluir "servico_negado" no conjunto de estados que bloqueiam follow-up.</w:t>
-            </w:r>
-          </w:p>
-          <w:p>
-            <w:pPr>
-              <w:spacing w:before="20" w:after="20"/>
-              <w:ind w:left="216"/>
-            </w:pPr>
-            <w:r>
-              <w:rPr>
-                <w:color w:val="1B3A20"/>
-                <w:sz w:val="20"/>
-              </w:rPr>
-              <w:t xml:space="preserve">  Quando Clara encerrar por recusa de serviço, gravar:</w:t>
-            </w:r>
-          </w:p>
-          <w:p>
-            <w:pPr>
-              <w:spacing w:before="20" w:after="20"/>
-              <w:ind w:left="216"/>
-            </w:pPr>
-            <w:r>
-              <w:rPr>
-                <w:rFonts w:ascii="Consolas" w:hAnsi="Consolas"/>
-                <w:color w:val="1B5E20"/>
-                <w:sz w:val="18"/>
-              </w:rPr>
-              <w:t xml:space="preserve">  UPDATE conversas SET estado = 'servico_negado' WHERE telefone = {{telefone}}</w:t>
-            </w:r>
-          </w:p>
-          <w:p>
-            <w:pPr>
-              <w:spacing w:before="20" w:after="20"/>
-              <w:ind w:left="216"/>
-            </w:pPr>
-            <w:r>
-              <w:rPr>
-                <w:color w:val="1B3A20"/>
-                <w:sz w:val="20"/>
-              </w:rPr>
-            </w:r>
-          </w:p>
-          <w:p>
-            <w:pPr>
-              <w:spacing w:before="20" w:after="20"/>
-              <w:ind w:left="216"/>
-            </w:pPr>
-            <w:r>
-              <w:rPr>
-                <w:color w:val="1B3A20"/>
-                <w:sz w:val="20"/>
-              </w:rPr>
-              <w:t>PARTE B — No prompt:</w:t>
-            </w:r>
-          </w:p>
-          <w:p>
-            <w:pPr>
-              <w:spacing w:before="20" w:after="20"/>
-              <w:ind w:left="216"/>
-            </w:pPr>
-            <w:r>
-              <w:rPr>
-                <w:color w:val="1B3A20"/>
-                <w:sz w:val="20"/>
-              </w:rPr>
-              <w:t xml:space="preserve">  Após qualquer recusa (ASO, acompanhante, emergência, serviço fora do escopo):</w:t>
-            </w:r>
-          </w:p>
-          <w:p>
-            <w:pPr>
-              <w:spacing w:before="20" w:after="20"/>
-              <w:ind w:left="216"/>
-            </w:pPr>
-            <w:r>
-              <w:rPr>
-                <w:color w:val="1B3A20"/>
-                <w:sz w:val="20"/>
-              </w:rPr>
-              <w:t xml:space="preserve">  "Encerrar com gentileza. NÃO oferecer indicações locais, preços de</w:t>
-            </w:r>
-          </w:p>
-          <w:p>
-            <w:pPr>
-              <w:spacing w:before="20" w:after="20"/>
-              <w:ind w:left="216"/>
-            </w:pPr>
-            <w:r>
-              <w:rPr>
-                <w:color w:val="1B3A20"/>
-                <w:sz w:val="20"/>
-              </w:rPr>
-              <w:t xml:space="preserve">   outras clínicas, promoções de terceiros ou serviços que a REMMED</w:t>
-            </w:r>
-          </w:p>
-          <w:p>
-            <w:pPr>
-              <w:spacing w:before="20" w:after="20"/>
-              <w:ind w:left="216"/>
-            </w:pPr>
-            <w:r>
-              <w:rPr>
-                <w:color w:val="1B3A20"/>
-                <w:sz w:val="20"/>
-              </w:rPr>
-              <w:t xml:space="preserve">   Telemedicina não oferece."</w:t>
-            </w:r>
-          </w:p>
-          <w:p>
-            <w:pPr>
-              <w:spacing w:after="80"/>
-            </w:pPr>
-          </w:p>
-        </w:tc>
-      </w:tr>
-    </w:tbl>
-    <w:p/>
-    <w:p>
-      <w:r>
-        <w:br w:type="page"/>
-      </w:r>
-    </w:p>
-    <w:tbl>
-      <w:tblPr>
-        <w:tblW w:type="auto" w:w="0"/>
-        <w:tblLook w:firstColumn="1" w:firstRow="1" w:lastColumn="0" w:lastRow="0" w:noHBand="0" w:noVBand="1" w:val="04A0"/>
-      </w:tblPr>
-      <w:tblGrid>
-        <w:gridCol w:w="9746"/>
-      </w:tblGrid>
-      <w:tr>
-        <w:tc>
-          <w:tcPr>
-            <w:tcW w:type="dxa" w:w="9746"/>
-            <w:shd w:val="clear" w:color="auto" w:fill="D6E4F7"/>
-          </w:tcPr>
-          <w:p>
-            <w:pPr>
-              <w:spacing w:before="100" w:after="100"/>
-              <w:ind w:left="173"/>
-            </w:pPr>
-            <w:r>
-              <w:rPr>
-                <w:b/>
-                <w:color w:val="1B3A6B"/>
-                <w:sz w:val="22"/>
-              </w:rPr>
-              <w:t xml:space="preserve">8.  </w:t>
-            </w:r>
-            <w:r>
-              <w:rPr>
-                <w:b/>
-                <w:color w:val="1B3A6B"/>
-                <w:sz w:val="22"/>
-              </w:rPr>
-              <w:t>Regra geral de follow-up — definição completa</w:t>
-            </w:r>
-          </w:p>
-        </w:tc>
-      </w:tr>
-    </w:tbl>
-    <w:p/>
-    <w:p>
-      <w:r>
-        <w:t>Com base em todos os casos analisados, a política de follow-up deve seguir esta tabela:</w:t>
-      </w:r>
-    </w:p>
-    <w:p/>
-    <w:tbl>
-      <w:tblPr>
-        <w:tblStyle w:val="TableGrid"/>
-        <w:tblW w:type="auto" w:w="0"/>
-        <w:tblLook w:firstColumn="1" w:firstRow="1" w:lastColumn="0" w:lastRow="0" w:noHBand="0" w:noVBand="1" w:val="04A0"/>
-      </w:tblPr>
-      <w:tblGrid>
-        <w:gridCol w:w="3249"/>
-        <w:gridCol w:w="3249"/>
-        <w:gridCol w:w="3249"/>
-      </w:tblGrid>
-      <w:tr>
-        <w:tc>
-          <w:tcPr>
-            <w:tcW w:type="dxa" w:w="3249"/>
-            <w:shd w:val="clear" w:color="auto" w:fill="1B3A6B"/>
-          </w:tcPr>
-          <w:p>
-            <w:pPr>
-              <w:spacing w:before="100" w:after="100"/>
-              <w:jc w:val="center"/>
-            </w:pPr>
-            <w:r>
-              <w:rPr>
-                <w:b/>
-                <w:color w:val="FFFFFF"/>
-                <w:sz w:val="20"/>
-              </w:rPr>
-              <w:t>Situação do paciente</w:t>
-            </w:r>
-          </w:p>
-        </w:tc>
-        <w:tc>
-          <w:tcPr>
-            <w:tcW w:type="dxa" w:w="3249"/>
-            <w:shd w:val="clear" w:color="auto" w:fill="1B3A6B"/>
-          </w:tcPr>
-          <w:p>
-            <w:pPr>
-              <w:spacing w:before="100" w:after="100"/>
-              <w:jc w:val="center"/>
-            </w:pPr>
-            <w:r>
-              <w:rPr>
-                <w:b/>
-                <w:color w:val="FFFFFF"/>
-                <w:sz w:val="20"/>
-              </w:rPr>
-              <w:t>Follow-up permitido?</w:t>
-            </w:r>
-          </w:p>
-        </w:tc>
-        <w:tc>
-          <w:tcPr>
-            <w:tcW w:type="dxa" w:w="3249"/>
-            <w:shd w:val="clear" w:color="auto" w:fill="1B3A6B"/>
-          </w:tcPr>
-          <w:p>
-            <w:pPr>
-              <w:spacing w:before="100" w:after="100"/>
-              <w:jc w:val="center"/>
-            </w:pPr>
-            <w:r>
-              <w:rPr>
-                <w:b/>
-                <w:color w:val="FFFFFF"/>
-                <w:sz w:val="20"/>
-              </w:rPr>
-              <w:t>Observação</w:t>
-            </w:r>
-          </w:p>
-        </w:tc>
-      </w:tr>
-      <w:tr>
-        <w:tc>
-          <w:tcPr>
-            <w:tcW w:type="dxa" w:w="3249"/>
-            <w:shd w:val="clear" w:color="auto" w:fill="FAFAFA"/>
-          </w:tcPr>
-          <w:p>
-            <w:pPr>
-              <w:spacing w:before="80" w:after="80"/>
-              <w:ind w:left="72"/>
-            </w:pPr>
-            <w:r>
-              <w:rPr>
-                <w:sz w:val="20"/>
-              </w:rPr>
-              <w:t>Paciente não respondeu após iniciar triagem</w:t>
-            </w:r>
-          </w:p>
-        </w:tc>
-        <w:tc>
-          <w:tcPr>
-            <w:tcW w:type="dxa" w:w="3249"/>
-            <w:shd w:val="clear" w:color="auto" w:fill="D7F0D7"/>
-          </w:tcPr>
-          <w:p>
-            <w:pPr>
-              <w:spacing w:before="80" w:after="80"/>
-              <w:jc w:val="center"/>
-            </w:pPr>
-            <w:r>
-              <w:rPr>
-                <w:b/>
-                <w:color w:val="2E7D32"/>
-                <w:sz w:val="20"/>
-              </w:rPr>
-              <w:t>✅ SIM</w:t>
-              <w:br/>
-              <w:t>1 lembrete gentil</w:t>
-            </w:r>
-          </w:p>
-        </w:tc>
-        <w:tc>
-          <w:tcPr>
-            <w:tcW w:type="dxa" w:w="3249"/>
-            <w:shd w:val="clear" w:color="auto" w:fill="FAFAFA"/>
-          </w:tcPr>
-          <w:p>
-            <w:pPr>
-              <w:spacing w:before="80" w:after="80"/>
-              <w:ind w:left="72"/>
-            </w:pPr>
-            <w:r>
-              <w:rPr>
-                <w:sz w:val="20"/>
-              </w:rPr>
-              <w:t>Aguardar ≥ 30 min. Tom neutro e gentil.</w:t>
-            </w:r>
-          </w:p>
-        </w:tc>
-      </w:tr>
-      <w:tr>
-        <w:tc>
-          <w:tcPr>
-            <w:tcW w:type="dxa" w:w="3249"/>
-            <w:shd w:val="clear" w:color="auto" w:fill="FAFAFA"/>
-          </w:tcPr>
-          <w:p>
-            <w:pPr>
-              <w:spacing w:before="80" w:after="80"/>
-              <w:ind w:left="72"/>
-            </w:pPr>
-            <w:r>
-              <w:rPr>
-                <w:sz w:val="20"/>
-              </w:rPr>
-              <w:t>Paciente respondeu NÃO</w:t>
-            </w:r>
-          </w:p>
-        </w:tc>
-        <w:tc>
-          <w:tcPr>
-            <w:tcW w:type="dxa" w:w="3249"/>
-            <w:shd w:val="clear" w:color="auto" w:fill="FFE5E5"/>
-          </w:tcPr>
-          <w:p>
-            <w:pPr>
-              <w:spacing w:before="80" w:after="80"/>
-              <w:jc w:val="center"/>
-            </w:pPr>
-            <w:r>
-              <w:rPr>
-                <w:b/>
-                <w:color w:val="C00000"/>
-                <w:sz w:val="20"/>
-              </w:rPr>
-              <w:t>❌ NÃO</w:t>
-            </w:r>
-          </w:p>
-        </w:tc>
-        <w:tc>
-          <w:tcPr>
-            <w:tcW w:type="dxa" w:w="3249"/>
-            <w:shd w:val="clear" w:color="auto" w:fill="FAFAFA"/>
-          </w:tcPr>
-          <w:p>
-            <w:pPr>
-              <w:spacing w:before="80" w:after="80"/>
-              <w:ind w:left="72"/>
-            </w:pPr>
-            <w:r>
-              <w:rPr>
-                <w:sz w:val="20"/>
-              </w:rPr>
-              <w:t>Encerrar: "Sem problemas, pode nos chamar!" e parar.</w:t>
-            </w:r>
-          </w:p>
-        </w:tc>
-      </w:tr>
-      <w:tr>
-        <w:tc>
-          <w:tcPr>
-            <w:tcW w:type="dxa" w:w="3249"/>
-            <w:shd w:val="clear" w:color="auto" w:fill="FAFAFA"/>
-          </w:tcPr>
-          <w:p>
-            <w:pPr>
-              <w:spacing w:before="80" w:after="80"/>
-              <w:ind w:left="72"/>
-            </w:pPr>
-            <w:r>
-              <w:rPr>
-                <w:sz w:val="20"/>
-              </w:rPr>
-              <w:t>Clara negou o serviço</w:t>
-              <w:br/>
-              <w:t>(ASO, acompanhante...)</w:t>
-            </w:r>
-          </w:p>
-        </w:tc>
-        <w:tc>
-          <w:tcPr>
-            <w:tcW w:type="dxa" w:w="3249"/>
-            <w:shd w:val="clear" w:color="auto" w:fill="FFE5E5"/>
-          </w:tcPr>
-          <w:p>
-            <w:pPr>
-              <w:spacing w:before="80" w:after="80"/>
-              <w:jc w:val="center"/>
-            </w:pPr>
-            <w:r>
-              <w:rPr>
-                <w:b/>
-                <w:color w:val="C00000"/>
-                <w:sz w:val="20"/>
-              </w:rPr>
-              <w:t>❌ NÃO</w:t>
-            </w:r>
-          </w:p>
-        </w:tc>
-        <w:tc>
-          <w:tcPr>
-            <w:tcW w:type="dxa" w:w="3249"/>
-            <w:shd w:val="clear" w:color="auto" w:fill="FAFAFA"/>
-          </w:tcPr>
-          <w:p>
-            <w:pPr>
-              <w:spacing w:before="80" w:after="80"/>
-              <w:ind w:left="72"/>
-            </w:pPr>
-            <w:r>
-              <w:rPr>
-                <w:sz w:val="20"/>
-              </w:rPr>
-              <w:t>Conversa encerrada — sem produto a oferecer.</w:t>
-            </w:r>
-          </w:p>
-        </w:tc>
-      </w:tr>
-      <w:tr>
-        <w:tc>
-          <w:tcPr>
-            <w:tcW w:type="dxa" w:w="3249"/>
-            <w:shd w:val="clear" w:color="auto" w:fill="FAFAFA"/>
-          </w:tcPr>
-          <w:p>
-            <w:pPr>
-              <w:spacing w:before="80" w:after="80"/>
-              <w:ind w:left="72"/>
-            </w:pPr>
-            <w:r>
-              <w:rPr>
-                <w:sz w:val="20"/>
-              </w:rPr>
-              <w:t>Paciente usou /reset</w:t>
-            </w:r>
-          </w:p>
-        </w:tc>
-        <w:tc>
-          <w:tcPr>
-            <w:tcW w:type="dxa" w:w="3249"/>
-            <w:shd w:val="clear" w:color="auto" w:fill="FFE5E5"/>
-          </w:tcPr>
-          <w:p>
-            <w:pPr>
-              <w:spacing w:before="80" w:after="80"/>
-              <w:jc w:val="center"/>
-            </w:pPr>
-            <w:r>
-              <w:rPr>
-                <w:b/>
-                <w:color w:val="C00000"/>
-                <w:sz w:val="20"/>
-              </w:rPr>
-              <w:t>❌ NÃO</w:t>
-            </w:r>
-          </w:p>
-        </w:tc>
-        <w:tc>
-          <w:tcPr>
-            <w:tcW w:type="dxa" w:w="3249"/>
-            <w:shd w:val="clear" w:color="auto" w:fill="FAFAFA"/>
-          </w:tcPr>
-          <w:p>
-            <w:pPr>
-              <w:spacing w:before="80" w:after="80"/>
-              <w:ind w:left="72"/>
-            </w:pPr>
-            <w:r>
-              <w:rPr>
-                <w:sz w:val="20"/>
-              </w:rPr>
-              <w:t>Cancelar follow-ups da sessão anterior imediatamente.</w:t>
-            </w:r>
-          </w:p>
-        </w:tc>
-      </w:tr>
-      <w:tr>
-        <w:tc>
-          <w:tcPr>
-            <w:tcW w:type="dxa" w:w="3249"/>
-            <w:shd w:val="clear" w:color="auto" w:fill="FAFAFA"/>
-          </w:tcPr>
-          <w:p>
-            <w:pPr>
-              <w:spacing w:before="80" w:after="80"/>
-              <w:ind w:left="72"/>
-            </w:pPr>
-            <w:r>
-              <w:rPr>
-                <w:sz w:val="20"/>
-              </w:rPr>
-              <w:t>Paciente respondeu SIM mas não</w:t>
-              <w:br/>
-              <w:t>finalizou pagamento</w:t>
-            </w:r>
-          </w:p>
-        </w:tc>
-        <w:tc>
-          <w:tcPr>
-            <w:tcW w:type="dxa" w:w="3249"/>
-            <w:shd w:val="clear" w:color="auto" w:fill="D7F0D7"/>
-          </w:tcPr>
-          <w:p>
-            <w:pPr>
-              <w:spacing w:before="80" w:after="80"/>
-              <w:jc w:val="center"/>
-            </w:pPr>
-            <w:r>
-              <w:rPr>
-                <w:b/>
-                <w:color w:val="2E7D32"/>
-                <w:sz w:val="20"/>
-              </w:rPr>
-              <w:t>✅ SIM</w:t>
-              <w:br/>
-              <w:t>1 lembrete</w:t>
-            </w:r>
-          </w:p>
-        </w:tc>
-        <w:tc>
-          <w:tcPr>
-            <w:tcW w:type="dxa" w:w="3249"/>
-            <w:shd w:val="clear" w:color="auto" w:fill="FAFAFA"/>
-          </w:tcPr>
-          <w:p>
-            <w:pPr>
-              <w:spacing w:before="80" w:after="80"/>
-              <w:ind w:left="72"/>
-            </w:pPr>
-            <w:r>
-              <w:rPr>
-                <w:sz w:val="20"/>
-              </w:rPr>
-              <w:t>Máximo 1 mensagem. Tom neutro.</w:t>
-            </w:r>
-          </w:p>
-        </w:tc>
-      </w:tr>
-      <w:tr>
-        <w:tc>
-          <w:tcPr>
-            <w:tcW w:type="dxa" w:w="3249"/>
-            <w:shd w:val="clear" w:color="auto" w:fill="FAFAFA"/>
-          </w:tcPr>
-          <w:p>
-            <w:pPr>
-              <w:spacing w:before="80" w:after="80"/>
-              <w:ind w:left="72"/>
-            </w:pPr>
-            <w:r>
-              <w:rPr>
-                <w:sz w:val="20"/>
-              </w:rPr>
-              <w:t>Paciente agendou consulta</w:t>
-            </w:r>
-          </w:p>
-        </w:tc>
-        <w:tc>
-          <w:tcPr>
-            <w:tcW w:type="dxa" w:w="3249"/>
-            <w:shd w:val="clear" w:color="auto" w:fill="D7F0D7"/>
-          </w:tcPr>
-          <w:p>
-            <w:pPr>
-              <w:spacing w:before="80" w:after="80"/>
-              <w:jc w:val="center"/>
-            </w:pPr>
-            <w:r>
-              <w:rPr>
-                <w:b/>
-                <w:color w:val="2E7D32"/>
-                <w:sz w:val="20"/>
-              </w:rPr>
-              <w:t>✅ SIM</w:t>
-              <w:br/>
-              <w:t>Follow-up da clínica</w:t>
-            </w:r>
-          </w:p>
-        </w:tc>
-        <w:tc>
-          <w:tcPr>
-            <w:tcW w:type="dxa" w:w="3249"/>
-            <w:shd w:val="clear" w:color="auto" w:fill="FAFAFA"/>
-          </w:tcPr>
-          <w:p>
-            <w:pPr>
-              <w:spacing w:before="80" w:after="80"/>
-              <w:ind w:left="72"/>
-            </w:pPr>
-            <w:r>
-              <w:rPr>
-                <w:sz w:val="20"/>
-              </w:rPr>
-              <w:t>Enviar confirmação de agendamento com data, hora e link. Nada mais.</w:t>
-            </w:r>
-          </w:p>
-        </w:tc>
-      </w:tr>
-    </w:tbl>
-    <w:p/>
-    <w:tbl>
-      <w:tblPr>
-        <w:tblW w:type="auto" w:w="0"/>
-        <w:tblLook w:firstColumn="1" w:firstRow="1" w:lastColumn="0" w:lastRow="0" w:noHBand="0" w:noVBand="1" w:val="04A0"/>
-      </w:tblPr>
-      <w:tblGrid>
-        <w:gridCol w:w="9746"/>
-      </w:tblGrid>
-      <w:tr>
-        <w:tc>
-          <w:tcPr>
-            <w:tcW w:type="dxa" w:w="9746"/>
-            <w:shd w:val="clear" w:color="auto" w:fill="FFF3CD"/>
-            <w:tcBorders>
-              <w:top w:val="single" w:sz="8" w:space="0" w:color="E0A800"/>
-              <w:bottom w:val="single" w:sz="8" w:space="0" w:color="E0A800"/>
-              <w:left w:val="single" w:sz="8" w:space="0" w:color="E0A800"/>
-              <w:right w:val="single" w:sz="8" w:space="0" w:color="E0A800"/>
-            </w:tcBorders>
-          </w:tcPr>
-          <w:p>
-            <w:pPr>
-              <w:spacing w:before="140"/>
-              <w:ind w:left="173"/>
-            </w:pPr>
-            <w:r>
-              <w:rPr>
-                <w:b/>
-                <w:color w:val="7B4F00"/>
-                <w:sz w:val="20"/>
-              </w:rPr>
-              <w:t>⚠  NUNCA prometer no follow-up o que não consegue entregar:</w:t>
-            </w:r>
-          </w:p>
-          <w:p>
-            <w:pPr>
-              <w:spacing w:after="140"/>
-              <w:ind w:left="216"/>
-            </w:pPr>
-            <w:r>
-              <w:rPr>
-                <w:color w:val="553800"/>
-                <w:sz w:val="20"/>
-              </w:rPr>
-              <w:t>"Indicação de clínicas na sua região" / "Promoções especiais de clínicas" / "Informações de outras unidades"</w:t>
-              <w:br/>
-              <w:br/>
-              <w:t>Clara tem acesso SOMENTE ao sistema da REMMED Telemedicina.</w:t>
-            </w:r>
-          </w:p>
-        </w:tc>
-      </w:tr>
-    </w:tbl>
     <w:sectPr>
       <w:pgSz w:w="12240" w:h="15840"/>
       <w:pgMar w:top="1020" w:right="1247" w:bottom="1020" w:left="1247" w:header="720" w:footer="720" w:gutter="0"/>

</xml_diff>